<commit_message>
docs: finalize enhanced IEEE publication paper with formatted tables, figures, and slides
</commit_message>
<xml_diff>
--- a/IEEE_Conference_Paper_DeepJSCC_WZ.docx
+++ b/IEEE_Conference_Paper_DeepJSCC_WZ.docx
@@ -4,7 +4,7 @@
   <w:body>
     <w:p>
       <w:pPr>
-        <w:spacing w:before="0" w:after="80"/>
+        <w:spacing w:before="0" w:after="60"/>
         <w:ind w:firstLine="0"/>
         <w:jc w:val="center"/>
       </w:pPr>
@@ -21,7 +21,7 @@
     </w:p>
     <w:p>
       <w:pPr>
-        <w:spacing w:before="80" w:after="120"/>
+        <w:spacing w:before="60" w:after="120"/>
         <w:ind w:firstLine="0"/>
         <w:jc w:val="center"/>
       </w:pPr>
@@ -269,7 +269,7 @@
     </w:tbl>
     <w:p>
       <w:pPr>
-        <w:spacing w:before="80" w:after="80"/>
+        <w:spacing w:before="60" w:after="60"/>
         <w:ind w:firstLine="0"/>
       </w:pPr>
     </w:p>
@@ -297,7 +297,7 @@
           <w:color w:val="000000"/>
           <w:sz w:val="18"/>
         </w:rPr>
-        <w:t>Transmission of bandwidth-intensive visual data across wireless fading channels poses fundamental challenges for distributed autonomous perception systems. While conventional digital transmission cascades separate source and channel coding--rendering it susceptible to catastrophic cliff-edge collapse under unexpected SNR drops--emerging Deep Joint Source-Channel Coding (DeepJSCC) paradigms overcome these bottlenecks through end-to-end differentiable mappings. However, distributed multi-sensor platforms capture correlated spatial scenes whose mutual redundancy remains unexploited in standard point-to-point DeepJSCC schemes. In this paper, we propose a lightweight, edge-efficient DeepJSCC framework with Wyner-Ziv correlated side information (DeepJSCC-WZ) augmented by a novel Content-Aware Multi-Scale Reliability Gating (SARG) mechanism tailored for resource-constrained distributed stereo perception. The architecture incorporates a compact analysis transform, a bounded channel modulation layer under strict average power constraints, dynamic Channel State Information (CSI) attention conditioning, and multi-scale reliability gates initialized as exact identity operators. Rigorous evaluations over 48 continuous training epochs over complex Additive White Gaussian Noise (AWGN) channels on the authentic KITTI stereo benchmark demonstrate that the proposed DeepJSCC-WZ model achieves a +2.87 dB average improvement in Peak Signal-to-Noise Ratio (PSNR: 21.81 dB vs. 18.94 dB), an absolute gain of +0.2221 (+42.2% relative improvement in SSIM: 0.7489 vs. 0.5268), a +0.1410 gain in Multi-Scale SSIM (0.9045 vs. 0.7635), and a 40.4% reduction in perceptual distortion (LPIPS: 0.3288 vs. 0.5513) relative to point-to-point DeepJSCC baselines at a bandwidth compression ratio of rho = 1/16. Furthermore, fine-tuned paired ablations over 20 noise draws per image per SNR confirm statistically significant gains (t &gt; 2.8) across diverse channel regimes.</w:t>
+        <w:t>Transmission of bandwidth-intensive visual data across wireless fading channels poses fundamental challenges for distributed autonomous perception systems, including vehicular fleets and robotic swarms. While conventional digital transmission cascades separate source and channel coding--rendering it susceptible to catastrophic cliff-edge collapse under unexpected SNR drops--emerging Deep Joint Source-Channel Coding (DeepJSCC) paradigms overcome these bottlenecks through end-to-end differentiable mappings. However, distributed multi-sensor platforms capture correlated spatial scenes whose mutual redundancy remains unexploited in standard point-to-point DeepJSCC schemes. In this paper, we propose a lightweight, edge-efficient DeepJSCC framework with Wyner-Ziv correlated side information (DeepJSCC-WZ) augmented by a novel Content-Aware Multi-Scale Reliability Gating (SARG) mechanism tailored for resource-constrained distributed stereo perception. The architecture incorporates a compact analysis transform, a bounded channel modulation layer under strict average power constraints, dynamic Channel State Information (CSI) attention conditioning, and multi-scale reliability gates initialized as exact identity operators. Rigorous evaluations over 48 continuous training epochs over complex Additive White Gaussian Noise (AWGN) channels on the authentic KITTI stereo benchmark demonstrate that the proposed DeepJSCC-WZ model achieves a +2.87 dB average improvement in Peak Signal-to-Noise Ratio (PSNR: 21.81 dB vs. 18.94 dB), an absolute gain of +0.2221 (+42.2% relative improvement in SSIM: 0.7489 vs. 0.5268), a +0.1410 gain in Multi-Scale SSIM (0.9045 vs. 0.7635), and a 40.4% reduction in perceptual distortion (LPIPS: 0.3288 vs. 0.5513) relative to point-to-point DeepJSCC baselines at a bandwidth compression ratio of rho = 1/16. Furthermore, fine-tuned paired ablations over 20 noise draws per image per SNR confirm that SARG provides statistically significant noise suppression (t = 87.38) under severe channel fading while maintaining baseline parity across nominal conditions.</w:t>
       </w:r>
     </w:p>
     <w:p>
@@ -331,7 +331,7 @@
       <w:pPr>
         <w:sectPr>
           <w:pgSz w:w="11909" w:h="16834"/>
-          <w:pgMar w:top="1080" w:right="907" w:bottom="1440" w:left="907" w:header="720" w:footer="720" w:gutter="0"/>
+          <w:pgMar w:top="1080" w:right="907" w:bottom="1224" w:left="907" w:header="720" w:footer="720" w:gutter="0"/>
           <w:cols w:space="720"/>
           <w:docGrid w:linePitch="360"/>
         </w:sectPr>
@@ -367,7 +367,7 @@
           <w:b w:val="0"/>
           <w:i w:val="0"/>
           <w:color w:val="000000"/>
-          <w:sz w:val="20"/>
+          <w:sz w:val="19"/>
         </w:rPr>
         <w:t>Modern autonomous systems--ranging from automated driving platforms to cooperative robotic fleets--depend heavily on multi-perspective optical sensing to understand 3D environments. Stereo visual systems provide indispensable depth perception by capturing synchronized imagery from horizontally displaced camera viewpoints. In cooperative distributed scenarios, visual information collected by one sensing node must be transmitted over wireless communication links to a destination node that already possesses a correlated viewpoint [1], [2].</w:t>
       </w:r>
@@ -384,7 +384,7 @@
           <w:b w:val="0"/>
           <w:i w:val="0"/>
           <w:color w:val="000000"/>
-          <w:sz w:val="20"/>
+          <w:sz w:val="19"/>
         </w:rPr>
         <w:t>However, transmitting high-resolution uncompressed video across wireless channels introduces extreme bandwidth strain. Traditional digital communication architectures strictly adhere to Shannon's separation theorem [3], which guarantees optimality only at infinite blocklength. A modular pipeline cascades image compression (JPEG/BPG) with channel coding (LDPC/Polar). Under latency-critical edge transmission, finite blocklength constraints invalidate separation guarantees. When channel SNR drops below the forward error correction threshold, digital systems suffer from the catastrophic "cliff effect"--causing complete connection collapse.</w:t>
       </w:r>
@@ -401,7 +401,7 @@
           <w:b w:val="0"/>
           <w:i w:val="0"/>
           <w:color w:val="000000"/>
-          <w:sz w:val="20"/>
+          <w:sz w:val="19"/>
         </w:rPr>
         <w:t>To resolve the cliff effect, Deep Joint Source-Channel Coding (DeepJSCC) maps continuous source pixels directly to continuous channel modulation symbols through non-linear neural networks [4], [5], achieving graceful degradation. In distributed multi-sensor setups, the physical scene exhibits substantial mutual information with correlated visual observations already present at the receiver. The theoretical foundation is established by the Slepian-Wolf theorem [6] and the Wyner-Ziv theorem [7]. Wyner and Ziv proved that when correlated side information is available exclusively at the receiver, the theoretical rate-distortion function R_WZ(D) incurs zero rate penalty compared to joint encoder-decoder availability for Gaussian sources under squared-error distortion.</w:t>
       </w:r>
@@ -418,7 +418,7 @@
           <w:b w:val="0"/>
           <w:i w:val="0"/>
           <w:color w:val="000000"/>
-          <w:sz w:val="20"/>
+          <w:sz w:val="19"/>
         </w:rPr>
         <w:t>This paper introduces a lightweight, edge-efficient DeepJSCC-WZ framework specifically engineered for distributed stereo perception. The core technical contributions of this work are summarized as follows:</w:t>
       </w:r>
@@ -435,9 +435,9 @@
           <w:b w:val="0"/>
           <w:i w:val="0"/>
           <w:color w:val="000000"/>
-          <w:sz w:val="20"/>
+          <w:sz w:val="19"/>
         </w:rPr>
-        <w:t>[bullet] We design an end-to-end differentiable DeepJSCC-WZ architecture that integrates an Attention Feature (AF) Channel Conditioning module and a multi-scale decoder fusion mechanism, aligning decoder side information without auxiliary optical flow networks.</w:t>
+        <w:t>[bullet] End-to-End DeepJSCC-WZ Architecture: We design an end-to-end differentiable framework incorporating dynamic CSI attention conditioning (AFModule) and multi-scale decoder fusion, aligning decoder side information without auxiliary optical flow networks.</w:t>
       </w:r>
     </w:p>
     <w:p>
@@ -452,9 +452,9 @@
           <w:b w:val="0"/>
           <w:i w:val="0"/>
           <w:color w:val="000000"/>
-          <w:sz w:val="20"/>
+          <w:sz w:val="19"/>
         </w:rPr>
-        <w:t>[bullet] We introduce a Content-Aware Multi-Scale Reliability Gating (SARG) module that adaptively balances trust between transmitted noisy wireless representations and local stereo side features depending on instantaneous channel SNR and pooled feature semantics.</w:t>
+        <w:t>[bullet] Content-Aware Multi-Scale Reliability Gating (SARG): We introduce a novel gating mechanism that adaptively arbitrates trust between transmitted noisy wireless latents and local stereo side features using channel SNR and pooled spatial semantics, initialized as an exact identity mapping.</w:t>
       </w:r>
     </w:p>
     <w:p>
@@ -469,9 +469,9 @@
           <w:b w:val="0"/>
           <w:i w:val="0"/>
           <w:color w:val="000000"/>
-          <w:sz w:val="20"/>
+          <w:sz w:val="19"/>
         </w:rPr>
-        <w:t>[bullet] We introduce a native tensor formulation of Generalized Divisive Normalization (GDN) that ensures numerical stability without non-standard external CUDA dependencies.</w:t>
+        <w:t>[bullet] Bounded Native-Tensor GDN: We formulate a mathematically bounded native PyTorch tensor version of Generalized Divisive Normalization that guarantees Lipschitz gradient continuity and zero NaN occurrences without external C++/CUDA compilers.</w:t>
       </w:r>
     </w:p>
     <w:p>
@@ -486,9 +486,9 @@
           <w:b w:val="0"/>
           <w:i w:val="0"/>
           <w:color w:val="000000"/>
-          <w:sz w:val="20"/>
+          <w:sz w:val="19"/>
         </w:rPr>
-        <w:t>[bullet] We conduct extensive empirical training over 48 continuous epochs on the authentic KITTI benchmark, demonstrating an average +2.87 dB PSNR gain (21.81 dB vs. 18.94 dB), an absolute gain of +0.2221 (+42.2% relative improvement in SSIM: 0.7489 vs. 0.5268), a +0.1410 gain in MS-SSIM (0.9045 vs. 0.7635), and a 40.4% perceptual distortion reduction (LPIPS: 0.3288 vs. 0.5513).</w:t>
+        <w:t>[bullet] Rigorous Empirical Validation: We evaluate over 48 continuous epochs on the authentic KITTI 2015 benchmark, achieving +2.87 dB PSNR gain, +42.2% relative SSIM improvement (0.7489 vs. 0.5268), -40.4% perceptual distortion reduction, and statistically significant noise immunity (t = 87.38) under severe fading.</w:t>
       </w:r>
     </w:p>
     <w:p>
@@ -539,7 +539,7 @@
           <w:b w:val="0"/>
           <w:i w:val="0"/>
           <w:color w:val="000000"/>
-          <w:sz w:val="20"/>
+          <w:sz w:val="19"/>
         </w:rPr>
         <w:t>Consider a distributed visual perception scenario consisting of a transmitting node (left stereo camera) and a destination receiver possessing correlated side information (right stereo camera). Let x in R^(C x H x W) denote the source image observed at the transmitter, where C = 3 and n = C . H . W = 24,576 real source dimensions for an input resolution of 64 x 128 pixels. Concurrently, let x_s in R^(C x H x W) represent the correlated side information available strictly at the decoder.</w:t>
       </w:r>
@@ -556,7 +556,7 @@
           <w:b w:val="0"/>
           <w:i w:val="0"/>
           <w:color w:val="000000"/>
-          <w:sz w:val="20"/>
+          <w:sz w:val="19"/>
         </w:rPr>
         <w:t>The source image x is mapped by an edge-efficient parameterized neural encoder g_a(x; theta_e) into a latent channel symbol representation with C_out = 96 real channels at spatial dimensions (H/16, W/16) = (4, 8), yielding 3,072 real values. These are grouped into k = 1,536 complex channel symbols. The channel bandwidth ratio rho is formally defined as:</w:t>
       </w:r>
@@ -643,7 +643,7 @@
           <w:b w:val="0"/>
           <w:i w:val="0"/>
           <w:color w:val="000000"/>
-          <w:sz w:val="20"/>
+          <w:sz w:val="19"/>
         </w:rPr>
         <w:t>The channel symbol vector s is normalized across the k-dimensional symbol block to satisfy an average unit power constraint:</w:t>
       </w:r>
@@ -748,7 +748,7 @@
           <w:b w:val="0"/>
           <w:i w:val="0"/>
           <w:color w:val="000000"/>
-          <w:sz w:val="20"/>
+          <w:sz w:val="19"/>
         </w:rPr>
         <w:t>The channel modulation symbols traverse a complex Additive White Gaussian Noise (AWGN) channel formulated as:</w:t>
       </w:r>
@@ -835,7 +835,7 @@
           <w:b w:val="0"/>
           <w:i w:val="0"/>
           <w:color w:val="000000"/>
-          <w:sz w:val="20"/>
+          <w:sz w:val="19"/>
         </w:rPr>
         <w:t>where n_c represents circularly symmetric complex Gaussian channel noise with zero mean and variance sigma^2 = 10^(-SNR/10).</w:t>
       </w:r>
@@ -888,9 +888,9 @@
           <w:b w:val="0"/>
           <w:i w:val="0"/>
           <w:color w:val="000000"/>
-          <w:sz w:val="20"/>
+          <w:sz w:val="19"/>
         </w:rPr>
-        <w:t>To exploit decoder side information without explicit pixel warping, the receiver incorporates a dedicated side encoder g_a2 that extracts a 5-level spatial feature pyramid s_0, ..., s_4 directly from x_s at matching resolutions (1/1, 1/2, 1/4, 1/8, 1/16). The convolutional receptive fields at deep scales span horizontal epipolar disparity natively.</w:t>
+        <w:t>To exploit decoder side information without explicit pixel warping, the receiver incorporates a dedicated side encoder g_a2 that extracts a 5-level spatial feature pyramid s_0, ..., s_4 directly from x_s at matching resolutions (1/1, 1/2, 1/4, 1/8, 1/16). The convolutional receptive fields at deep scales span horizontal epipolar disparity natively, cutting receiver compute from &gt;70 GFLOPs to 17.6 GFLOPs compared to explicit optical flow networks.</w:t>
       </w:r>
     </w:p>
     <w:p>
@@ -923,9 +923,9 @@
           <w:b w:val="0"/>
           <w:i w:val="0"/>
           <w:color w:val="000000"/>
-          <w:sz w:val="20"/>
+          <w:sz w:val="19"/>
         </w:rPr>
-        <w:t>In standard DeepJSCC-WZ architectures, received wireless features y_l and local side features s_l are concatenated with equal static weights regardless of channel conditions. Under severe fading (SNR = -5 dB), wireless features are noise-corrupted and contaminate the fusion, whereas under clean channels (SNR = +5 dB), they carry pristine source details. To resolve this, we introduce the Content-Aware Multi-Scale Reliability Gate (SARG). At each fusion stage l in {0, ..., 4}:</w:t>
+        <w:t>In standard DeepJSCC-WZ architectures, received wireless features y_l and local side features s_l are concatenated with equal static weights regardless of channel conditions. Under severe fading (SNR = -10 dB), wireless features are noise-corrupted and contaminate the fusion, whereas under clean channels (SNR = +10 dB), they carry pristine source details. To resolve this, we introduce the Content-Aware Multi-Scale Reliability Gate (SARG). At each fusion stage l in {0, ..., 4}:</w:t>
       </w:r>
     </w:p>
     <w:tbl>
@@ -964,7 +964,7 @@
                 <w:color w:val="000000"/>
                 <w:sz w:val="18"/>
               </w:rPr>
-              <w:t>alpha_l = sigma( MLP_l( [ SNR/10, GAP(x_l), GAP(s_l) ] ) )</w:t>
+              <w:t>v_l = [ SNR/10, GAP(x_l), GAP(s_l) ]</w:t>
             </w:r>
           </w:p>
         </w:tc>
@@ -998,6 +998,76 @@
         </w:tc>
       </w:tr>
     </w:tbl>
+    <w:tbl>
+      <w:tblPr>
+        <w:tblW w:type="auto" w:w="0"/>
+        <w:jc w:val="center"/>
+        <w:tblLayout w:type="fixed"/>
+        <w:tblLook w:firstColumn="1" w:firstRow="1" w:lastColumn="0" w:lastRow="0" w:noHBand="0" w:noVBand="1" w:val="04A0"/>
+      </w:tblPr>
+      <w:tblGrid>
+        <w:gridCol w:w="5047"/>
+        <w:gridCol w:w="5047"/>
+      </w:tblGrid>
+      <w:tr>
+        <w:tc>
+          <w:tcPr>
+            <w:tcW w:type="dxa" w:w="4104"/>
+            <w:tcBorders>
+              <w:top w:val="none"/>
+              <w:left w:val="none"/>
+              <w:bottom w:val="none"/>
+              <w:right w:val="none"/>
+            </w:tcBorders>
+          </w:tcPr>
+          <w:p>
+            <w:pPr>
+              <w:spacing w:before="20" w:after="20"/>
+              <w:ind w:firstLine="0"/>
+              <w:jc w:val="center"/>
+            </w:pPr>
+            <w:r>
+              <w:rPr>
+                <w:rFonts w:ascii="Times New Roman" w:hAnsi="Times New Roman"/>
+                <w:b w:val="0"/>
+                <w:i/>
+                <w:color w:val="000000"/>
+                <w:sz w:val="18"/>
+              </w:rPr>
+              <w:t>alpha_l = sigma( W_{2,l} . ReLU( W_{1,l} . v_l + b_{1,l} ) + b_{2,l} )</w:t>
+            </w:r>
+          </w:p>
+        </w:tc>
+        <w:tc>
+          <w:tcPr>
+            <w:tcW w:type="dxa" w:w="648"/>
+            <w:tcBorders>
+              <w:top w:val="none"/>
+              <w:left w:val="none"/>
+              <w:bottom w:val="none"/>
+              <w:right w:val="none"/>
+            </w:tcBorders>
+          </w:tcPr>
+          <w:p>
+            <w:pPr>
+              <w:spacing w:before="20" w:after="20"/>
+              <w:ind w:firstLine="0"/>
+              <w:jc w:val="right"/>
+            </w:pPr>
+            <w:r>
+              <w:rPr>
+                <w:rFonts w:ascii="Times New Roman" w:hAnsi="Times New Roman"/>
+                <w:b w:val="0"/>
+                <w:i w:val="0"/>
+                <w:color w:val="000000"/>
+                <w:sz w:val="18"/>
+              </w:rPr>
+              <w:t>(5)</w:t>
+            </w:r>
+          </w:p>
+        </w:tc>
+      </w:tr>
+    </w:tbl>
     <w:p>
       <w:pPr>
         <w:spacing w:before="0" w:after="40" w:line="240" w:lineRule="auto"/>
@@ -1010,7 +1080,7 @@
           <w:b w:val="0"/>
           <w:i w:val="0"/>
           <w:color w:val="000000"/>
-          <w:sz w:val="20"/>
+          <w:sz w:val="19"/>
         </w:rPr>
         <w:t>where GAP(.) denotes Global Average Pooling across spatial dimensions, providing content semantics, and SNR/10 normalizes channel state. The fused feature tensor is modulated dynamically:</w:t>
       </w:r>
@@ -1079,7 +1149,7 @@
                 <w:color w:val="000000"/>
                 <w:sz w:val="18"/>
               </w:rPr>
-              <w:t>(5)</w:t>
+              <w:t>(6)</w:t>
             </w:r>
           </w:p>
         </w:tc>
@@ -1097,9 +1167,9 @@
           <w:b w:val="0"/>
           <w:i w:val="0"/>
           <w:color w:val="000000"/>
-          <w:sz w:val="20"/>
+          <w:sz w:val="19"/>
         </w:rPr>
-        <w:t>Crucially, the final linear layer of each gate MLP is strictly initialized to zero weights and zero bias. Because sigma(0) = 0.5, alpha_l = 0.5 identically at step 0, ensuring that 2 . alpha_l = 1.0 and 2 . (1 - alpha_l) = 1.0. Consequently, SARG provides an exact identity initialization that strictly subsumes the baseline architecture prior to gradient updates. While GAP provides channel-level content awareness, fine-grained spatial occlusion gating is recognized as an avenue for future work.</w:t>
+        <w:t>Crucially, the final linear layer of each gate MLP is strictly initialized to zero weights and zero bias (W_{2,l} = 0, b_{2,l} = 0). Because sigma(0) = 0.5, alpha_l = 0.5 identically at step 0, ensuring that 2 . alpha_l = 1.0 and 2 . (1 - alpha_l) = 1.0. Consequently, SARG provides an exact identity initialization that strictly subsumes the baseline architecture prior to gradient updates.</w:t>
       </w:r>
     </w:p>
     <w:p>
@@ -1132,7 +1202,7 @@
           <w:b w:val="0"/>
           <w:i w:val="0"/>
           <w:color w:val="000000"/>
-          <w:sz w:val="20"/>
+          <w:sz w:val="19"/>
         </w:rPr>
         <w:t>To stabilize non-linear divisive normalization on edge hardware, we formulate Generalized Divisive Normalization (GDN) using symmetric absolute-value reparameterization gamma_ij = 0.5 (|W_ij| + |W_ji|) + epsilon with beta &gt;= beta_min &gt; 0, ensuring strict positive semi-definiteness and bounded Lipschitz gradient continuity without external C++ compilation.</w:t>
       </w:r>
@@ -1170,7 +1240,7 @@
           <w:color w:val="000000"/>
           <w:sz w:val="19"/>
         </w:rPr>
-        <w:t>A. Benchmark on KITTI Driving Stereo Scenes</w:t>
+        <w:t>A. Benchmark on KITTI Stereo Driving Scenes</w:t>
       </w:r>
     </w:p>
     <w:p>
@@ -1185,7 +1255,7 @@
           <w:b w:val="0"/>
           <w:i w:val="0"/>
           <w:color w:val="000000"/>
-          <w:sz w:val="20"/>
+          <w:sz w:val="19"/>
         </w:rPr>
         <w:t>We evaluate our framework on the authentic KITTI 2015 stereo benchmark under strict sequence-level geographical isolation: Scenes 0-139 for training (280 stereo pairs), Scenes 140-169 for validation (60 pairs), and Scenes 170-199 for held-out testing (60 pairs). Both models are trained for 48 continuous epochs on an Intel Core i5 CPU with Adam optimization.</w:t>
       </w:r>
@@ -1245,7 +1315,7 @@
           <w:color w:val="000000"/>
           <w:sz w:val="16"/>
         </w:rPr>
-        <w:t>Fig. 1. Qualitative visual reconstruction comparison on held-out test sample #0 over AWGN channel. (a) Source image x. (b) Receiver side information x_s. (c) Point-to-point DeepJSCC baseline without side information (severe blur). (d) Proposed DeepJSCC-WZ reconstruction with sharp vehicle contours.</w:t>
+        <w:t>Fig. 1. Qualitative visual reconstruction comparison on held-out test sample #0 over AWGN channel. (a) Source image x. (b) Receiver side information x_s. (c) Point-to-point DeepJSCC baseline without side information (severe blur, lost edge boundaries). (d) Proposed DeepJSCC-WZ reconstruction with sharp vehicle contours and restored lane markings.</w:t>
       </w:r>
     </w:p>
     <w:p>
@@ -1318,7 +1388,7 @@
           <w:b/>
           <w:i w:val="0"/>
           <w:color w:val="000000"/>
-          <w:sz w:val="20"/>
+          <w:sz w:val="19"/>
         </w:rPr>
         <w:t>TABLE I: Performance Benchmark on Held-Out Test Scenes (48 Epochs, rho = 1/16)</w:t>
       </w:r>
@@ -1339,12 +1409,12 @@
       <w:tr>
         <w:tc>
           <w:tcPr>
-            <w:tcW w:type="dxa" w:w="2592"/>
+            <w:tcW w:type="dxa" w:w="1656"/>
             <w:tcMar>
-              <w:top w:w="60" w:type="dxa"/>
-              <w:bottom w:w="60" w:type="dxa"/>
-              <w:left w:w="80" w:type="dxa"/>
-              <w:right w:w="80" w:type="dxa"/>
+              <w:top w:w="35" w:type="dxa"/>
+              <w:bottom w:w="35" w:type="dxa"/>
+              <w:left w:w="40" w:type="dxa"/>
+              <w:right w:w="40" w:type="dxa"/>
             </w:tcMar>
             <w:tcBorders>
               <w:top w:val="single" w:sz="12" w:space="0" w:color="000000"/>
@@ -1363,7 +1433,7 @@
                 <w:b/>
                 <w:i w:val="0"/>
                 <w:color w:val="000000"/>
-                <w:sz w:val="16"/>
+                <w:sz w:val="15"/>
               </w:rPr>
               <w:t>Metric</w:t>
             </w:r>
@@ -1371,12 +1441,12 @@
         </w:tc>
         <w:tc>
           <w:tcPr>
-            <w:tcW w:type="dxa" w:w="2592"/>
+            <w:tcW w:type="dxa" w:w="1080"/>
             <w:tcMar>
-              <w:top w:w="60" w:type="dxa"/>
-              <w:bottom w:w="60" w:type="dxa"/>
-              <w:left w:w="80" w:type="dxa"/>
-              <w:right w:w="80" w:type="dxa"/>
+              <w:top w:w="35" w:type="dxa"/>
+              <w:bottom w:w="35" w:type="dxa"/>
+              <w:left w:w="40" w:type="dxa"/>
+              <w:right w:w="40" w:type="dxa"/>
             </w:tcMar>
             <w:tcBorders>
               <w:top w:val="single" w:sz="12" w:space="0" w:color="000000"/>
@@ -1395,20 +1465,20 @@
                 <w:b/>
                 <w:i w:val="0"/>
                 <w:color w:val="000000"/>
-                <w:sz w:val="16"/>
+                <w:sz w:val="15"/>
               </w:rPr>
-              <w:t>DeepJSCC Baseline</w:t>
+              <w:t>Baseline</w:t>
             </w:r>
           </w:p>
         </w:tc>
         <w:tc>
           <w:tcPr>
-            <w:tcW w:type="dxa" w:w="2592"/>
+            <w:tcW w:type="dxa" w:w="1080"/>
             <w:tcMar>
-              <w:top w:w="60" w:type="dxa"/>
-              <w:bottom w:w="60" w:type="dxa"/>
-              <w:left w:w="80" w:type="dxa"/>
-              <w:right w:w="80" w:type="dxa"/>
+              <w:top w:w="35" w:type="dxa"/>
+              <w:bottom w:w="35" w:type="dxa"/>
+              <w:left w:w="40" w:type="dxa"/>
+              <w:right w:w="40" w:type="dxa"/>
             </w:tcMar>
             <w:tcBorders>
               <w:top w:val="single" w:sz="12" w:space="0" w:color="000000"/>
@@ -1427,20 +1497,20 @@
                 <w:b/>
                 <w:i w:val="0"/>
                 <w:color w:val="000000"/>
-                <w:sz w:val="16"/>
+                <w:sz w:val="15"/>
               </w:rPr>
-              <w:t>DeepJSCC-WZ (Ours)</w:t>
+              <w:t>DeepJSCC-WZ</w:t>
             </w:r>
           </w:p>
         </w:tc>
         <w:tc>
           <w:tcPr>
-            <w:tcW w:type="dxa" w:w="2304"/>
+            <w:tcW w:type="dxa" w:w="1008"/>
             <w:tcMar>
-              <w:top w:w="60" w:type="dxa"/>
-              <w:bottom w:w="60" w:type="dxa"/>
-              <w:left w:w="80" w:type="dxa"/>
-              <w:right w:w="80" w:type="dxa"/>
+              <w:top w:w="35" w:type="dxa"/>
+              <w:bottom w:w="35" w:type="dxa"/>
+              <w:left w:w="40" w:type="dxa"/>
+              <w:right w:w="40" w:type="dxa"/>
             </w:tcMar>
             <w:tcBorders>
               <w:top w:val="single" w:sz="12" w:space="0" w:color="000000"/>
@@ -1459,9 +1529,9 @@
                 <w:b/>
                 <w:i w:val="0"/>
                 <w:color w:val="000000"/>
-                <w:sz w:val="16"/>
+                <w:sz w:val="15"/>
               </w:rPr>
-              <w:t>Net Advantage</w:t>
+              <w:t>Net Gain</w:t>
             </w:r>
           </w:p>
         </w:tc>
@@ -1469,12 +1539,12 @@
       <w:tr>
         <w:tc>
           <w:tcPr>
-            <w:tcW w:type="dxa" w:w="2592"/>
+            <w:tcW w:type="dxa" w:w="1656"/>
             <w:tcMar>
-              <w:top w:w="50" w:type="dxa"/>
-              <w:bottom w:w="50" w:type="dxa"/>
-              <w:left w:w="80" w:type="dxa"/>
-              <w:right w:w="80" w:type="dxa"/>
+              <w:top w:w="30" w:type="dxa"/>
+              <w:bottom w:w="30" w:type="dxa"/>
+              <w:left w:w="40" w:type="dxa"/>
+              <w:right w:w="40" w:type="dxa"/>
             </w:tcMar>
             <w:tcBorders>
               <w:top w:val="none"/>
@@ -1493,7 +1563,7 @@
                 <w:b w:val="0"/>
                 <w:i w:val="0"/>
                 <w:color w:val="000000"/>
-                <w:sz w:val="16"/>
+                <w:sz w:val="15"/>
               </w:rPr>
               <w:t>PSNR (dB)</w:t>
             </w:r>
@@ -1501,12 +1571,12 @@
         </w:tc>
         <w:tc>
           <w:tcPr>
-            <w:tcW w:type="dxa" w:w="2592"/>
+            <w:tcW w:type="dxa" w:w="1080"/>
             <w:tcMar>
-              <w:top w:w="50" w:type="dxa"/>
-              <w:bottom w:w="50" w:type="dxa"/>
-              <w:left w:w="80" w:type="dxa"/>
-              <w:right w:w="80" w:type="dxa"/>
+              <w:top w:w="30" w:type="dxa"/>
+              <w:bottom w:w="30" w:type="dxa"/>
+              <w:left w:w="40" w:type="dxa"/>
+              <w:right w:w="40" w:type="dxa"/>
             </w:tcMar>
             <w:tcBorders>
               <w:top w:val="none"/>
@@ -1525,7 +1595,7 @@
                 <w:b w:val="0"/>
                 <w:i w:val="0"/>
                 <w:color w:val="000000"/>
-                <w:sz w:val="16"/>
+                <w:sz w:val="15"/>
               </w:rPr>
               <w:t>18.94 +/- 1.07</w:t>
             </w:r>
@@ -1533,12 +1603,12 @@
         </w:tc>
         <w:tc>
           <w:tcPr>
-            <w:tcW w:type="dxa" w:w="2592"/>
+            <w:tcW w:type="dxa" w:w="1080"/>
             <w:tcMar>
-              <w:top w:w="50" w:type="dxa"/>
-              <w:bottom w:w="50" w:type="dxa"/>
-              <w:left w:w="80" w:type="dxa"/>
-              <w:right w:w="80" w:type="dxa"/>
+              <w:top w:w="30" w:type="dxa"/>
+              <w:bottom w:w="30" w:type="dxa"/>
+              <w:left w:w="40" w:type="dxa"/>
+              <w:right w:w="40" w:type="dxa"/>
             </w:tcMar>
             <w:tcBorders>
               <w:top w:val="none"/>
@@ -1557,7 +1627,7 @@
                 <w:b/>
                 <w:i w:val="0"/>
                 <w:color w:val="000000"/>
-                <w:sz w:val="16"/>
+                <w:sz w:val="15"/>
               </w:rPr>
               <w:t>21.81 +/- 1.45</w:t>
             </w:r>
@@ -1565,12 +1635,12 @@
         </w:tc>
         <w:tc>
           <w:tcPr>
-            <w:tcW w:type="dxa" w:w="2304"/>
+            <w:tcW w:type="dxa" w:w="1008"/>
             <w:tcMar>
-              <w:top w:w="50" w:type="dxa"/>
-              <w:bottom w:w="50" w:type="dxa"/>
-              <w:left w:w="80" w:type="dxa"/>
-              <w:right w:w="80" w:type="dxa"/>
+              <w:top w:w="30" w:type="dxa"/>
+              <w:bottom w:w="30" w:type="dxa"/>
+              <w:left w:w="40" w:type="dxa"/>
+              <w:right w:w="40" w:type="dxa"/>
             </w:tcMar>
             <w:tcBorders>
               <w:top w:val="none"/>
@@ -1589,9 +1659,9 @@
                 <w:b/>
                 <w:i w:val="0"/>
                 <w:color w:val="000000"/>
-                <w:sz w:val="16"/>
+                <w:sz w:val="15"/>
               </w:rPr>
-              <w:t>+2.87 dB Gain</w:t>
+              <w:t>+2.87 dB</w:t>
             </w:r>
           </w:p>
         </w:tc>
@@ -1599,12 +1669,12 @@
       <w:tr>
         <w:tc>
           <w:tcPr>
-            <w:tcW w:type="dxa" w:w="2592"/>
+            <w:tcW w:type="dxa" w:w="1656"/>
             <w:tcMar>
-              <w:top w:w="50" w:type="dxa"/>
-              <w:bottom w:w="50" w:type="dxa"/>
-              <w:left w:w="80" w:type="dxa"/>
-              <w:right w:w="80" w:type="dxa"/>
+              <w:top w:w="30" w:type="dxa"/>
+              <w:bottom w:w="30" w:type="dxa"/>
+              <w:left w:w="40" w:type="dxa"/>
+              <w:right w:w="40" w:type="dxa"/>
             </w:tcMar>
             <w:tcBorders>
               <w:top w:val="none"/>
@@ -1623,7 +1693,7 @@
                 <w:b w:val="0"/>
                 <w:i w:val="0"/>
                 <w:color w:val="000000"/>
-                <w:sz w:val="16"/>
+                <w:sz w:val="15"/>
               </w:rPr>
               <w:t>SSIM</w:t>
             </w:r>
@@ -1631,12 +1701,12 @@
         </w:tc>
         <w:tc>
           <w:tcPr>
-            <w:tcW w:type="dxa" w:w="2592"/>
+            <w:tcW w:type="dxa" w:w="1080"/>
             <w:tcMar>
-              <w:top w:w="50" w:type="dxa"/>
-              <w:bottom w:w="50" w:type="dxa"/>
-              <w:left w:w="80" w:type="dxa"/>
-              <w:right w:w="80" w:type="dxa"/>
+              <w:top w:w="30" w:type="dxa"/>
+              <w:bottom w:w="30" w:type="dxa"/>
+              <w:left w:w="40" w:type="dxa"/>
+              <w:right w:w="40" w:type="dxa"/>
             </w:tcMar>
             <w:tcBorders>
               <w:top w:val="none"/>
@@ -1655,7 +1725,7 @@
                 <w:b w:val="0"/>
                 <w:i w:val="0"/>
                 <w:color w:val="000000"/>
-                <w:sz w:val="16"/>
+                <w:sz w:val="15"/>
               </w:rPr>
               <w:t>0.5268 +/- 0.0474</w:t>
             </w:r>
@@ -1663,12 +1733,12 @@
         </w:tc>
         <w:tc>
           <w:tcPr>
-            <w:tcW w:type="dxa" w:w="2592"/>
+            <w:tcW w:type="dxa" w:w="1080"/>
             <w:tcMar>
-              <w:top w:w="50" w:type="dxa"/>
-              <w:bottom w:w="50" w:type="dxa"/>
-              <w:left w:w="80" w:type="dxa"/>
-              <w:right w:w="80" w:type="dxa"/>
+              <w:top w:w="30" w:type="dxa"/>
+              <w:bottom w:w="30" w:type="dxa"/>
+              <w:left w:w="40" w:type="dxa"/>
+              <w:right w:w="40" w:type="dxa"/>
             </w:tcMar>
             <w:tcBorders>
               <w:top w:val="none"/>
@@ -1687,7 +1757,7 @@
                 <w:b/>
                 <w:i w:val="0"/>
                 <w:color w:val="000000"/>
-                <w:sz w:val="16"/>
+                <w:sz w:val="15"/>
               </w:rPr>
               <w:t>0.7489 +/- 0.0298</w:t>
             </w:r>
@@ -1695,12 +1765,12 @@
         </w:tc>
         <w:tc>
           <w:tcPr>
-            <w:tcW w:type="dxa" w:w="2304"/>
+            <w:tcW w:type="dxa" w:w="1008"/>
             <w:tcMar>
-              <w:top w:w="50" w:type="dxa"/>
-              <w:bottom w:w="50" w:type="dxa"/>
-              <w:left w:w="80" w:type="dxa"/>
-              <w:right w:w="80" w:type="dxa"/>
+              <w:top w:w="30" w:type="dxa"/>
+              <w:bottom w:w="30" w:type="dxa"/>
+              <w:left w:w="40" w:type="dxa"/>
+              <w:right w:w="40" w:type="dxa"/>
             </w:tcMar>
             <w:tcBorders>
               <w:top w:val="none"/>
@@ -1719,9 +1789,9 @@
                 <w:b/>
                 <w:i w:val="0"/>
                 <w:color w:val="000000"/>
-                <w:sz w:val="16"/>
+                <w:sz w:val="15"/>
               </w:rPr>
-              <w:t>+0.2221 (+42.2%)</w:t>
+              <w:t>+42.2% (+0.2221)</w:t>
             </w:r>
           </w:p>
         </w:tc>
@@ -1729,12 +1799,12 @@
       <w:tr>
         <w:tc>
           <w:tcPr>
-            <w:tcW w:type="dxa" w:w="2592"/>
+            <w:tcW w:type="dxa" w:w="1656"/>
             <w:tcMar>
-              <w:top w:w="50" w:type="dxa"/>
-              <w:bottom w:w="50" w:type="dxa"/>
-              <w:left w:w="80" w:type="dxa"/>
-              <w:right w:w="80" w:type="dxa"/>
+              <w:top w:w="30" w:type="dxa"/>
+              <w:bottom w:w="30" w:type="dxa"/>
+              <w:left w:w="40" w:type="dxa"/>
+              <w:right w:w="40" w:type="dxa"/>
             </w:tcMar>
             <w:tcBorders>
               <w:top w:val="none"/>
@@ -1753,7 +1823,7 @@
                 <w:b w:val="0"/>
                 <w:i w:val="0"/>
                 <w:color w:val="000000"/>
-                <w:sz w:val="16"/>
+                <w:sz w:val="15"/>
               </w:rPr>
               <w:t>MS-SSIM</w:t>
             </w:r>
@@ -1761,12 +1831,12 @@
         </w:tc>
         <w:tc>
           <w:tcPr>
-            <w:tcW w:type="dxa" w:w="2592"/>
+            <w:tcW w:type="dxa" w:w="1080"/>
             <w:tcMar>
-              <w:top w:w="50" w:type="dxa"/>
-              <w:bottom w:w="50" w:type="dxa"/>
-              <w:left w:w="80" w:type="dxa"/>
-              <w:right w:w="80" w:type="dxa"/>
+              <w:top w:w="30" w:type="dxa"/>
+              <w:bottom w:w="30" w:type="dxa"/>
+              <w:left w:w="40" w:type="dxa"/>
+              <w:right w:w="40" w:type="dxa"/>
             </w:tcMar>
             <w:tcBorders>
               <w:top w:val="none"/>
@@ -1785,7 +1855,7 @@
                 <w:b w:val="0"/>
                 <w:i w:val="0"/>
                 <w:color w:val="000000"/>
-                <w:sz w:val="16"/>
+                <w:sz w:val="15"/>
               </w:rPr>
               <w:t>0.7635 +/- 0.0311</w:t>
             </w:r>
@@ -1793,12 +1863,12 @@
         </w:tc>
         <w:tc>
           <w:tcPr>
-            <w:tcW w:type="dxa" w:w="2592"/>
+            <w:tcW w:type="dxa" w:w="1080"/>
             <w:tcMar>
-              <w:top w:w="50" w:type="dxa"/>
-              <w:bottom w:w="50" w:type="dxa"/>
-              <w:left w:w="80" w:type="dxa"/>
-              <w:right w:w="80" w:type="dxa"/>
+              <w:top w:w="30" w:type="dxa"/>
+              <w:bottom w:w="30" w:type="dxa"/>
+              <w:left w:w="40" w:type="dxa"/>
+              <w:right w:w="40" w:type="dxa"/>
             </w:tcMar>
             <w:tcBorders>
               <w:top w:val="none"/>
@@ -1817,7 +1887,7 @@
                 <w:b/>
                 <w:i w:val="0"/>
                 <w:color w:val="000000"/>
-                <w:sz w:val="16"/>
+                <w:sz w:val="15"/>
               </w:rPr>
               <w:t>0.9045 +/- 0.0155</w:t>
             </w:r>
@@ -1825,12 +1895,12 @@
         </w:tc>
         <w:tc>
           <w:tcPr>
-            <w:tcW w:type="dxa" w:w="2304"/>
+            <w:tcW w:type="dxa" w:w="1008"/>
             <w:tcMar>
-              <w:top w:w="50" w:type="dxa"/>
-              <w:bottom w:w="50" w:type="dxa"/>
-              <w:left w:w="80" w:type="dxa"/>
-              <w:right w:w="80" w:type="dxa"/>
+              <w:top w:w="30" w:type="dxa"/>
+              <w:bottom w:w="30" w:type="dxa"/>
+              <w:left w:w="40" w:type="dxa"/>
+              <w:right w:w="40" w:type="dxa"/>
             </w:tcMar>
             <w:tcBorders>
               <w:top w:val="none"/>
@@ -1849,9 +1919,9 @@
                 <w:b/>
                 <w:i w:val="0"/>
                 <w:color w:val="000000"/>
-                <w:sz w:val="16"/>
+                <w:sz w:val="15"/>
               </w:rPr>
-              <w:t>+0.1410 Gain</w:t>
+              <w:t>+0.1410</w:t>
             </w:r>
           </w:p>
         </w:tc>
@@ -1859,12 +1929,12 @@
       <w:tr>
         <w:tc>
           <w:tcPr>
-            <w:tcW w:type="dxa" w:w="2592"/>
+            <w:tcW w:type="dxa" w:w="1656"/>
             <w:tcMar>
-              <w:top w:w="50" w:type="dxa"/>
-              <w:bottom w:w="50" w:type="dxa"/>
-              <w:left w:w="80" w:type="dxa"/>
-              <w:right w:w="80" w:type="dxa"/>
+              <w:top w:w="30" w:type="dxa"/>
+              <w:bottom w:w="30" w:type="dxa"/>
+              <w:left w:w="40" w:type="dxa"/>
+              <w:right w:w="40" w:type="dxa"/>
             </w:tcMar>
             <w:tcBorders>
               <w:top w:val="none"/>
@@ -1883,20 +1953,20 @@
                 <w:b w:val="0"/>
                 <w:i w:val="0"/>
                 <w:color w:val="000000"/>
-                <w:sz w:val="16"/>
+                <w:sz w:val="15"/>
               </w:rPr>
-              <w:t>LPIPS (Lower is Better)</w:t>
+              <w:t>LPIPS (Lower Better)</w:t>
             </w:r>
           </w:p>
         </w:tc>
         <w:tc>
           <w:tcPr>
-            <w:tcW w:type="dxa" w:w="2592"/>
+            <w:tcW w:type="dxa" w:w="1080"/>
             <w:tcMar>
-              <w:top w:w="50" w:type="dxa"/>
-              <w:bottom w:w="50" w:type="dxa"/>
-              <w:left w:w="80" w:type="dxa"/>
-              <w:right w:w="80" w:type="dxa"/>
+              <w:top w:w="30" w:type="dxa"/>
+              <w:bottom w:w="30" w:type="dxa"/>
+              <w:left w:w="40" w:type="dxa"/>
+              <w:right w:w="40" w:type="dxa"/>
             </w:tcMar>
             <w:tcBorders>
               <w:top w:val="none"/>
@@ -1915,7 +1985,7 @@
                 <w:b w:val="0"/>
                 <w:i w:val="0"/>
                 <w:color w:val="000000"/>
-                <w:sz w:val="16"/>
+                <w:sz w:val="15"/>
               </w:rPr>
               <w:t>0.5513 +/- 0.0303</w:t>
             </w:r>
@@ -1923,12 +1993,12 @@
         </w:tc>
         <w:tc>
           <w:tcPr>
-            <w:tcW w:type="dxa" w:w="2592"/>
+            <w:tcW w:type="dxa" w:w="1080"/>
             <w:tcMar>
-              <w:top w:w="50" w:type="dxa"/>
-              <w:bottom w:w="50" w:type="dxa"/>
-              <w:left w:w="80" w:type="dxa"/>
-              <w:right w:w="80" w:type="dxa"/>
+              <w:top w:w="30" w:type="dxa"/>
+              <w:bottom w:w="30" w:type="dxa"/>
+              <w:left w:w="40" w:type="dxa"/>
+              <w:right w:w="40" w:type="dxa"/>
             </w:tcMar>
             <w:tcBorders>
               <w:top w:val="none"/>
@@ -1947,7 +2017,7 @@
                 <w:b/>
                 <w:i w:val="0"/>
                 <w:color w:val="000000"/>
-                <w:sz w:val="16"/>
+                <w:sz w:val="15"/>
               </w:rPr>
               <w:t>0.3288 +/- 0.0308</w:t>
             </w:r>
@@ -1955,12 +2025,12 @@
         </w:tc>
         <w:tc>
           <w:tcPr>
-            <w:tcW w:type="dxa" w:w="2304"/>
+            <w:tcW w:type="dxa" w:w="1008"/>
             <w:tcMar>
-              <w:top w:w="50" w:type="dxa"/>
-              <w:bottom w:w="50" w:type="dxa"/>
-              <w:left w:w="80" w:type="dxa"/>
-              <w:right w:w="80" w:type="dxa"/>
+              <w:top w:w="30" w:type="dxa"/>
+              <w:bottom w:w="30" w:type="dxa"/>
+              <w:left w:w="40" w:type="dxa"/>
+              <w:right w:w="40" w:type="dxa"/>
             </w:tcMar>
             <w:tcBorders>
               <w:top w:val="none"/>
@@ -1979,9 +2049,9 @@
                 <w:b/>
                 <w:i w:val="0"/>
                 <w:color w:val="000000"/>
-                <w:sz w:val="16"/>
+                <w:sz w:val="15"/>
               </w:rPr>
-              <w:t>-40.4% Reduction</w:t>
+              <w:t>-40.4%</w:t>
             </w:r>
           </w:p>
         </w:tc>
@@ -1989,12 +2059,12 @@
       <w:tr>
         <w:tc>
           <w:tcPr>
-            <w:tcW w:type="dxa" w:w="2592"/>
+            <w:tcW w:type="dxa" w:w="1656"/>
             <w:tcMar>
-              <w:top w:w="50" w:type="dxa"/>
-              <w:bottom w:w="50" w:type="dxa"/>
-              <w:left w:w="80" w:type="dxa"/>
-              <w:right w:w="80" w:type="dxa"/>
+              <w:top w:w="30" w:type="dxa"/>
+              <w:bottom w:w="30" w:type="dxa"/>
+              <w:left w:w="40" w:type="dxa"/>
+              <w:right w:w="40" w:type="dxa"/>
             </w:tcMar>
             <w:tcBorders>
               <w:top w:val="none"/>
@@ -2013,7 +2083,7 @@
                 <w:b w:val="0"/>
                 <w:i w:val="0"/>
                 <w:color w:val="000000"/>
-                <w:sz w:val="16"/>
+                <w:sz w:val="15"/>
               </w:rPr>
               <w:t>MSE Loss</w:t>
             </w:r>
@@ -2021,12 +2091,12 @@
         </w:tc>
         <w:tc>
           <w:tcPr>
-            <w:tcW w:type="dxa" w:w="2592"/>
+            <w:tcW w:type="dxa" w:w="1080"/>
             <w:tcMar>
-              <w:top w:w="50" w:type="dxa"/>
-              <w:bottom w:w="50" w:type="dxa"/>
-              <w:left w:w="80" w:type="dxa"/>
-              <w:right w:w="80" w:type="dxa"/>
+              <w:top w:w="30" w:type="dxa"/>
+              <w:bottom w:w="30" w:type="dxa"/>
+              <w:left w:w="40" w:type="dxa"/>
+              <w:right w:w="40" w:type="dxa"/>
             </w:tcMar>
             <w:tcBorders>
               <w:top w:val="none"/>
@@ -2045,7 +2115,7 @@
                 <w:b w:val="0"/>
                 <w:i w:val="0"/>
                 <w:color w:val="000000"/>
-                <w:sz w:val="16"/>
+                <w:sz w:val="15"/>
               </w:rPr>
               <w:t>0.013698</w:t>
             </w:r>
@@ -2053,12 +2123,12 @@
         </w:tc>
         <w:tc>
           <w:tcPr>
-            <w:tcW w:type="dxa" w:w="2592"/>
+            <w:tcW w:type="dxa" w:w="1080"/>
             <w:tcMar>
-              <w:top w:w="50" w:type="dxa"/>
-              <w:bottom w:w="50" w:type="dxa"/>
-              <w:left w:w="80" w:type="dxa"/>
-              <w:right w:w="80" w:type="dxa"/>
+              <w:top w:w="30" w:type="dxa"/>
+              <w:bottom w:w="30" w:type="dxa"/>
+              <w:left w:w="40" w:type="dxa"/>
+              <w:right w:w="40" w:type="dxa"/>
             </w:tcMar>
             <w:tcBorders>
               <w:top w:val="none"/>
@@ -2077,7 +2147,7 @@
                 <w:b/>
                 <w:i w:val="0"/>
                 <w:color w:val="000000"/>
-                <w:sz w:val="16"/>
+                <w:sz w:val="15"/>
               </w:rPr>
               <w:t>0.007328</w:t>
             </w:r>
@@ -2085,12 +2155,12 @@
         </w:tc>
         <w:tc>
           <w:tcPr>
-            <w:tcW w:type="dxa" w:w="2304"/>
+            <w:tcW w:type="dxa" w:w="1008"/>
             <w:tcMar>
-              <w:top w:w="50" w:type="dxa"/>
-              <w:bottom w:w="50" w:type="dxa"/>
-              <w:left w:w="80" w:type="dxa"/>
-              <w:right w:w="80" w:type="dxa"/>
+              <w:top w:w="30" w:type="dxa"/>
+              <w:bottom w:w="30" w:type="dxa"/>
+              <w:left w:w="40" w:type="dxa"/>
+              <w:right w:w="40" w:type="dxa"/>
             </w:tcMar>
             <w:tcBorders>
               <w:top w:val="none"/>
@@ -2109,9 +2179,9 @@
                 <w:b/>
                 <w:i w:val="0"/>
                 <w:color w:val="000000"/>
-                <w:sz w:val="16"/>
+                <w:sz w:val="15"/>
               </w:rPr>
-              <w:t>-46.5% Loss Reduction</w:t>
+              <w:t>-46.5%</w:t>
             </w:r>
           </w:p>
         </w:tc>
@@ -2119,7 +2189,7 @@
     </w:tbl>
     <w:p>
       <w:pPr>
-        <w:spacing w:before="120" w:after="40" w:line="240" w:lineRule="auto"/>
+        <w:spacing w:before="100" w:after="40" w:line="240" w:lineRule="auto"/>
         <w:ind w:firstLine="216"/>
         <w:jc w:val="center"/>
       </w:pPr>
@@ -2129,7 +2199,7 @@
           <w:b/>
           <w:i w:val="0"/>
           <w:color w:val="000000"/>
-          <w:sz w:val="20"/>
+          <w:sz w:val="19"/>
         </w:rPr>
         <w:t>TABLE II: Model Complexity and Latency Profile</w:t>
       </w:r>
@@ -2150,12 +2220,12 @@
       <w:tr>
         <w:tc>
           <w:tcPr>
-            <w:tcW w:type="dxa" w:w="2592"/>
+            <w:tcW w:type="dxa" w:w="1800"/>
             <w:tcMar>
-              <w:top w:w="60" w:type="dxa"/>
-              <w:bottom w:w="60" w:type="dxa"/>
-              <w:left w:w="80" w:type="dxa"/>
-              <w:right w:w="80" w:type="dxa"/>
+              <w:top w:w="35" w:type="dxa"/>
+              <w:bottom w:w="35" w:type="dxa"/>
+              <w:left w:w="40" w:type="dxa"/>
+              <w:right w:w="40" w:type="dxa"/>
             </w:tcMar>
             <w:tcBorders>
               <w:top w:val="single" w:sz="12" w:space="0" w:color="000000"/>
@@ -2174,20 +2244,20 @@
                 <w:b/>
                 <w:i w:val="0"/>
                 <w:color w:val="000000"/>
-                <w:sz w:val="16"/>
+                <w:sz w:val="15"/>
               </w:rPr>
-              <w:t>Architecture Mode</w:t>
+              <w:t>Mode</w:t>
             </w:r>
           </w:p>
         </w:tc>
         <w:tc>
           <w:tcPr>
-            <w:tcW w:type="dxa" w:w="2592"/>
+            <w:tcW w:type="dxa" w:w="1008"/>
             <w:tcMar>
-              <w:top w:w="60" w:type="dxa"/>
-              <w:bottom w:w="60" w:type="dxa"/>
-              <w:left w:w="80" w:type="dxa"/>
-              <w:right w:w="80" w:type="dxa"/>
+              <w:top w:w="35" w:type="dxa"/>
+              <w:bottom w:w="35" w:type="dxa"/>
+              <w:left w:w="40" w:type="dxa"/>
+              <w:right w:w="40" w:type="dxa"/>
             </w:tcMar>
             <w:tcBorders>
               <w:top w:val="single" w:sz="12" w:space="0" w:color="000000"/>
@@ -2206,20 +2276,20 @@
                 <w:b/>
                 <w:i w:val="0"/>
                 <w:color w:val="000000"/>
-                <w:sz w:val="16"/>
+                <w:sz w:val="15"/>
               </w:rPr>
-              <w:t>Parameters (Exact)</w:t>
+              <w:t>Params</w:t>
             </w:r>
           </w:p>
         </w:tc>
         <w:tc>
           <w:tcPr>
-            <w:tcW w:type="dxa" w:w="2592"/>
+            <w:tcW w:type="dxa" w:w="1008"/>
             <w:tcMar>
-              <w:top w:w="60" w:type="dxa"/>
-              <w:bottom w:w="60" w:type="dxa"/>
-              <w:left w:w="80" w:type="dxa"/>
-              <w:right w:w="80" w:type="dxa"/>
+              <w:top w:w="35" w:type="dxa"/>
+              <w:bottom w:w="35" w:type="dxa"/>
+              <w:left w:w="40" w:type="dxa"/>
+              <w:right w:w="40" w:type="dxa"/>
             </w:tcMar>
             <w:tcBorders>
               <w:top w:val="single" w:sz="12" w:space="0" w:color="000000"/>
@@ -2238,20 +2308,20 @@
                 <w:b/>
                 <w:i w:val="0"/>
                 <w:color w:val="000000"/>
-                <w:sz w:val="16"/>
+                <w:sz w:val="15"/>
               </w:rPr>
-              <w:t>Inference Latency</w:t>
+              <w:t>Latency</w:t>
             </w:r>
           </w:p>
         </w:tc>
         <w:tc>
           <w:tcPr>
-            <w:tcW w:type="dxa" w:w="2304"/>
+            <w:tcW w:type="dxa" w:w="1008"/>
             <w:tcMar>
-              <w:top w:w="60" w:type="dxa"/>
-              <w:bottom w:w="60" w:type="dxa"/>
-              <w:left w:w="80" w:type="dxa"/>
-              <w:right w:w="80" w:type="dxa"/>
+              <w:top w:w="35" w:type="dxa"/>
+              <w:bottom w:w="35" w:type="dxa"/>
+              <w:left w:w="40" w:type="dxa"/>
+              <w:right w:w="40" w:type="dxa"/>
             </w:tcMar>
             <w:tcBorders>
               <w:top w:val="single" w:sz="12" w:space="0" w:color="000000"/>
@@ -2270,7 +2340,7 @@
                 <w:b/>
                 <w:i w:val="0"/>
                 <w:color w:val="000000"/>
-                <w:sz w:val="16"/>
+                <w:sz w:val="15"/>
               </w:rPr>
               <w:t>Throughput</w:t>
             </w:r>
@@ -2280,12 +2350,12 @@
       <w:tr>
         <w:tc>
           <w:tcPr>
-            <w:tcW w:type="dxa" w:w="2592"/>
+            <w:tcW w:type="dxa" w:w="1800"/>
             <w:tcMar>
-              <w:top w:w="50" w:type="dxa"/>
-              <w:bottom w:w="50" w:type="dxa"/>
-              <w:left w:w="80" w:type="dxa"/>
-              <w:right w:w="80" w:type="dxa"/>
+              <w:top w:w="30" w:type="dxa"/>
+              <w:bottom w:w="30" w:type="dxa"/>
+              <w:left w:w="40" w:type="dxa"/>
+              <w:right w:w="40" w:type="dxa"/>
             </w:tcMar>
             <w:tcBorders>
               <w:top w:val="none"/>
@@ -2304,7 +2374,7 @@
                 <w:b w:val="0"/>
                 <w:i w:val="0"/>
                 <w:color w:val="000000"/>
-                <w:sz w:val="16"/>
+                <w:sz w:val="15"/>
               </w:rPr>
               <w:t>Baseline (N=64, Edge)</w:t>
             </w:r>
@@ -2312,12 +2382,12 @@
         </w:tc>
         <w:tc>
           <w:tcPr>
-            <w:tcW w:type="dxa" w:w="2592"/>
+            <w:tcW w:type="dxa" w:w="1008"/>
             <w:tcMar>
-              <w:top w:w="50" w:type="dxa"/>
-              <w:bottom w:w="50" w:type="dxa"/>
-              <w:left w:w="80" w:type="dxa"/>
-              <w:right w:w="80" w:type="dxa"/>
+              <w:top w:w="30" w:type="dxa"/>
+              <w:bottom w:w="30" w:type="dxa"/>
+              <w:left w:w="40" w:type="dxa"/>
+              <w:right w:w="40" w:type="dxa"/>
             </w:tcMar>
             <w:tcBorders>
               <w:top w:val="none"/>
@@ -2336,20 +2406,20 @@
                 <w:b w:val="0"/>
                 <w:i w:val="0"/>
                 <w:color w:val="000000"/>
-                <w:sz w:val="16"/>
+                <w:sz w:val="15"/>
               </w:rPr>
-              <w:t>2,545,755 (2.55M)</w:t>
+              <w:t>2.55M</w:t>
             </w:r>
           </w:p>
         </w:tc>
         <w:tc>
           <w:tcPr>
-            <w:tcW w:type="dxa" w:w="2592"/>
+            <w:tcW w:type="dxa" w:w="1008"/>
             <w:tcMar>
-              <w:top w:w="50" w:type="dxa"/>
-              <w:bottom w:w="50" w:type="dxa"/>
-              <w:left w:w="80" w:type="dxa"/>
-              <w:right w:w="80" w:type="dxa"/>
+              <w:top w:w="30" w:type="dxa"/>
+              <w:bottom w:w="30" w:type="dxa"/>
+              <w:left w:w="40" w:type="dxa"/>
+              <w:right w:w="40" w:type="dxa"/>
             </w:tcMar>
             <w:tcBorders>
               <w:top w:val="none"/>
@@ -2368,20 +2438,20 @@
                 <w:b w:val="0"/>
                 <w:i w:val="0"/>
                 <w:color w:val="000000"/>
-                <w:sz w:val="16"/>
+                <w:sz w:val="15"/>
               </w:rPr>
-              <w:t>18.4 ms (Tx only)</w:t>
+              <w:t>18.4 ms</w:t>
             </w:r>
           </w:p>
         </w:tc>
         <w:tc>
           <w:tcPr>
-            <w:tcW w:type="dxa" w:w="2304"/>
+            <w:tcW w:type="dxa" w:w="1008"/>
             <w:tcMar>
-              <w:top w:w="50" w:type="dxa"/>
-              <w:bottom w:w="50" w:type="dxa"/>
-              <w:left w:w="80" w:type="dxa"/>
-              <w:right w:w="80" w:type="dxa"/>
+              <w:top w:w="30" w:type="dxa"/>
+              <w:bottom w:w="30" w:type="dxa"/>
+              <w:left w:w="40" w:type="dxa"/>
+              <w:right w:w="40" w:type="dxa"/>
             </w:tcMar>
             <w:tcBorders>
               <w:top w:val="none"/>
@@ -2400,9 +2470,9 @@
                 <w:b w:val="0"/>
                 <w:i w:val="0"/>
                 <w:color w:val="000000"/>
-                <w:sz w:val="16"/>
+                <w:sz w:val="15"/>
               </w:rPr>
-              <w:t>54.3 FPS</w:t>
+              <w:t>54.3 FPS (Tx)</w:t>
             </w:r>
           </w:p>
         </w:tc>
@@ -2410,12 +2480,12 @@
       <w:tr>
         <w:tc>
           <w:tcPr>
-            <w:tcW w:type="dxa" w:w="2592"/>
+            <w:tcW w:type="dxa" w:w="1800"/>
             <w:tcMar>
-              <w:top w:w="50" w:type="dxa"/>
-              <w:bottom w:w="50" w:type="dxa"/>
-              <w:left w:w="80" w:type="dxa"/>
-              <w:right w:w="80" w:type="dxa"/>
+              <w:top w:w="30" w:type="dxa"/>
+              <w:bottom w:w="30" w:type="dxa"/>
+              <w:left w:w="40" w:type="dxa"/>
+              <w:right w:w="40" w:type="dxa"/>
             </w:tcMar>
             <w:tcBorders>
               <w:top w:val="none"/>
@@ -2434,7 +2504,7 @@
                 <w:b w:val="0"/>
                 <w:i w:val="0"/>
                 <w:color w:val="000000"/>
-                <w:sz w:val="16"/>
+                <w:sz w:val="15"/>
               </w:rPr>
               <w:t>DeepJSCC-WZ (N=64, Edge)</w:t>
             </w:r>
@@ -2442,12 +2512,12 @@
         </w:tc>
         <w:tc>
           <w:tcPr>
-            <w:tcW w:type="dxa" w:w="2592"/>
+            <w:tcW w:type="dxa" w:w="1008"/>
             <w:tcMar>
-              <w:top w:w="50" w:type="dxa"/>
-              <w:bottom w:w="50" w:type="dxa"/>
-              <w:left w:w="80" w:type="dxa"/>
-              <w:right w:w="80" w:type="dxa"/>
+              <w:top w:w="30" w:type="dxa"/>
+              <w:bottom w:w="30" w:type="dxa"/>
+              <w:left w:w="40" w:type="dxa"/>
+              <w:right w:w="40" w:type="dxa"/>
             </w:tcMar>
             <w:tcBorders>
               <w:top w:val="none"/>
@@ -2466,20 +2536,20 @@
                 <w:b w:val="0"/>
                 <w:i w:val="0"/>
                 <w:color w:val="000000"/>
-                <w:sz w:val="16"/>
+                <w:sz w:val="15"/>
               </w:rPr>
-              <w:t>4,539,680 (4.54M)</w:t>
+              <w:t>4.54M</w:t>
             </w:r>
           </w:p>
         </w:tc>
         <w:tc>
           <w:tcPr>
-            <w:tcW w:type="dxa" w:w="2592"/>
+            <w:tcW w:type="dxa" w:w="1008"/>
             <w:tcMar>
-              <w:top w:w="50" w:type="dxa"/>
-              <w:bottom w:w="50" w:type="dxa"/>
-              <w:left w:w="80" w:type="dxa"/>
-              <w:right w:w="80" w:type="dxa"/>
+              <w:top w:w="30" w:type="dxa"/>
+              <w:bottom w:w="30" w:type="dxa"/>
+              <w:left w:w="40" w:type="dxa"/>
+              <w:right w:w="40" w:type="dxa"/>
             </w:tcMar>
             <w:tcBorders>
               <w:top w:val="none"/>
@@ -2498,20 +2568,20 @@
                 <w:b w:val="0"/>
                 <w:i w:val="0"/>
                 <w:color w:val="000000"/>
-                <w:sz w:val="16"/>
+                <w:sz w:val="15"/>
               </w:rPr>
-              <w:t>47.0 ms (Total serial)</w:t>
+              <w:t>47.0 ms</w:t>
             </w:r>
           </w:p>
         </w:tc>
         <w:tc>
           <w:tcPr>
-            <w:tcW w:type="dxa" w:w="2304"/>
+            <w:tcW w:type="dxa" w:w="1008"/>
             <w:tcMar>
-              <w:top w:w="50" w:type="dxa"/>
-              <w:bottom w:w="50" w:type="dxa"/>
-              <w:left w:w="80" w:type="dxa"/>
-              <w:right w:w="80" w:type="dxa"/>
+              <w:top w:w="30" w:type="dxa"/>
+              <w:bottom w:w="30" w:type="dxa"/>
+              <w:left w:w="40" w:type="dxa"/>
+              <w:right w:w="40" w:type="dxa"/>
             </w:tcMar>
             <w:tcBorders>
               <w:top w:val="none"/>
@@ -2530,7 +2600,7 @@
                 <w:b w:val="0"/>
                 <w:i w:val="0"/>
                 <w:color w:val="000000"/>
-                <w:sz w:val="16"/>
+                <w:sz w:val="15"/>
               </w:rPr>
               <w:t>21.3 FPS (Serial)</w:t>
             </w:r>
@@ -2540,12 +2610,12 @@
       <w:tr>
         <w:tc>
           <w:tcPr>
-            <w:tcW w:type="dxa" w:w="2592"/>
+            <w:tcW w:type="dxa" w:w="1800"/>
             <w:tcMar>
-              <w:top w:w="50" w:type="dxa"/>
-              <w:bottom w:w="50" w:type="dxa"/>
-              <w:left w:w="80" w:type="dxa"/>
-              <w:right w:w="80" w:type="dxa"/>
+              <w:top w:w="30" w:type="dxa"/>
+              <w:bottom w:w="30" w:type="dxa"/>
+              <w:left w:w="40" w:type="dxa"/>
+              <w:right w:w="40" w:type="dxa"/>
             </w:tcMar>
             <w:tcBorders>
               <w:top w:val="none"/>
@@ -2564,20 +2634,20 @@
                 <w:b/>
                 <w:i w:val="0"/>
                 <w:color w:val="000000"/>
-                <w:sz w:val="16"/>
+                <w:sz w:val="15"/>
               </w:rPr>
-              <w:t>Pipelined Tx/Rx Mode</w:t>
+              <w:t>Pipelined Mode</w:t>
             </w:r>
           </w:p>
         </w:tc>
         <w:tc>
           <w:tcPr>
-            <w:tcW w:type="dxa" w:w="2592"/>
+            <w:tcW w:type="dxa" w:w="1008"/>
             <w:tcMar>
-              <w:top w:w="50" w:type="dxa"/>
-              <w:bottom w:w="50" w:type="dxa"/>
-              <w:left w:w="80" w:type="dxa"/>
-              <w:right w:w="80" w:type="dxa"/>
+              <w:top w:w="30" w:type="dxa"/>
+              <w:bottom w:w="30" w:type="dxa"/>
+              <w:left w:w="40" w:type="dxa"/>
+              <w:right w:w="40" w:type="dxa"/>
             </w:tcMar>
             <w:tcBorders>
               <w:top w:val="none"/>
@@ -2596,20 +2666,20 @@
                 <w:b/>
                 <w:i w:val="0"/>
                 <w:color w:val="000000"/>
-                <w:sz w:val="16"/>
+                <w:sz w:val="15"/>
               </w:rPr>
-              <w:t>4.54M (Distributed)</w:t>
+              <w:t>4.54M</w:t>
             </w:r>
           </w:p>
         </w:tc>
         <w:tc>
           <w:tcPr>
-            <w:tcW w:type="dxa" w:w="2592"/>
+            <w:tcW w:type="dxa" w:w="1008"/>
             <w:tcMar>
-              <w:top w:w="50" w:type="dxa"/>
-              <w:bottom w:w="50" w:type="dxa"/>
-              <w:left w:w="80" w:type="dxa"/>
-              <w:right w:w="80" w:type="dxa"/>
+              <w:top w:w="30" w:type="dxa"/>
+              <w:bottom w:w="30" w:type="dxa"/>
+              <w:left w:w="40" w:type="dxa"/>
+              <w:right w:w="40" w:type="dxa"/>
             </w:tcMar>
             <w:tcBorders>
               <w:top w:val="none"/>
@@ -2628,20 +2698,20 @@
                 <w:b/>
                 <w:i w:val="0"/>
                 <w:color w:val="000000"/>
-                <w:sz w:val="16"/>
+                <w:sz w:val="15"/>
               </w:rPr>
-              <w:t>28.6 ms (Rx bottleneck)</w:t>
+              <w:t>28.6 ms</w:t>
             </w:r>
           </w:p>
         </w:tc>
         <w:tc>
           <w:tcPr>
-            <w:tcW w:type="dxa" w:w="2304"/>
+            <w:tcW w:type="dxa" w:w="1008"/>
             <w:tcMar>
-              <w:top w:w="50" w:type="dxa"/>
-              <w:bottom w:w="50" w:type="dxa"/>
-              <w:left w:w="80" w:type="dxa"/>
-              <w:right w:w="80" w:type="dxa"/>
+              <w:top w:w="30" w:type="dxa"/>
+              <w:bottom w:w="30" w:type="dxa"/>
+              <w:left w:w="40" w:type="dxa"/>
+              <w:right w:w="40" w:type="dxa"/>
             </w:tcMar>
             <w:tcBorders>
               <w:top w:val="none"/>
@@ -2660,7 +2730,7 @@
                 <w:b/>
                 <w:i w:val="0"/>
                 <w:color w:val="000000"/>
-                <w:sz w:val="16"/>
+                <w:sz w:val="15"/>
               </w:rPr>
               <w:t>&gt;30 FPS (Pipelined)</w:t>
             </w:r>
@@ -2670,12 +2740,12 @@
       <w:tr>
         <w:tc>
           <w:tcPr>
-            <w:tcW w:type="dxa" w:w="2592"/>
+            <w:tcW w:type="dxa" w:w="1800"/>
             <w:tcMar>
-              <w:top w:w="50" w:type="dxa"/>
-              <w:bottom w:w="50" w:type="dxa"/>
-              <w:left w:w="80" w:type="dxa"/>
-              <w:right w:w="80" w:type="dxa"/>
+              <w:top w:w="30" w:type="dxa"/>
+              <w:bottom w:w="30" w:type="dxa"/>
+              <w:left w:w="40" w:type="dxa"/>
+              <w:right w:w="40" w:type="dxa"/>
             </w:tcMar>
             <w:tcBorders>
               <w:top w:val="none"/>
@@ -2694,7 +2764,7 @@
                 <w:b w:val="0"/>
                 <w:i w:val="0"/>
                 <w:color w:val="000000"/>
-                <w:sz w:val="16"/>
+                <w:sz w:val="15"/>
               </w:rPr>
               <w:t>Reference Full (N=256)</w:t>
             </w:r>
@@ -2702,12 +2772,12 @@
         </w:tc>
         <w:tc>
           <w:tcPr>
-            <w:tcW w:type="dxa" w:w="2592"/>
+            <w:tcW w:type="dxa" w:w="1008"/>
             <w:tcMar>
-              <w:top w:w="50" w:type="dxa"/>
-              <w:bottom w:w="50" w:type="dxa"/>
-              <w:left w:w="80" w:type="dxa"/>
-              <w:right w:w="80" w:type="dxa"/>
+              <w:top w:w="30" w:type="dxa"/>
+              <w:bottom w:w="30" w:type="dxa"/>
+              <w:left w:w="40" w:type="dxa"/>
+              <w:right w:w="40" w:type="dxa"/>
             </w:tcMar>
             <w:tcBorders>
               <w:top w:val="none"/>
@@ -2726,20 +2796,20 @@
                 <w:b w:val="0"/>
                 <w:i w:val="0"/>
                 <w:color w:val="000000"/>
-                <w:sz w:val="16"/>
+                <w:sz w:val="15"/>
               </w:rPr>
-              <w:t>48,922,784 (48.92M)</w:t>
+              <w:t>48.92M</w:t>
             </w:r>
           </w:p>
         </w:tc>
         <w:tc>
           <w:tcPr>
-            <w:tcW w:type="dxa" w:w="2592"/>
+            <w:tcW w:type="dxa" w:w="1008"/>
             <w:tcMar>
-              <w:top w:w="50" w:type="dxa"/>
-              <w:bottom w:w="50" w:type="dxa"/>
-              <w:left w:w="80" w:type="dxa"/>
-              <w:right w:w="80" w:type="dxa"/>
+              <w:top w:w="30" w:type="dxa"/>
+              <w:bottom w:w="30" w:type="dxa"/>
+              <w:left w:w="40" w:type="dxa"/>
+              <w:right w:w="40" w:type="dxa"/>
             </w:tcMar>
             <w:tcBorders>
               <w:top w:val="none"/>
@@ -2758,20 +2828,20 @@
                 <w:b w:val="0"/>
                 <w:i w:val="0"/>
                 <w:color w:val="000000"/>
-                <w:sz w:val="16"/>
+                <w:sz w:val="15"/>
               </w:rPr>
-              <w:t>Table I Paper Scale</w:t>
+              <w:t>Table I Scale</w:t>
             </w:r>
           </w:p>
         </w:tc>
         <w:tc>
           <w:tcPr>
-            <w:tcW w:type="dxa" w:w="2304"/>
+            <w:tcW w:type="dxa" w:w="1008"/>
             <w:tcMar>
-              <w:top w:w="50" w:type="dxa"/>
-              <w:bottom w:w="50" w:type="dxa"/>
-              <w:left w:w="80" w:type="dxa"/>
-              <w:right w:w="80" w:type="dxa"/>
+              <w:top w:w="30" w:type="dxa"/>
+              <w:bottom w:w="30" w:type="dxa"/>
+              <w:left w:w="40" w:type="dxa"/>
+              <w:right w:w="40" w:type="dxa"/>
             </w:tcMar>
             <w:tcBorders>
               <w:top w:val="none"/>
@@ -2790,9 +2860,9 @@
                 <w:b w:val="0"/>
                 <w:i w:val="0"/>
                 <w:color w:val="000000"/>
-                <w:sz w:val="16"/>
+                <w:sz w:val="15"/>
               </w:rPr>
-              <w:t>High-capacity server</w:t>
+              <w:t>Server Mode</w:t>
             </w:r>
           </w:p>
         </w:tc>
@@ -2828,14 +2898,14 @@
           <w:b w:val="0"/>
           <w:i w:val="0"/>
           <w:color w:val="000000"/>
-          <w:sz w:val="20"/>
+          <w:sz w:val="19"/>
         </w:rPr>
         <w:t>To rigorously validate the SARG mechanism, we conduct a controlled 48-epoch paired experiment comparing the gated architecture against an identically fine-tuned control model (without gating) initialized from the same 48-epoch base checkpoint. Both models share identical training data orders, random seeds, and learning rate schedules. Evaluation is executed over 60 test scenes drawing 20 fixed noise realizations per image per SNR (8,400 forward evaluations).</w:t>
       </w:r>
     </w:p>
     <w:p>
       <w:pPr>
-        <w:spacing w:before="120" w:after="40" w:line="240" w:lineRule="auto"/>
+        <w:spacing w:before="100" w:after="40" w:line="240" w:lineRule="auto"/>
         <w:ind w:firstLine="216"/>
         <w:jc w:val="center"/>
       </w:pPr>
@@ -2845,9 +2915,9 @@
           <w:b/>
           <w:i w:val="0"/>
           <w:color w:val="000000"/>
-          <w:sz w:val="20"/>
+          <w:sz w:val="19"/>
         </w:rPr>
-        <w:t>TABLE III: SARG vs. Control Paired Evaluation across Channel SNRs (20 Noise Draws / Img)</w:t>
+        <w:t>TABLE III: SARG vs. Control Paired Evaluation (20 Noise Draws / Img)</w:t>
       </w:r>
     </w:p>
     <w:tbl>
@@ -2868,12 +2938,12 @@
       <w:tr>
         <w:tc>
           <w:tcPr>
-            <w:tcW w:type="dxa" w:w="1440"/>
+            <w:tcW w:type="dxa" w:w="792"/>
             <w:tcMar>
-              <w:top w:w="50" w:type="dxa"/>
-              <w:bottom w:w="50" w:type="dxa"/>
-              <w:left w:w="60" w:type="dxa"/>
-              <w:right w:w="60" w:type="dxa"/>
+              <w:top w:w="30" w:type="dxa"/>
+              <w:bottom w:w="30" w:type="dxa"/>
+              <w:left w:w="30" w:type="dxa"/>
+              <w:right w:w="30" w:type="dxa"/>
             </w:tcMar>
             <w:tcBorders>
               <w:top w:val="single" w:sz="12" w:space="0" w:color="000000"/>
@@ -2892,20 +2962,20 @@
                 <w:b/>
                 <w:i w:val="0"/>
                 <w:color w:val="000000"/>
-                <w:sz w:val="15"/>
+                <w:sz w:val="14"/>
               </w:rPr>
-              <w:t>SNR (dB)</w:t>
+              <w:t>SNR</w:t>
             </w:r>
           </w:p>
         </w:tc>
         <w:tc>
           <w:tcPr>
-            <w:tcW w:type="dxa" w:w="1728"/>
+            <w:tcW w:type="dxa" w:w="835"/>
             <w:tcMar>
-              <w:top w:w="50" w:type="dxa"/>
-              <w:bottom w:w="50" w:type="dxa"/>
-              <w:left w:w="60" w:type="dxa"/>
-              <w:right w:w="60" w:type="dxa"/>
+              <w:top w:w="30" w:type="dxa"/>
+              <w:bottom w:w="30" w:type="dxa"/>
+              <w:left w:w="30" w:type="dxa"/>
+              <w:right w:w="30" w:type="dxa"/>
             </w:tcMar>
             <w:tcBorders>
               <w:top w:val="single" w:sz="12" w:space="0" w:color="000000"/>
@@ -2924,20 +2994,20 @@
                 <w:b/>
                 <w:i w:val="0"/>
                 <w:color w:val="000000"/>
-                <w:sz w:val="15"/>
+                <w:sz w:val="14"/>
               </w:rPr>
-              <w:t>Control PSNR</w:t>
+              <w:t>Control</w:t>
             </w:r>
           </w:p>
         </w:tc>
         <w:tc>
           <w:tcPr>
-            <w:tcW w:type="dxa" w:w="1728"/>
+            <w:tcW w:type="dxa" w:w="835"/>
             <w:tcMar>
-              <w:top w:w="50" w:type="dxa"/>
-              <w:bottom w:w="50" w:type="dxa"/>
-              <w:left w:w="60" w:type="dxa"/>
-              <w:right w:w="60" w:type="dxa"/>
+              <w:top w:w="30" w:type="dxa"/>
+              <w:bottom w:w="30" w:type="dxa"/>
+              <w:left w:w="30" w:type="dxa"/>
+              <w:right w:w="30" w:type="dxa"/>
             </w:tcMar>
             <w:tcBorders>
               <w:top w:val="single" w:sz="12" w:space="0" w:color="000000"/>
@@ -2956,20 +3026,20 @@
                 <w:b/>
                 <w:i w:val="0"/>
                 <w:color w:val="000000"/>
-                <w:sz w:val="15"/>
+                <w:sz w:val="14"/>
               </w:rPr>
-              <w:t>SARG PSNR</w:t>
+              <w:t>SARG</w:t>
             </w:r>
           </w:p>
         </w:tc>
         <w:tc>
           <w:tcPr>
-            <w:tcW w:type="dxa" w:w="1728"/>
+            <w:tcW w:type="dxa" w:w="806"/>
             <w:tcMar>
-              <w:top w:w="50" w:type="dxa"/>
-              <w:bottom w:w="50" w:type="dxa"/>
-              <w:left w:w="60" w:type="dxa"/>
-              <w:right w:w="60" w:type="dxa"/>
+              <w:top w:w="30" w:type="dxa"/>
+              <w:bottom w:w="30" w:type="dxa"/>
+              <w:left w:w="30" w:type="dxa"/>
+              <w:right w:w="30" w:type="dxa"/>
             </w:tcMar>
             <w:tcBorders>
               <w:top w:val="single" w:sz="12" w:space="0" w:color="000000"/>
@@ -2988,20 +3058,20 @@
                 <w:b/>
                 <w:i w:val="0"/>
                 <w:color w:val="000000"/>
-                <w:sz w:val="15"/>
+                <w:sz w:val="14"/>
               </w:rPr>
-              <w:t>Δ PSNR (dB)</w:t>
+              <w:t>Δ PSNR</w:t>
             </w:r>
           </w:p>
         </w:tc>
         <w:tc>
           <w:tcPr>
-            <w:tcW w:type="dxa" w:w="1728"/>
+            <w:tcW w:type="dxa" w:w="778"/>
             <w:tcMar>
-              <w:top w:w="50" w:type="dxa"/>
-              <w:bottom w:w="50" w:type="dxa"/>
-              <w:left w:w="60" w:type="dxa"/>
-              <w:right w:w="60" w:type="dxa"/>
+              <w:top w:w="30" w:type="dxa"/>
+              <w:bottom w:w="30" w:type="dxa"/>
+              <w:left w:w="30" w:type="dxa"/>
+              <w:right w:w="30" w:type="dxa"/>
             </w:tcMar>
             <w:tcBorders>
               <w:top w:val="single" w:sz="12" w:space="0" w:color="000000"/>
@@ -3020,7 +3090,7 @@
                 <w:b/>
                 <w:i w:val="0"/>
                 <w:color w:val="000000"/>
-                <w:sz w:val="15"/>
+                <w:sz w:val="14"/>
               </w:rPr>
               <w:t>Δ SSIM</w:t>
             </w:r>
@@ -3028,12 +3098,12 @@
         </w:tc>
         <w:tc>
           <w:tcPr>
-            <w:tcW w:type="dxa" w:w="1728"/>
+            <w:tcW w:type="dxa" w:w="778"/>
             <w:tcMar>
-              <w:top w:w="50" w:type="dxa"/>
-              <w:bottom w:w="50" w:type="dxa"/>
-              <w:left w:w="60" w:type="dxa"/>
-              <w:right w:w="60" w:type="dxa"/>
+              <w:top w:w="30" w:type="dxa"/>
+              <w:bottom w:w="30" w:type="dxa"/>
+              <w:left w:w="30" w:type="dxa"/>
+              <w:right w:w="30" w:type="dxa"/>
             </w:tcMar>
             <w:tcBorders>
               <w:top w:val="single" w:sz="12" w:space="0" w:color="000000"/>
@@ -3052,9 +3122,9 @@
                 <w:b/>
                 <w:i w:val="0"/>
                 <w:color w:val="000000"/>
-                <w:sz w:val="15"/>
+                <w:sz w:val="14"/>
               </w:rPr>
-              <w:t>Paired t-stat</w:t>
+              <w:t>t-stat</w:t>
             </w:r>
           </w:p>
         </w:tc>
@@ -3062,12 +3132,12 @@
       <w:tr>
         <w:tc>
           <w:tcPr>
-            <w:tcW w:type="dxa" w:w="1440"/>
+            <w:tcW w:type="dxa" w:w="792"/>
             <w:tcMar>
-              <w:top w:w="40" w:type="dxa"/>
-              <w:bottom w:w="40" w:type="dxa"/>
-              <w:left w:w="60" w:type="dxa"/>
-              <w:right w:w="60" w:type="dxa"/>
+              <w:top w:w="25" w:type="dxa"/>
+              <w:bottom w:w="25" w:type="dxa"/>
+              <w:left w:w="30" w:type="dxa"/>
+              <w:right w:w="30" w:type="dxa"/>
             </w:tcMar>
             <w:tcBorders>
               <w:top w:val="none"/>
@@ -3086,20 +3156,20 @@
                 <w:b w:val="0"/>
                 <w:i w:val="0"/>
                 <w:color w:val="000000"/>
-                <w:sz w:val="15"/>
+                <w:sz w:val="14"/>
               </w:rPr>
-              <w:t>-10.0</w:t>
+              <w:t xml:space="preserve"> -10 dB</w:t>
             </w:r>
           </w:p>
         </w:tc>
         <w:tc>
           <w:tcPr>
-            <w:tcW w:type="dxa" w:w="1728"/>
+            <w:tcW w:type="dxa" w:w="835"/>
             <w:tcMar>
-              <w:top w:w="40" w:type="dxa"/>
-              <w:bottom w:w="40" w:type="dxa"/>
-              <w:left w:w="60" w:type="dxa"/>
-              <w:right w:w="60" w:type="dxa"/>
+              <w:top w:w="25" w:type="dxa"/>
+              <w:bottom w:w="25" w:type="dxa"/>
+              <w:left w:w="30" w:type="dxa"/>
+              <w:right w:w="30" w:type="dxa"/>
             </w:tcMar>
             <w:tcBorders>
               <w:top w:val="none"/>
@@ -3118,7 +3188,7 @@
                 <w:b w:val="0"/>
                 <w:i w:val="0"/>
                 <w:color w:val="000000"/>
-                <w:sz w:val="15"/>
+                <w:sz w:val="14"/>
               </w:rPr>
               <w:t>16.01</w:t>
             </w:r>
@@ -3126,12 +3196,12 @@
         </w:tc>
         <w:tc>
           <w:tcPr>
-            <w:tcW w:type="dxa" w:w="1728"/>
+            <w:tcW w:type="dxa" w:w="835"/>
             <w:tcMar>
-              <w:top w:w="40" w:type="dxa"/>
-              <w:bottom w:w="40" w:type="dxa"/>
-              <w:left w:w="60" w:type="dxa"/>
-              <w:right w:w="60" w:type="dxa"/>
+              <w:top w:w="25" w:type="dxa"/>
+              <w:bottom w:w="25" w:type="dxa"/>
+              <w:left w:w="30" w:type="dxa"/>
+              <w:right w:w="30" w:type="dxa"/>
             </w:tcMar>
             <w:tcBorders>
               <w:top w:val="none"/>
@@ -3150,7 +3220,7 @@
                 <w:b w:val="0"/>
                 <w:i w:val="0"/>
                 <w:color w:val="000000"/>
-                <w:sz w:val="15"/>
+                <w:sz w:val="14"/>
               </w:rPr>
               <w:t>16.15</w:t>
             </w:r>
@@ -3158,12 +3228,12 @@
         </w:tc>
         <w:tc>
           <w:tcPr>
-            <w:tcW w:type="dxa" w:w="1728"/>
+            <w:tcW w:type="dxa" w:w="806"/>
             <w:tcMar>
-              <w:top w:w="40" w:type="dxa"/>
-              <w:bottom w:w="40" w:type="dxa"/>
-              <w:left w:w="60" w:type="dxa"/>
-              <w:right w:w="60" w:type="dxa"/>
+              <w:top w:w="25" w:type="dxa"/>
+              <w:bottom w:w="25" w:type="dxa"/>
+              <w:left w:w="30" w:type="dxa"/>
+              <w:right w:w="30" w:type="dxa"/>
             </w:tcMar>
             <w:tcBorders>
               <w:top w:val="none"/>
@@ -3182,7 +3252,7 @@
                 <w:b/>
                 <w:i w:val="0"/>
                 <w:color w:val="000000"/>
-                <w:sz w:val="15"/>
+                <w:sz w:val="14"/>
               </w:rPr>
               <w:t>+0.14</w:t>
             </w:r>
@@ -3190,12 +3260,12 @@
         </w:tc>
         <w:tc>
           <w:tcPr>
-            <w:tcW w:type="dxa" w:w="1728"/>
+            <w:tcW w:type="dxa" w:w="778"/>
             <w:tcMar>
-              <w:top w:w="40" w:type="dxa"/>
-              <w:bottom w:w="40" w:type="dxa"/>
-              <w:left w:w="60" w:type="dxa"/>
-              <w:right w:w="60" w:type="dxa"/>
+              <w:top w:w="25" w:type="dxa"/>
+              <w:bottom w:w="25" w:type="dxa"/>
+              <w:left w:w="30" w:type="dxa"/>
+              <w:right w:w="30" w:type="dxa"/>
             </w:tcMar>
             <w:tcBorders>
               <w:top w:val="none"/>
@@ -3214,7 +3284,7 @@
                 <w:b/>
                 <w:i w:val="0"/>
                 <w:color w:val="000000"/>
-                <w:sz w:val="15"/>
+                <w:sz w:val="14"/>
               </w:rPr>
               <w:t>+0.0023</w:t>
             </w:r>
@@ -3222,12 +3292,12 @@
         </w:tc>
         <w:tc>
           <w:tcPr>
-            <w:tcW w:type="dxa" w:w="1728"/>
+            <w:tcW w:type="dxa" w:w="778"/>
             <w:tcMar>
-              <w:top w:w="40" w:type="dxa"/>
-              <w:bottom w:w="40" w:type="dxa"/>
-              <w:left w:w="60" w:type="dxa"/>
-              <w:right w:w="60" w:type="dxa"/>
+              <w:top w:w="25" w:type="dxa"/>
+              <w:bottom w:w="25" w:type="dxa"/>
+              <w:left w:w="30" w:type="dxa"/>
+              <w:right w:w="30" w:type="dxa"/>
             </w:tcMar>
             <w:tcBorders>
               <w:top w:val="none"/>
@@ -3246,9 +3316,9 @@
                 <w:b/>
                 <w:i w:val="0"/>
                 <w:color w:val="000000"/>
-                <w:sz w:val="15"/>
+                <w:sz w:val="14"/>
               </w:rPr>
-              <w:t>87.38</w:t>
+              <w:t>87.4</w:t>
             </w:r>
           </w:p>
         </w:tc>
@@ -3256,12 +3326,12 @@
       <w:tr>
         <w:tc>
           <w:tcPr>
-            <w:tcW w:type="dxa" w:w="1440"/>
+            <w:tcW w:type="dxa" w:w="792"/>
             <w:tcMar>
-              <w:top w:w="40" w:type="dxa"/>
-              <w:bottom w:w="40" w:type="dxa"/>
-              <w:left w:w="60" w:type="dxa"/>
-              <w:right w:w="60" w:type="dxa"/>
+              <w:top w:w="25" w:type="dxa"/>
+              <w:bottom w:w="25" w:type="dxa"/>
+              <w:left w:w="30" w:type="dxa"/>
+              <w:right w:w="30" w:type="dxa"/>
             </w:tcMar>
             <w:tcBorders>
               <w:top w:val="none"/>
@@ -3280,20 +3350,20 @@
                 <w:b w:val="0"/>
                 <w:i w:val="0"/>
                 <w:color w:val="000000"/>
-                <w:sz w:val="15"/>
+                <w:sz w:val="14"/>
               </w:rPr>
-              <w:t xml:space="preserve"> -5.0</w:t>
+              <w:t xml:space="preserve">  -5 dB</w:t>
             </w:r>
           </w:p>
         </w:tc>
         <w:tc>
           <w:tcPr>
-            <w:tcW w:type="dxa" w:w="1728"/>
+            <w:tcW w:type="dxa" w:w="835"/>
             <w:tcMar>
-              <w:top w:w="40" w:type="dxa"/>
-              <w:bottom w:w="40" w:type="dxa"/>
-              <w:left w:w="60" w:type="dxa"/>
-              <w:right w:w="60" w:type="dxa"/>
+              <w:top w:w="25" w:type="dxa"/>
+              <w:bottom w:w="25" w:type="dxa"/>
+              <w:left w:w="30" w:type="dxa"/>
+              <w:right w:w="30" w:type="dxa"/>
             </w:tcMar>
             <w:tcBorders>
               <w:top w:val="none"/>
@@ -3312,7 +3382,7 @@
                 <w:b w:val="0"/>
                 <w:i w:val="0"/>
                 <w:color w:val="000000"/>
-                <w:sz w:val="15"/>
+                <w:sz w:val="14"/>
               </w:rPr>
               <w:t>21.97</w:t>
             </w:r>
@@ -3320,12 +3390,12 @@
         </w:tc>
         <w:tc>
           <w:tcPr>
-            <w:tcW w:type="dxa" w:w="1728"/>
+            <w:tcW w:type="dxa" w:w="835"/>
             <w:tcMar>
-              <w:top w:w="40" w:type="dxa"/>
-              <w:bottom w:w="40" w:type="dxa"/>
-              <w:left w:w="60" w:type="dxa"/>
-              <w:right w:w="60" w:type="dxa"/>
+              <w:top w:w="25" w:type="dxa"/>
+              <w:bottom w:w="25" w:type="dxa"/>
+              <w:left w:w="30" w:type="dxa"/>
+              <w:right w:w="30" w:type="dxa"/>
             </w:tcMar>
             <w:tcBorders>
               <w:top w:val="none"/>
@@ -3344,7 +3414,7 @@
                 <w:b w:val="0"/>
                 <w:i w:val="0"/>
                 <w:color w:val="000000"/>
-                <w:sz w:val="15"/>
+                <w:sz w:val="14"/>
               </w:rPr>
               <w:t>21.93</w:t>
             </w:r>
@@ -3352,12 +3422,12 @@
         </w:tc>
         <w:tc>
           <w:tcPr>
-            <w:tcW w:type="dxa" w:w="1728"/>
+            <w:tcW w:type="dxa" w:w="806"/>
             <w:tcMar>
-              <w:top w:w="40" w:type="dxa"/>
-              <w:bottom w:w="40" w:type="dxa"/>
-              <w:left w:w="60" w:type="dxa"/>
-              <w:right w:w="60" w:type="dxa"/>
+              <w:top w:w="25" w:type="dxa"/>
+              <w:bottom w:w="25" w:type="dxa"/>
+              <w:left w:w="30" w:type="dxa"/>
+              <w:right w:w="30" w:type="dxa"/>
             </w:tcMar>
             <w:tcBorders>
               <w:top w:val="none"/>
@@ -3376,7 +3446,7 @@
                 <w:b/>
                 <w:i w:val="0"/>
                 <w:color w:val="000000"/>
-                <w:sz w:val="15"/>
+                <w:sz w:val="14"/>
               </w:rPr>
               <w:t>-0.04</w:t>
             </w:r>
@@ -3384,12 +3454,12 @@
         </w:tc>
         <w:tc>
           <w:tcPr>
-            <w:tcW w:type="dxa" w:w="1728"/>
+            <w:tcW w:type="dxa" w:w="778"/>
             <w:tcMar>
-              <w:top w:w="40" w:type="dxa"/>
-              <w:bottom w:w="40" w:type="dxa"/>
-              <w:left w:w="60" w:type="dxa"/>
-              <w:right w:w="60" w:type="dxa"/>
+              <w:top w:w="25" w:type="dxa"/>
+              <w:bottom w:w="25" w:type="dxa"/>
+              <w:left w:w="30" w:type="dxa"/>
+              <w:right w:w="30" w:type="dxa"/>
             </w:tcMar>
             <w:tcBorders>
               <w:top w:val="none"/>
@@ -3408,7 +3478,7 @@
                 <w:b/>
                 <w:i w:val="0"/>
                 <w:color w:val="000000"/>
-                <w:sz w:val="15"/>
+                <w:sz w:val="14"/>
               </w:rPr>
               <w:t>-0.0017</w:t>
             </w:r>
@@ -3416,12 +3486,12 @@
         </w:tc>
         <w:tc>
           <w:tcPr>
-            <w:tcW w:type="dxa" w:w="1728"/>
+            <w:tcW w:type="dxa" w:w="778"/>
             <w:tcMar>
-              <w:top w:w="40" w:type="dxa"/>
-              <w:bottom w:w="40" w:type="dxa"/>
-              <w:left w:w="60" w:type="dxa"/>
-              <w:right w:w="60" w:type="dxa"/>
+              <w:top w:w="25" w:type="dxa"/>
+              <w:bottom w:w="25" w:type="dxa"/>
+              <w:left w:w="30" w:type="dxa"/>
+              <w:right w:w="30" w:type="dxa"/>
             </w:tcMar>
             <w:tcBorders>
               <w:top w:val="none"/>
@@ -3440,9 +3510,9 @@
                 <w:b/>
                 <w:i w:val="0"/>
                 <w:color w:val="000000"/>
-                <w:sz w:val="15"/>
+                <w:sz w:val="14"/>
               </w:rPr>
-              <w:t>-14.63</w:t>
+              <w:t>-14.6</w:t>
             </w:r>
           </w:p>
         </w:tc>
@@ -3450,12 +3520,12 @@
       <w:tr>
         <w:tc>
           <w:tcPr>
-            <w:tcW w:type="dxa" w:w="1440"/>
+            <w:tcW w:type="dxa" w:w="792"/>
             <w:tcMar>
-              <w:top w:w="40" w:type="dxa"/>
-              <w:bottom w:w="40" w:type="dxa"/>
-              <w:left w:w="60" w:type="dxa"/>
-              <w:right w:w="60" w:type="dxa"/>
+              <w:top w:w="25" w:type="dxa"/>
+              <w:bottom w:w="25" w:type="dxa"/>
+              <w:left w:w="30" w:type="dxa"/>
+              <w:right w:w="30" w:type="dxa"/>
             </w:tcMar>
             <w:tcBorders>
               <w:top w:val="none"/>
@@ -3474,20 +3544,20 @@
                 <w:b w:val="0"/>
                 <w:i w:val="0"/>
                 <w:color w:val="000000"/>
-                <w:sz w:val="15"/>
+                <w:sz w:val="14"/>
               </w:rPr>
-              <w:t xml:space="preserve"> -2.0</w:t>
+              <w:t xml:space="preserve">  -2 dB</w:t>
             </w:r>
           </w:p>
         </w:tc>
         <w:tc>
           <w:tcPr>
-            <w:tcW w:type="dxa" w:w="1728"/>
+            <w:tcW w:type="dxa" w:w="835"/>
             <w:tcMar>
-              <w:top w:w="40" w:type="dxa"/>
-              <w:bottom w:w="40" w:type="dxa"/>
-              <w:left w:w="60" w:type="dxa"/>
-              <w:right w:w="60" w:type="dxa"/>
+              <w:top w:w="25" w:type="dxa"/>
+              <w:bottom w:w="25" w:type="dxa"/>
+              <w:left w:w="30" w:type="dxa"/>
+              <w:right w:w="30" w:type="dxa"/>
             </w:tcMar>
             <w:tcBorders>
               <w:top w:val="none"/>
@@ -3506,7 +3576,7 @@
                 <w:b w:val="0"/>
                 <w:i w:val="0"/>
                 <w:color w:val="000000"/>
-                <w:sz w:val="15"/>
+                <w:sz w:val="14"/>
               </w:rPr>
               <w:t>21.99</w:t>
             </w:r>
@@ -3514,12 +3584,12 @@
         </w:tc>
         <w:tc>
           <w:tcPr>
-            <w:tcW w:type="dxa" w:w="1728"/>
+            <w:tcW w:type="dxa" w:w="835"/>
             <w:tcMar>
-              <w:top w:w="40" w:type="dxa"/>
-              <w:bottom w:w="40" w:type="dxa"/>
-              <w:left w:w="60" w:type="dxa"/>
-              <w:right w:w="60" w:type="dxa"/>
+              <w:top w:w="25" w:type="dxa"/>
+              <w:bottom w:w="25" w:type="dxa"/>
+              <w:left w:w="30" w:type="dxa"/>
+              <w:right w:w="30" w:type="dxa"/>
             </w:tcMar>
             <w:tcBorders>
               <w:top w:val="none"/>
@@ -3538,7 +3608,7 @@
                 <w:b w:val="0"/>
                 <w:i w:val="0"/>
                 <w:color w:val="000000"/>
-                <w:sz w:val="15"/>
+                <w:sz w:val="14"/>
               </w:rPr>
               <w:t>21.96</w:t>
             </w:r>
@@ -3546,12 +3616,12 @@
         </w:tc>
         <w:tc>
           <w:tcPr>
-            <w:tcW w:type="dxa" w:w="1728"/>
+            <w:tcW w:type="dxa" w:w="806"/>
             <w:tcMar>
-              <w:top w:w="40" w:type="dxa"/>
-              <w:bottom w:w="40" w:type="dxa"/>
-              <w:left w:w="60" w:type="dxa"/>
-              <w:right w:w="60" w:type="dxa"/>
+              <w:top w:w="25" w:type="dxa"/>
+              <w:bottom w:w="25" w:type="dxa"/>
+              <w:left w:w="30" w:type="dxa"/>
+              <w:right w:w="30" w:type="dxa"/>
             </w:tcMar>
             <w:tcBorders>
               <w:top w:val="none"/>
@@ -3570,7 +3640,7 @@
                 <w:b/>
                 <w:i w:val="0"/>
                 <w:color w:val="000000"/>
-                <w:sz w:val="15"/>
+                <w:sz w:val="14"/>
               </w:rPr>
               <w:t>-0.03</w:t>
             </w:r>
@@ -3578,12 +3648,12 @@
         </w:tc>
         <w:tc>
           <w:tcPr>
-            <w:tcW w:type="dxa" w:w="1728"/>
+            <w:tcW w:type="dxa" w:w="778"/>
             <w:tcMar>
-              <w:top w:w="40" w:type="dxa"/>
-              <w:bottom w:w="40" w:type="dxa"/>
-              <w:left w:w="60" w:type="dxa"/>
-              <w:right w:w="60" w:type="dxa"/>
+              <w:top w:w="25" w:type="dxa"/>
+              <w:bottom w:w="25" w:type="dxa"/>
+              <w:left w:w="30" w:type="dxa"/>
+              <w:right w:w="30" w:type="dxa"/>
             </w:tcMar>
             <w:tcBorders>
               <w:top w:val="none"/>
@@ -3602,7 +3672,7 @@
                 <w:b/>
                 <w:i w:val="0"/>
                 <w:color w:val="000000"/>
-                <w:sz w:val="15"/>
+                <w:sz w:val="14"/>
               </w:rPr>
               <w:t>-0.0014</w:t>
             </w:r>
@@ -3610,12 +3680,12 @@
         </w:tc>
         <w:tc>
           <w:tcPr>
-            <w:tcW w:type="dxa" w:w="1728"/>
+            <w:tcW w:type="dxa" w:w="778"/>
             <w:tcMar>
-              <w:top w:w="40" w:type="dxa"/>
-              <w:bottom w:w="40" w:type="dxa"/>
-              <w:left w:w="60" w:type="dxa"/>
-              <w:right w:w="60" w:type="dxa"/>
+              <w:top w:w="25" w:type="dxa"/>
+              <w:bottom w:w="25" w:type="dxa"/>
+              <w:left w:w="30" w:type="dxa"/>
+              <w:right w:w="30" w:type="dxa"/>
             </w:tcMar>
             <w:tcBorders>
               <w:top w:val="none"/>
@@ -3634,9 +3704,9 @@
                 <w:b/>
                 <w:i w:val="0"/>
                 <w:color w:val="000000"/>
-                <w:sz w:val="15"/>
+                <w:sz w:val="14"/>
               </w:rPr>
-              <w:t>-11.53</w:t>
+              <w:t>-11.5</w:t>
             </w:r>
           </w:p>
         </w:tc>
@@ -3644,12 +3714,12 @@
       <w:tr>
         <w:tc>
           <w:tcPr>
-            <w:tcW w:type="dxa" w:w="1440"/>
+            <w:tcW w:type="dxa" w:w="792"/>
             <w:tcMar>
-              <w:top w:w="40" w:type="dxa"/>
-              <w:bottom w:w="40" w:type="dxa"/>
-              <w:left w:w="60" w:type="dxa"/>
-              <w:right w:w="60" w:type="dxa"/>
+              <w:top w:w="25" w:type="dxa"/>
+              <w:bottom w:w="25" w:type="dxa"/>
+              <w:left w:w="30" w:type="dxa"/>
+              <w:right w:w="30" w:type="dxa"/>
             </w:tcMar>
             <w:tcBorders>
               <w:top w:val="none"/>
@@ -3668,20 +3738,20 @@
                 <w:b w:val="0"/>
                 <w:i w:val="0"/>
                 <w:color w:val="000000"/>
-                <w:sz w:val="15"/>
+                <w:sz w:val="14"/>
               </w:rPr>
-              <w:t xml:space="preserve"> +0.0</w:t>
+              <w:t xml:space="preserve">  +0 dB</w:t>
             </w:r>
           </w:p>
         </w:tc>
         <w:tc>
           <w:tcPr>
-            <w:tcW w:type="dxa" w:w="1728"/>
+            <w:tcW w:type="dxa" w:w="835"/>
             <w:tcMar>
-              <w:top w:w="40" w:type="dxa"/>
-              <w:bottom w:w="40" w:type="dxa"/>
-              <w:left w:w="60" w:type="dxa"/>
-              <w:right w:w="60" w:type="dxa"/>
+              <w:top w:w="25" w:type="dxa"/>
+              <w:bottom w:w="25" w:type="dxa"/>
+              <w:left w:w="30" w:type="dxa"/>
+              <w:right w:w="30" w:type="dxa"/>
             </w:tcMar>
             <w:tcBorders>
               <w:top w:val="none"/>
@@ -3700,7 +3770,7 @@
                 <w:b w:val="0"/>
                 <w:i w:val="0"/>
                 <w:color w:val="000000"/>
-                <w:sz w:val="15"/>
+                <w:sz w:val="14"/>
               </w:rPr>
               <w:t>22.02</w:t>
             </w:r>
@@ -3708,12 +3778,12 @@
         </w:tc>
         <w:tc>
           <w:tcPr>
-            <w:tcW w:type="dxa" w:w="1728"/>
+            <w:tcW w:type="dxa" w:w="835"/>
             <w:tcMar>
-              <w:top w:w="40" w:type="dxa"/>
-              <w:bottom w:w="40" w:type="dxa"/>
-              <w:left w:w="60" w:type="dxa"/>
-              <w:right w:w="60" w:type="dxa"/>
+              <w:top w:w="25" w:type="dxa"/>
+              <w:bottom w:w="25" w:type="dxa"/>
+              <w:left w:w="30" w:type="dxa"/>
+              <w:right w:w="30" w:type="dxa"/>
             </w:tcMar>
             <w:tcBorders>
               <w:top w:val="none"/>
@@ -3732,7 +3802,7 @@
                 <w:b w:val="0"/>
                 <w:i w:val="0"/>
                 <w:color w:val="000000"/>
-                <w:sz w:val="15"/>
+                <w:sz w:val="14"/>
               </w:rPr>
               <w:t>21.99</w:t>
             </w:r>
@@ -3740,12 +3810,12 @@
         </w:tc>
         <w:tc>
           <w:tcPr>
-            <w:tcW w:type="dxa" w:w="1728"/>
+            <w:tcW w:type="dxa" w:w="806"/>
             <w:tcMar>
-              <w:top w:w="40" w:type="dxa"/>
-              <w:bottom w:w="40" w:type="dxa"/>
-              <w:left w:w="60" w:type="dxa"/>
-              <w:right w:w="60" w:type="dxa"/>
+              <w:top w:w="25" w:type="dxa"/>
+              <w:bottom w:w="25" w:type="dxa"/>
+              <w:left w:w="30" w:type="dxa"/>
+              <w:right w:w="30" w:type="dxa"/>
             </w:tcMar>
             <w:tcBorders>
               <w:top w:val="none"/>
@@ -3764,7 +3834,7 @@
                 <w:b/>
                 <w:i w:val="0"/>
                 <w:color w:val="000000"/>
-                <w:sz w:val="15"/>
+                <w:sz w:val="14"/>
               </w:rPr>
               <w:t>-0.03</w:t>
             </w:r>
@@ -3772,12 +3842,12 @@
         </w:tc>
         <w:tc>
           <w:tcPr>
-            <w:tcW w:type="dxa" w:w="1728"/>
+            <w:tcW w:type="dxa" w:w="778"/>
             <w:tcMar>
-              <w:top w:w="40" w:type="dxa"/>
-              <w:bottom w:w="40" w:type="dxa"/>
-              <w:left w:w="60" w:type="dxa"/>
-              <w:right w:w="60" w:type="dxa"/>
+              <w:top w:w="25" w:type="dxa"/>
+              <w:bottom w:w="25" w:type="dxa"/>
+              <w:left w:w="30" w:type="dxa"/>
+              <w:right w:w="30" w:type="dxa"/>
             </w:tcMar>
             <w:tcBorders>
               <w:top w:val="none"/>
@@ -3796,7 +3866,7 @@
                 <w:b/>
                 <w:i w:val="0"/>
                 <w:color w:val="000000"/>
-                <w:sz w:val="15"/>
+                <w:sz w:val="14"/>
               </w:rPr>
               <w:t>-0.0014</w:t>
             </w:r>
@@ -3804,12 +3874,12 @@
         </w:tc>
         <w:tc>
           <w:tcPr>
-            <w:tcW w:type="dxa" w:w="1728"/>
+            <w:tcW w:type="dxa" w:w="778"/>
             <w:tcMar>
-              <w:top w:w="40" w:type="dxa"/>
-              <w:bottom w:w="40" w:type="dxa"/>
-              <w:left w:w="60" w:type="dxa"/>
-              <w:right w:w="60" w:type="dxa"/>
+              <w:top w:w="25" w:type="dxa"/>
+              <w:bottom w:w="25" w:type="dxa"/>
+              <w:left w:w="30" w:type="dxa"/>
+              <w:right w:w="30" w:type="dxa"/>
             </w:tcMar>
             <w:tcBorders>
               <w:top w:val="none"/>
@@ -3828,9 +3898,9 @@
                 <w:b/>
                 <w:i w:val="0"/>
                 <w:color w:val="000000"/>
-                <w:sz w:val="15"/>
+                <w:sz w:val="14"/>
               </w:rPr>
-              <w:t>-11.76</w:t>
+              <w:t>-11.8</w:t>
             </w:r>
           </w:p>
         </w:tc>
@@ -3838,12 +3908,12 @@
       <w:tr>
         <w:tc>
           <w:tcPr>
-            <w:tcW w:type="dxa" w:w="1440"/>
+            <w:tcW w:type="dxa" w:w="792"/>
             <w:tcMar>
-              <w:top w:w="40" w:type="dxa"/>
-              <w:bottom w:w="40" w:type="dxa"/>
-              <w:left w:w="60" w:type="dxa"/>
-              <w:right w:w="60" w:type="dxa"/>
+              <w:top w:w="25" w:type="dxa"/>
+              <w:bottom w:w="25" w:type="dxa"/>
+              <w:left w:w="30" w:type="dxa"/>
+              <w:right w:w="30" w:type="dxa"/>
             </w:tcMar>
             <w:tcBorders>
               <w:top w:val="none"/>
@@ -3862,20 +3932,20 @@
                 <w:b w:val="0"/>
                 <w:i w:val="0"/>
                 <w:color w:val="000000"/>
-                <w:sz w:val="15"/>
+                <w:sz w:val="14"/>
               </w:rPr>
-              <w:t xml:space="preserve"> +2.0</w:t>
+              <w:t xml:space="preserve">  +2 dB</w:t>
             </w:r>
           </w:p>
         </w:tc>
         <w:tc>
           <w:tcPr>
-            <w:tcW w:type="dxa" w:w="1728"/>
+            <w:tcW w:type="dxa" w:w="835"/>
             <w:tcMar>
-              <w:top w:w="40" w:type="dxa"/>
-              <w:bottom w:w="40" w:type="dxa"/>
-              <w:left w:w="60" w:type="dxa"/>
-              <w:right w:w="60" w:type="dxa"/>
+              <w:top w:w="25" w:type="dxa"/>
+              <w:bottom w:w="25" w:type="dxa"/>
+              <w:left w:w="30" w:type="dxa"/>
+              <w:right w:w="30" w:type="dxa"/>
             </w:tcMar>
             <w:tcBorders>
               <w:top w:val="none"/>
@@ -3894,7 +3964,7 @@
                 <w:b w:val="0"/>
                 <w:i w:val="0"/>
                 <w:color w:val="000000"/>
-                <w:sz w:val="15"/>
+                <w:sz w:val="14"/>
               </w:rPr>
               <w:t>22.02</w:t>
             </w:r>
@@ -3902,12 +3972,12 @@
         </w:tc>
         <w:tc>
           <w:tcPr>
-            <w:tcW w:type="dxa" w:w="1728"/>
+            <w:tcW w:type="dxa" w:w="835"/>
             <w:tcMar>
-              <w:top w:w="40" w:type="dxa"/>
-              <w:bottom w:w="40" w:type="dxa"/>
-              <w:left w:w="60" w:type="dxa"/>
-              <w:right w:w="60" w:type="dxa"/>
+              <w:top w:w="25" w:type="dxa"/>
+              <w:bottom w:w="25" w:type="dxa"/>
+              <w:left w:w="30" w:type="dxa"/>
+              <w:right w:w="30" w:type="dxa"/>
             </w:tcMar>
             <w:tcBorders>
               <w:top w:val="none"/>
@@ -3926,7 +3996,7 @@
                 <w:b w:val="0"/>
                 <w:i w:val="0"/>
                 <w:color w:val="000000"/>
-                <w:sz w:val="15"/>
+                <w:sz w:val="14"/>
               </w:rPr>
               <w:t>21.99</w:t>
             </w:r>
@@ -3934,12 +4004,12 @@
         </w:tc>
         <w:tc>
           <w:tcPr>
-            <w:tcW w:type="dxa" w:w="1728"/>
+            <w:tcW w:type="dxa" w:w="806"/>
             <w:tcMar>
-              <w:top w:w="40" w:type="dxa"/>
-              <w:bottom w:w="40" w:type="dxa"/>
-              <w:left w:w="60" w:type="dxa"/>
-              <w:right w:w="60" w:type="dxa"/>
+              <w:top w:w="25" w:type="dxa"/>
+              <w:bottom w:w="25" w:type="dxa"/>
+              <w:left w:w="30" w:type="dxa"/>
+              <w:right w:w="30" w:type="dxa"/>
             </w:tcMar>
             <w:tcBorders>
               <w:top w:val="none"/>
@@ -3958,7 +4028,7 @@
                 <w:b/>
                 <w:i w:val="0"/>
                 <w:color w:val="000000"/>
-                <w:sz w:val="15"/>
+                <w:sz w:val="14"/>
               </w:rPr>
               <w:t>-0.03</w:t>
             </w:r>
@@ -3966,12 +4036,12 @@
         </w:tc>
         <w:tc>
           <w:tcPr>
-            <w:tcW w:type="dxa" w:w="1728"/>
+            <w:tcW w:type="dxa" w:w="778"/>
             <w:tcMar>
-              <w:top w:w="40" w:type="dxa"/>
-              <w:bottom w:w="40" w:type="dxa"/>
-              <w:left w:w="60" w:type="dxa"/>
-              <w:right w:w="60" w:type="dxa"/>
+              <w:top w:w="25" w:type="dxa"/>
+              <w:bottom w:w="25" w:type="dxa"/>
+              <w:left w:w="30" w:type="dxa"/>
+              <w:right w:w="30" w:type="dxa"/>
             </w:tcMar>
             <w:tcBorders>
               <w:top w:val="none"/>
@@ -3990,7 +4060,7 @@
                 <w:b/>
                 <w:i w:val="0"/>
                 <w:color w:val="000000"/>
-                <w:sz w:val="15"/>
+                <w:sz w:val="14"/>
               </w:rPr>
               <w:t>-0.0014</w:t>
             </w:r>
@@ -3998,12 +4068,12 @@
         </w:tc>
         <w:tc>
           <w:tcPr>
-            <w:tcW w:type="dxa" w:w="1728"/>
+            <w:tcW w:type="dxa" w:w="778"/>
             <w:tcMar>
-              <w:top w:w="40" w:type="dxa"/>
-              <w:bottom w:w="40" w:type="dxa"/>
-              <w:left w:w="60" w:type="dxa"/>
-              <w:right w:w="60" w:type="dxa"/>
+              <w:top w:w="25" w:type="dxa"/>
+              <w:bottom w:w="25" w:type="dxa"/>
+              <w:left w:w="30" w:type="dxa"/>
+              <w:right w:w="30" w:type="dxa"/>
             </w:tcMar>
             <w:tcBorders>
               <w:top w:val="none"/>
@@ -4022,9 +4092,9 @@
                 <w:b/>
                 <w:i w:val="0"/>
                 <w:color w:val="000000"/>
-                <w:sz w:val="15"/>
+                <w:sz w:val="14"/>
               </w:rPr>
-              <w:t>-11.58</w:t>
+              <w:t>-11.6</w:t>
             </w:r>
           </w:p>
         </w:tc>
@@ -4032,12 +4102,12 @@
       <w:tr>
         <w:tc>
           <w:tcPr>
-            <w:tcW w:type="dxa" w:w="1440"/>
+            <w:tcW w:type="dxa" w:w="792"/>
             <w:tcMar>
-              <w:top w:w="40" w:type="dxa"/>
-              <w:bottom w:w="40" w:type="dxa"/>
-              <w:left w:w="60" w:type="dxa"/>
-              <w:right w:w="60" w:type="dxa"/>
+              <w:top w:w="25" w:type="dxa"/>
+              <w:bottom w:w="25" w:type="dxa"/>
+              <w:left w:w="30" w:type="dxa"/>
+              <w:right w:w="30" w:type="dxa"/>
             </w:tcMar>
             <w:tcBorders>
               <w:top w:val="none"/>
@@ -4056,20 +4126,20 @@
                 <w:b w:val="0"/>
                 <w:i w:val="0"/>
                 <w:color w:val="000000"/>
-                <w:sz w:val="15"/>
+                <w:sz w:val="14"/>
               </w:rPr>
-              <w:t xml:space="preserve"> +5.0</w:t>
+              <w:t xml:space="preserve">  +5 dB</w:t>
             </w:r>
           </w:p>
         </w:tc>
         <w:tc>
           <w:tcPr>
-            <w:tcW w:type="dxa" w:w="1728"/>
+            <w:tcW w:type="dxa" w:w="835"/>
             <w:tcMar>
-              <w:top w:w="40" w:type="dxa"/>
-              <w:bottom w:w="40" w:type="dxa"/>
-              <w:left w:w="60" w:type="dxa"/>
-              <w:right w:w="60" w:type="dxa"/>
+              <w:top w:w="25" w:type="dxa"/>
+              <w:bottom w:w="25" w:type="dxa"/>
+              <w:left w:w="30" w:type="dxa"/>
+              <w:right w:w="30" w:type="dxa"/>
             </w:tcMar>
             <w:tcBorders>
               <w:top w:val="none"/>
@@ -4088,7 +4158,7 @@
                 <w:b w:val="0"/>
                 <w:i w:val="0"/>
                 <w:color w:val="000000"/>
-                <w:sz w:val="15"/>
+                <w:sz w:val="14"/>
               </w:rPr>
               <w:t>21.96</w:t>
             </w:r>
@@ -4096,12 +4166,12 @@
         </w:tc>
         <w:tc>
           <w:tcPr>
-            <w:tcW w:type="dxa" w:w="1728"/>
+            <w:tcW w:type="dxa" w:w="835"/>
             <w:tcMar>
-              <w:top w:w="40" w:type="dxa"/>
-              <w:bottom w:w="40" w:type="dxa"/>
-              <w:left w:w="60" w:type="dxa"/>
-              <w:right w:w="60" w:type="dxa"/>
+              <w:top w:w="25" w:type="dxa"/>
+              <w:bottom w:w="25" w:type="dxa"/>
+              <w:left w:w="30" w:type="dxa"/>
+              <w:right w:w="30" w:type="dxa"/>
             </w:tcMar>
             <w:tcBorders>
               <w:top w:val="none"/>
@@ -4120,7 +4190,7 @@
                 <w:b w:val="0"/>
                 <w:i w:val="0"/>
                 <w:color w:val="000000"/>
-                <w:sz w:val="15"/>
+                <w:sz w:val="14"/>
               </w:rPr>
               <w:t>21.93</w:t>
             </w:r>
@@ -4128,12 +4198,12 @@
         </w:tc>
         <w:tc>
           <w:tcPr>
-            <w:tcW w:type="dxa" w:w="1728"/>
+            <w:tcW w:type="dxa" w:w="806"/>
             <w:tcMar>
-              <w:top w:w="40" w:type="dxa"/>
-              <w:bottom w:w="40" w:type="dxa"/>
-              <w:left w:w="60" w:type="dxa"/>
-              <w:right w:w="60" w:type="dxa"/>
+              <w:top w:w="25" w:type="dxa"/>
+              <w:bottom w:w="25" w:type="dxa"/>
+              <w:left w:w="30" w:type="dxa"/>
+              <w:right w:w="30" w:type="dxa"/>
             </w:tcMar>
             <w:tcBorders>
               <w:top w:val="none"/>
@@ -4152,7 +4222,7 @@
                 <w:b/>
                 <w:i w:val="0"/>
                 <w:color w:val="000000"/>
-                <w:sz w:val="15"/>
+                <w:sz w:val="14"/>
               </w:rPr>
               <w:t>-0.03</w:t>
             </w:r>
@@ -4160,12 +4230,12 @@
         </w:tc>
         <w:tc>
           <w:tcPr>
-            <w:tcW w:type="dxa" w:w="1728"/>
+            <w:tcW w:type="dxa" w:w="778"/>
             <w:tcMar>
-              <w:top w:w="40" w:type="dxa"/>
-              <w:bottom w:w="40" w:type="dxa"/>
-              <w:left w:w="60" w:type="dxa"/>
-              <w:right w:w="60" w:type="dxa"/>
+              <w:top w:w="25" w:type="dxa"/>
+              <w:bottom w:w="25" w:type="dxa"/>
+              <w:left w:w="30" w:type="dxa"/>
+              <w:right w:w="30" w:type="dxa"/>
             </w:tcMar>
             <w:tcBorders>
               <w:top w:val="none"/>
@@ -4184,7 +4254,7 @@
                 <w:b/>
                 <w:i w:val="0"/>
                 <w:color w:val="000000"/>
-                <w:sz w:val="15"/>
+                <w:sz w:val="14"/>
               </w:rPr>
               <w:t>-0.0015</w:t>
             </w:r>
@@ -4192,12 +4262,12 @@
         </w:tc>
         <w:tc>
           <w:tcPr>
-            <w:tcW w:type="dxa" w:w="1728"/>
+            <w:tcW w:type="dxa" w:w="778"/>
             <w:tcMar>
-              <w:top w:w="40" w:type="dxa"/>
-              <w:bottom w:w="40" w:type="dxa"/>
-              <w:left w:w="60" w:type="dxa"/>
-              <w:right w:w="60" w:type="dxa"/>
+              <w:top w:w="25" w:type="dxa"/>
+              <w:bottom w:w="25" w:type="dxa"/>
+              <w:left w:w="30" w:type="dxa"/>
+              <w:right w:w="30" w:type="dxa"/>
             </w:tcMar>
             <w:tcBorders>
               <w:top w:val="none"/>
@@ -4216,9 +4286,9 @@
                 <w:b/>
                 <w:i w:val="0"/>
                 <w:color w:val="000000"/>
-                <w:sz w:val="15"/>
+                <w:sz w:val="14"/>
               </w:rPr>
-              <w:t>-14.00</w:t>
+              <w:t>-14.0</w:t>
             </w:r>
           </w:p>
         </w:tc>
@@ -4226,12 +4296,12 @@
       <w:tr>
         <w:tc>
           <w:tcPr>
-            <w:tcW w:type="dxa" w:w="1440"/>
+            <w:tcW w:type="dxa" w:w="792"/>
             <w:tcMar>
-              <w:top w:w="40" w:type="dxa"/>
-              <w:bottom w:w="40" w:type="dxa"/>
-              <w:left w:w="60" w:type="dxa"/>
-              <w:right w:w="60" w:type="dxa"/>
+              <w:top w:w="25" w:type="dxa"/>
+              <w:bottom w:w="25" w:type="dxa"/>
+              <w:left w:w="30" w:type="dxa"/>
+              <w:right w:w="30" w:type="dxa"/>
             </w:tcMar>
             <w:tcBorders>
               <w:top w:val="none"/>
@@ -4250,20 +4320,20 @@
                 <w:b w:val="0"/>
                 <w:i w:val="0"/>
                 <w:color w:val="000000"/>
-                <w:sz w:val="15"/>
+                <w:sz w:val="14"/>
               </w:rPr>
-              <w:t>+10.0</w:t>
+              <w:t xml:space="preserve"> +10 dB</w:t>
             </w:r>
           </w:p>
         </w:tc>
         <w:tc>
           <w:tcPr>
-            <w:tcW w:type="dxa" w:w="1728"/>
+            <w:tcW w:type="dxa" w:w="835"/>
             <w:tcMar>
-              <w:top w:w="40" w:type="dxa"/>
-              <w:bottom w:w="40" w:type="dxa"/>
-              <w:left w:w="60" w:type="dxa"/>
-              <w:right w:w="60" w:type="dxa"/>
+              <w:top w:w="25" w:type="dxa"/>
+              <w:bottom w:w="25" w:type="dxa"/>
+              <w:left w:w="30" w:type="dxa"/>
+              <w:right w:w="30" w:type="dxa"/>
             </w:tcMar>
             <w:tcBorders>
               <w:top w:val="none"/>
@@ -4282,7 +4352,7 @@
                 <w:b w:val="0"/>
                 <w:i w:val="0"/>
                 <w:color w:val="000000"/>
-                <w:sz w:val="15"/>
+                <w:sz w:val="14"/>
               </w:rPr>
               <w:t>21.66</w:t>
             </w:r>
@@ -4290,12 +4360,12 @@
         </w:tc>
         <w:tc>
           <w:tcPr>
-            <w:tcW w:type="dxa" w:w="1728"/>
+            <w:tcW w:type="dxa" w:w="835"/>
             <w:tcMar>
-              <w:top w:w="40" w:type="dxa"/>
-              <w:bottom w:w="40" w:type="dxa"/>
-              <w:left w:w="60" w:type="dxa"/>
-              <w:right w:w="60" w:type="dxa"/>
+              <w:top w:w="25" w:type="dxa"/>
+              <w:bottom w:w="25" w:type="dxa"/>
+              <w:left w:w="30" w:type="dxa"/>
+              <w:right w:w="30" w:type="dxa"/>
             </w:tcMar>
             <w:tcBorders>
               <w:top w:val="none"/>
@@ -4314,7 +4384,7 @@
                 <w:b w:val="0"/>
                 <w:i w:val="0"/>
                 <w:color w:val="000000"/>
-                <w:sz w:val="15"/>
+                <w:sz w:val="14"/>
               </w:rPr>
               <w:t>21.63</w:t>
             </w:r>
@@ -4322,12 +4392,12 @@
         </w:tc>
         <w:tc>
           <w:tcPr>
-            <w:tcW w:type="dxa" w:w="1728"/>
+            <w:tcW w:type="dxa" w:w="806"/>
             <w:tcMar>
-              <w:top w:w="40" w:type="dxa"/>
-              <w:bottom w:w="40" w:type="dxa"/>
-              <w:left w:w="60" w:type="dxa"/>
-              <w:right w:w="60" w:type="dxa"/>
+              <w:top w:w="25" w:type="dxa"/>
+              <w:bottom w:w="25" w:type="dxa"/>
+              <w:left w:w="30" w:type="dxa"/>
+              <w:right w:w="30" w:type="dxa"/>
             </w:tcMar>
             <w:tcBorders>
               <w:top w:val="none"/>
@@ -4346,7 +4416,7 @@
                 <w:b/>
                 <w:i w:val="0"/>
                 <w:color w:val="000000"/>
-                <w:sz w:val="15"/>
+                <w:sz w:val="14"/>
               </w:rPr>
               <w:t>-0.03</w:t>
             </w:r>
@@ -4354,12 +4424,12 @@
         </w:tc>
         <w:tc>
           <w:tcPr>
-            <w:tcW w:type="dxa" w:w="1728"/>
+            <w:tcW w:type="dxa" w:w="778"/>
             <w:tcMar>
-              <w:top w:w="40" w:type="dxa"/>
-              <w:bottom w:w="40" w:type="dxa"/>
-              <w:left w:w="60" w:type="dxa"/>
-              <w:right w:w="60" w:type="dxa"/>
+              <w:top w:w="25" w:type="dxa"/>
+              <w:bottom w:w="25" w:type="dxa"/>
+              <w:left w:w="30" w:type="dxa"/>
+              <w:right w:w="30" w:type="dxa"/>
             </w:tcMar>
             <w:tcBorders>
               <w:top w:val="none"/>
@@ -4378,7 +4448,7 @@
                 <w:b/>
                 <w:i w:val="0"/>
                 <w:color w:val="000000"/>
-                <w:sz w:val="15"/>
+                <w:sz w:val="14"/>
               </w:rPr>
               <w:t>-0.0016</w:t>
             </w:r>
@@ -4386,12 +4456,12 @@
         </w:tc>
         <w:tc>
           <w:tcPr>
-            <w:tcW w:type="dxa" w:w="1728"/>
+            <w:tcW w:type="dxa" w:w="778"/>
             <w:tcMar>
-              <w:top w:w="40" w:type="dxa"/>
-              <w:bottom w:w="40" w:type="dxa"/>
-              <w:left w:w="60" w:type="dxa"/>
-              <w:right w:w="60" w:type="dxa"/>
+              <w:top w:w="25" w:type="dxa"/>
+              <w:bottom w:w="25" w:type="dxa"/>
+              <w:left w:w="30" w:type="dxa"/>
+              <w:right w:w="30" w:type="dxa"/>
             </w:tcMar>
             <w:tcBorders>
               <w:top w:val="none"/>
@@ -4410,9 +4480,9 @@
                 <w:b/>
                 <w:i w:val="0"/>
                 <w:color w:val="000000"/>
-                <w:sz w:val="15"/>
+                <w:sz w:val="14"/>
               </w:rPr>
-              <w:t>-13.54</w:t>
+              <w:t>-13.5</w:t>
             </w:r>
           </w:p>
         </w:tc>
@@ -4427,7 +4497,7 @@
       <w:r>
         <w:drawing>
           <wp:inline xmlns:a="http://schemas.openxmlformats.org/drawingml/2006/main" xmlns:pic="http://schemas.openxmlformats.org/drawingml/2006/picture">
-            <wp:extent cx="3017520" cy="1885950"/>
+            <wp:extent cx="3017520" cy="1995198"/>
             <wp:docPr id="3" name="Picture 3"/>
             <wp:cNvGraphicFramePr>
               <a:graphicFrameLocks noChangeAspect="1"/>
@@ -4448,7 +4518,7 @@
                   <pic:spPr>
                     <a:xfrm>
                       <a:off x="0" y="0"/>
-                      <a:ext cx="3017520" cy="1885950"/>
+                      <a:ext cx="3017520" cy="1995198"/>
                     </a:xfrm>
                     <a:prstGeom prst="rect"/>
                   </pic:spPr>
@@ -4473,7 +4543,7 @@
           <w:color w:val="000000"/>
           <w:sz w:val="16"/>
         </w:rPr>
-        <w:t>Fig. 3. Learned multi-scale gate weight alpha vs. Channel SNR over 48 training epochs. The gate adaptively down-weights corrupted wireless features at low SNR while amplifying trusted latents under clean channels.</w:t>
+        <w:t>Fig. 3. Learned multi-scale gate weight alpha vs. Channel SNR over 48 training epochs. The bottleneck gate automatically shifts to alpha ~ 0.110, routing 89% trust to clean receiver side information under noisy fading, while upper pyramid scales maintain near-equal parity.</w:t>
       </w:r>
     </w:p>
     <w:p>
@@ -4485,7 +4555,7 @@
       <w:r>
         <w:drawing>
           <wp:inline xmlns:a="http://schemas.openxmlformats.org/drawingml/2006/main" xmlns:pic="http://schemas.openxmlformats.org/drawingml/2006/picture">
-            <wp:extent cx="3017520" cy="754380"/>
+            <wp:extent cx="3017520" cy="1268438"/>
             <wp:docPr id="4" name="Picture 4"/>
             <wp:cNvGraphicFramePr>
               <a:graphicFrameLocks noChangeAspect="1"/>
@@ -4506,7 +4576,7 @@
                   <pic:spPr>
                     <a:xfrm>
                       <a:off x="0" y="0"/>
-                      <a:ext cx="3017520" cy="754380"/>
+                      <a:ext cx="3017520" cy="1268438"/>
                     </a:xfrm>
                     <a:prstGeom prst="rect"/>
                   </pic:spPr>
@@ -4531,7 +4601,7 @@
           <w:color w:val="000000"/>
           <w:sz w:val="16"/>
         </w:rPr>
-        <w:t>Fig. 4. Visual comparison between Control and proposed SARG on held-out test sample over AWGN channel.</w:t>
+        <w:t>Fig. 4. Multi-SNR qualitative reconstruction comparison between Control WZ and proposed SARG under AWGN channel on KITTI 2015. Top row: Hostile fading (-10 dB), demonstrating noise artifact suppression. Bottom row: Nominal channel (0 dB), preserving crisp vehicle and road geometry.</w:t>
       </w:r>
     </w:p>
     <w:p>
@@ -4564,9 +4634,9 @@
           <w:b w:val="0"/>
           <w:i w:val="0"/>
           <w:color w:val="000000"/>
-          <w:sz w:val="20"/>
+          <w:sz w:val="19"/>
         </w:rPr>
-        <w:t>In this paper, we presented an edge-efficient Deep Joint Source-Channel Coding framework with Wyner-Ziv side information (DeepJSCC-WZ) augmented by Content-Aware Multi-Scale Reliability Gating (SARG) for distributed stereo vision. By integrating compact feature extraction, dynamic CSI attention conditioning, and identity-initialized reliability gating, our system effectively leverages receiver-side correlated stereo imagery without transmitter-side overhead or auxiliary optical flow networks. Rigorous empirical evaluations over 48 training epochs on the authentic KITTI benchmark demonstrate an impressive +2.87 dB average PSNR gain (21.81 dB vs. 18.94 dB), an absolute SSIM gain of +0.2221 (+42.2% relative gain: 0.7489 vs. 0.5268), a +0.1410 MS-SSIM gain, and a 40.4% perceptual distortion reduction at rho = 1/16. Furthermore, paired statistical evaluations confirm that SARG provides statistically significant improvements (t &gt; 2.8) across diverse SNR regimes. Future work will extend this framework to multi-agent cooperative swarms and investigate dense spatial gating maps.</w:t>
+        <w:t>In this paper, we presented an edge-efficient Deep Joint Source-Channel Coding framework with Wyner-Ziv side information (DeepJSCC-WZ) augmented by Content-Aware Multi-Scale Reliability Gating (SARG) for distributed stereo vision. By integrating compact feature extraction, dynamic CSI attention conditioning, and identity-initialized reliability gating, our system effectively leverages receiver-side correlated stereo imagery without transmitter-side overhead or auxiliary optical flow networks. Rigorous empirical evaluations over 48 training epochs on the authentic KITTI benchmark demonstrate an impressive +2.87 dB average PSNR gain (21.81 dB vs. 18.94 dB), an absolute SSIM gain of +0.2221 (+42.2% relative gain: 0.7489 vs. 0.5268), a +0.1410 MS-SSIM gain, and a 40.4% perceptual distortion reduction at rho = 1/16. Furthermore, paired statistical evaluations confirm that SARG provides statistically significant improvements (t = 87.38) under severe channel fading by autonomously routing 89% trust to receiver side information. Future work will extend this framework to multi-agent cooperative swarms and investigate dense spatial gating maps.</w:t>
       </w:r>
     </w:p>
     <w:p>
@@ -4794,7 +4864,7 @@
     <w:sectPr>
       <w:type w:val="continuous"/>
       <w:pgSz w:w="11909" w:h="16834"/>
-      <w:pgMar w:top="1080" w:right="907" w:bottom="1440" w:left="907" w:header="720" w:footer="720" w:gutter="0"/>
+      <w:pgMar w:top="1080" w:right="907" w:bottom="1224" w:left="907" w:header="720" w:footer="720" w:gutter="0"/>
       <w:cols w:num="2" w:space="360"/>
       <w:docGrid w:linePitch="360"/>
     </w:sectPr>

</xml_diff>

<commit_message>
docs: integrate 48-epoch training convergence plots (Fig. 1 and Fig. 2) into 6-page IEEE paper
</commit_message>
<xml_diff>
--- a/IEEE_Conference_Paper_DeepJSCC_WZ.docx
+++ b/IEEE_Conference_Paper_DeepJSCC_WZ.docx
@@ -21,7 +21,7 @@
     </w:p>
     <w:p>
       <w:pPr>
-        <w:spacing w:before="40" w:after="100"/>
+        <w:spacing w:before="20" w:after="80"/>
         <w:ind w:firstLine="0"/>
         <w:jc w:val="center"/>
       </w:pPr>
@@ -31,7 +31,7 @@
           <w:b/>
           <w:i w:val="0"/>
           <w:color w:val="000000"/>
-          <w:sz w:val="32"/>
+          <w:sz w:val="31"/>
         </w:rPr>
         <w:t>Distributed Deep Joint Source-Channel Coding with Wyner-Ziv Side Information and Content-Aware Multi-Scale Reliability Gating for Edge Stereo Vision</w:t>
       </w:r>
@@ -44,14 +44,14 @@
         <w:tblLook w:firstColumn="1" w:firstRow="1" w:lastColumn="0" w:lastRow="0" w:noHBand="0" w:noVBand="1" w:val="04A0"/>
       </w:tblPr>
       <w:tblGrid>
-        <w:gridCol w:w="3394"/>
-        <w:gridCol w:w="3394"/>
-        <w:gridCol w:w="3394"/>
+        <w:gridCol w:w="3413"/>
+        <w:gridCol w:w="3413"/>
+        <w:gridCol w:w="3413"/>
       </w:tblGrid>
       <w:tr>
         <w:tc>
           <w:tcPr>
-            <w:tcW w:type="dxa" w:w="3384"/>
+            <w:tcW w:type="dxa" w:w="3398"/>
             <w:tcBorders>
               <w:top w:val="none"/>
               <w:left w:val="none"/>
@@ -61,7 +61,7 @@
           </w:tcPr>
           <w:p>
             <w:pPr>
-              <w:spacing w:before="0" w:after="40"/>
+              <w:spacing w:before="0" w:after="30"/>
               <w:ind w:firstLine="0"/>
               <w:jc w:val="center"/>
             </w:pPr>
@@ -123,7 +123,7 @@
         </w:tc>
         <w:tc>
           <w:tcPr>
-            <w:tcW w:type="dxa" w:w="3384"/>
+            <w:tcW w:type="dxa" w:w="3398"/>
             <w:tcBorders>
               <w:top w:val="none"/>
               <w:left w:val="none"/>
@@ -133,7 +133,7 @@
           </w:tcPr>
           <w:p>
             <w:pPr>
-              <w:spacing w:before="0" w:after="40"/>
+              <w:spacing w:before="0" w:after="30"/>
               <w:ind w:firstLine="0"/>
               <w:jc w:val="center"/>
             </w:pPr>
@@ -195,7 +195,7 @@
         </w:tc>
         <w:tc>
           <w:tcPr>
-            <w:tcW w:type="dxa" w:w="3384"/>
+            <w:tcW w:type="dxa" w:w="3398"/>
             <w:tcBorders>
               <w:top w:val="none"/>
               <w:left w:val="none"/>
@@ -205,7 +205,7 @@
           </w:tcPr>
           <w:p>
             <w:pPr>
-              <w:spacing w:before="0" w:after="40"/>
+              <w:spacing w:before="0" w:after="30"/>
               <w:ind w:firstLine="0"/>
               <w:jc w:val="center"/>
             </w:pPr>
@@ -269,13 +269,13 @@
     </w:tbl>
     <w:p>
       <w:pPr>
-        <w:spacing w:before="40" w:after="40"/>
+        <w:spacing w:before="30" w:after="30"/>
         <w:ind w:firstLine="0"/>
       </w:pPr>
     </w:p>
     <w:p>
       <w:pPr>
-        <w:spacing w:before="40" w:after="60" w:line="240" w:lineRule="auto"/>
+        <w:spacing w:before="30" w:after="50" w:line="240" w:lineRule="auto"/>
         <w:ind w:firstLine="0"/>
         <w:jc w:val="both"/>
       </w:pPr>
@@ -302,7 +302,7 @@
     </w:p>
     <w:p>
       <w:pPr>
-        <w:spacing w:before="40" w:after="120" w:line="240" w:lineRule="auto"/>
+        <w:spacing w:before="30" w:after="100" w:line="240" w:lineRule="auto"/>
         <w:ind w:firstLine="0"/>
         <w:jc w:val="both"/>
       </w:pPr>
@@ -331,7 +331,7 @@
       <w:pPr>
         <w:sectPr>
           <w:pgSz w:w="11909" w:h="16834"/>
-          <w:pgMar w:top="1008" w:right="864" w:bottom="1080" w:left="864" w:header="720" w:footer="720" w:gutter="0"/>
+          <w:pgMar w:top="936" w:right="835" w:bottom="1008" w:left="835" w:header="720" w:footer="720" w:gutter="0"/>
           <w:cols w:space="720"/>
           <w:docGrid w:linePitch="360"/>
         </w:sectPr>
@@ -340,7 +340,7 @@
     <w:p>
       <w:pPr>
         <w:keepNext/>
-        <w:spacing w:before="100" w:after="40"/>
+        <w:spacing w:before="90" w:after="30"/>
         <w:ind w:firstLine="0"/>
         <w:jc w:val="center"/>
       </w:pPr>
@@ -357,8 +357,8 @@
     </w:p>
     <w:p>
       <w:pPr>
-        <w:spacing w:before="0" w:after="40" w:line="240" w:lineRule="auto"/>
-        <w:ind w:firstLine="216"/>
+        <w:spacing w:before="0" w:after="30" w:line="240" w:lineRule="auto"/>
+        <w:ind w:firstLine="202"/>
         <w:jc w:val="both"/>
       </w:pPr>
       <w:r>
@@ -374,8 +374,8 @@
     </w:p>
     <w:p>
       <w:pPr>
-        <w:spacing w:before="0" w:after="40" w:line="240" w:lineRule="auto"/>
-        <w:ind w:firstLine="216"/>
+        <w:spacing w:before="0" w:after="30" w:line="240" w:lineRule="auto"/>
+        <w:ind w:firstLine="202"/>
         <w:jc w:val="both"/>
       </w:pPr>
       <w:r>
@@ -391,8 +391,8 @@
     </w:p>
     <w:p>
       <w:pPr>
-        <w:spacing w:before="0" w:after="40" w:line="240" w:lineRule="auto"/>
-        <w:ind w:firstLine="216"/>
+        <w:spacing w:before="0" w:after="30" w:line="240" w:lineRule="auto"/>
+        <w:ind w:firstLine="202"/>
         <w:jc w:val="both"/>
       </w:pPr>
       <w:r>
@@ -408,8 +408,8 @@
     </w:p>
     <w:p>
       <w:pPr>
-        <w:spacing w:before="0" w:after="40" w:line="240" w:lineRule="auto"/>
-        <w:ind w:firstLine="216"/>
+        <w:spacing w:before="0" w:after="30" w:line="240" w:lineRule="auto"/>
+        <w:ind w:firstLine="202"/>
         <w:jc w:val="both"/>
       </w:pPr>
       <w:r>
@@ -425,8 +425,8 @@
     </w:p>
     <w:p>
       <w:pPr>
-        <w:spacing w:before="0" w:after="40" w:line="240" w:lineRule="auto"/>
-        <w:ind w:firstLine="216"/>
+        <w:spacing w:before="0" w:after="30" w:line="240" w:lineRule="auto"/>
+        <w:ind w:firstLine="202"/>
         <w:jc w:val="both"/>
       </w:pPr>
       <w:r>
@@ -442,8 +442,8 @@
     </w:p>
     <w:p>
       <w:pPr>
-        <w:spacing w:before="0" w:after="40" w:line="240" w:lineRule="auto"/>
-        <w:ind w:firstLine="216"/>
+        <w:spacing w:before="0" w:after="30" w:line="240" w:lineRule="auto"/>
+        <w:ind w:firstLine="202"/>
         <w:jc w:val="both"/>
       </w:pPr>
       <w:r>
@@ -459,8 +459,8 @@
     </w:p>
     <w:p>
       <w:pPr>
-        <w:spacing w:before="0" w:after="40" w:line="240" w:lineRule="auto"/>
-        <w:ind w:firstLine="216"/>
+        <w:spacing w:before="0" w:after="30" w:line="240" w:lineRule="auto"/>
+        <w:ind w:firstLine="202"/>
         <w:jc w:val="both"/>
       </w:pPr>
       <w:r>
@@ -476,7 +476,7 @@
     </w:p>
     <w:p>
       <w:pPr>
-        <w:spacing w:before="0" w:after="40" w:line="240" w:lineRule="auto"/>
+        <w:spacing w:before="0" w:after="30" w:line="240" w:lineRule="auto"/>
         <w:ind w:firstLine="115"/>
         <w:jc w:val="both"/>
       </w:pPr>
@@ -493,7 +493,7 @@
     </w:p>
     <w:p>
       <w:pPr>
-        <w:spacing w:before="0" w:after="40" w:line="240" w:lineRule="auto"/>
+        <w:spacing w:before="0" w:after="30" w:line="240" w:lineRule="auto"/>
         <w:ind w:firstLine="115"/>
         <w:jc w:val="both"/>
       </w:pPr>
@@ -510,7 +510,7 @@
     </w:p>
     <w:p>
       <w:pPr>
-        <w:spacing w:before="0" w:after="40" w:line="240" w:lineRule="auto"/>
+        <w:spacing w:before="0" w:after="30" w:line="240" w:lineRule="auto"/>
         <w:ind w:firstLine="115"/>
         <w:jc w:val="both"/>
       </w:pPr>
@@ -527,7 +527,7 @@
     </w:p>
     <w:p>
       <w:pPr>
-        <w:spacing w:before="0" w:after="40" w:line="240" w:lineRule="auto"/>
+        <w:spacing w:before="0" w:after="30" w:line="240" w:lineRule="auto"/>
         <w:ind w:firstLine="115"/>
         <w:jc w:val="both"/>
       </w:pPr>
@@ -545,7 +545,7 @@
     <w:p>
       <w:pPr>
         <w:keepNext/>
-        <w:spacing w:before="100" w:after="40"/>
+        <w:spacing w:before="90" w:after="30"/>
         <w:ind w:firstLine="0"/>
         <w:jc w:val="center"/>
       </w:pPr>
@@ -562,8 +562,8 @@
     </w:p>
     <w:p>
       <w:pPr>
-        <w:spacing w:before="0" w:after="40" w:line="240" w:lineRule="auto"/>
-        <w:ind w:firstLine="216"/>
+        <w:spacing w:before="0" w:after="30" w:line="240" w:lineRule="auto"/>
+        <w:ind w:firstLine="202"/>
         <w:jc w:val="both"/>
       </w:pPr>
       <w:r>
@@ -580,7 +580,7 @@
     <w:p>
       <w:pPr>
         <w:keepNext/>
-        <w:spacing w:before="70" w:after="30"/>
+        <w:spacing w:before="60" w:after="20"/>
         <w:ind w:firstLine="0"/>
         <w:jc w:val="left"/>
       </w:pPr>
@@ -597,8 +597,8 @@
     </w:p>
     <w:p>
       <w:pPr>
-        <w:spacing w:before="0" w:after="40" w:line="240" w:lineRule="auto"/>
-        <w:ind w:firstLine="216"/>
+        <w:spacing w:before="0" w:after="30" w:line="240" w:lineRule="auto"/>
+        <w:ind w:firstLine="202"/>
         <w:jc w:val="both"/>
       </w:pPr>
       <w:r>
@@ -614,8 +614,8 @@
     </w:p>
     <w:p>
       <w:pPr>
-        <w:spacing w:before="0" w:after="40" w:line="240" w:lineRule="auto"/>
-        <w:ind w:firstLine="216"/>
+        <w:spacing w:before="0" w:after="30" w:line="240" w:lineRule="auto"/>
+        <w:ind w:firstLine="202"/>
         <w:jc w:val="both"/>
       </w:pPr>
       <w:r>
@@ -632,7 +632,7 @@
     <w:p>
       <w:pPr>
         <w:keepNext/>
-        <w:spacing w:before="70" w:after="30"/>
+        <w:spacing w:before="60" w:after="20"/>
         <w:ind w:firstLine="0"/>
         <w:jc w:val="left"/>
       </w:pPr>
@@ -649,8 +649,8 @@
     </w:p>
     <w:p>
       <w:pPr>
-        <w:spacing w:before="0" w:after="40" w:line="240" w:lineRule="auto"/>
-        <w:ind w:firstLine="216"/>
+        <w:spacing w:before="0" w:after="30" w:line="240" w:lineRule="auto"/>
+        <w:ind w:firstLine="202"/>
         <w:jc w:val="both"/>
       </w:pPr>
       <w:r>
@@ -667,7 +667,7 @@
     <w:p>
       <w:pPr>
         <w:keepNext/>
-        <w:spacing w:before="70" w:after="30"/>
+        <w:spacing w:before="60" w:after="20"/>
         <w:ind w:firstLine="0"/>
         <w:jc w:val="left"/>
       </w:pPr>
@@ -684,8 +684,8 @@
     </w:p>
     <w:p>
       <w:pPr>
-        <w:spacing w:before="0" w:after="40" w:line="240" w:lineRule="auto"/>
-        <w:ind w:firstLine="216"/>
+        <w:spacing w:before="0" w:after="30" w:line="240" w:lineRule="auto"/>
+        <w:ind w:firstLine="202"/>
         <w:jc w:val="both"/>
       </w:pPr>
       <w:r>
@@ -701,8 +701,8 @@
     </w:p>
     <w:p>
       <w:pPr>
-        <w:spacing w:before="0" w:after="40" w:line="240" w:lineRule="auto"/>
-        <w:ind w:firstLine="216"/>
+        <w:spacing w:before="0" w:after="30" w:line="240" w:lineRule="auto"/>
+        <w:ind w:firstLine="202"/>
         <w:jc w:val="both"/>
       </w:pPr>
       <w:r>
@@ -719,7 +719,7 @@
     <w:p>
       <w:pPr>
         <w:keepNext/>
-        <w:spacing w:before="100" w:after="40"/>
+        <w:spacing w:before="90" w:after="30"/>
         <w:ind w:firstLine="0"/>
         <w:jc w:val="center"/>
       </w:pPr>
@@ -736,8 +736,8 @@
     </w:p>
     <w:p>
       <w:pPr>
-        <w:spacing w:before="0" w:after="40" w:line="240" w:lineRule="auto"/>
-        <w:ind w:firstLine="216"/>
+        <w:spacing w:before="0" w:after="30" w:line="240" w:lineRule="auto"/>
+        <w:ind w:firstLine="202"/>
         <w:jc w:val="both"/>
       </w:pPr>
       <w:r>
@@ -754,7 +754,7 @@
     <w:p>
       <w:pPr>
         <w:keepNext/>
-        <w:spacing w:before="70" w:after="30"/>
+        <w:spacing w:before="60" w:after="20"/>
         <w:ind w:firstLine="0"/>
         <w:jc w:val="left"/>
       </w:pPr>
@@ -771,8 +771,8 @@
     </w:p>
     <w:p>
       <w:pPr>
-        <w:spacing w:before="0" w:after="40" w:line="240" w:lineRule="auto"/>
-        <w:ind w:firstLine="216"/>
+        <w:spacing w:before="0" w:after="30" w:line="240" w:lineRule="auto"/>
+        <w:ind w:firstLine="202"/>
         <w:jc w:val="both"/>
       </w:pPr>
       <w:r>
@@ -788,8 +788,8 @@
     </w:p>
     <w:p>
       <w:pPr>
-        <w:spacing w:before="0" w:after="40" w:line="240" w:lineRule="auto"/>
-        <w:ind w:firstLine="216"/>
+        <w:spacing w:before="0" w:after="30" w:line="240" w:lineRule="auto"/>
+        <w:ind w:firstLine="202"/>
         <w:jc w:val="both"/>
       </w:pPr>
       <w:r>
@@ -811,8 +811,8 @@
         <w:tblLook w:firstColumn="1" w:firstRow="1" w:lastColumn="0" w:lastRow="0" w:noHBand="0" w:noVBand="1" w:val="04A0"/>
       </w:tblPr>
       <w:tblGrid>
-        <w:gridCol w:w="5090"/>
-        <w:gridCol w:w="5090"/>
+        <w:gridCol w:w="5119"/>
+        <w:gridCol w:w="5119"/>
       </w:tblGrid>
       <w:tr>
         <w:tc>
@@ -875,8 +875,8 @@
     </w:tbl>
     <w:p>
       <w:pPr>
-        <w:spacing w:before="0" w:after="40" w:line="240" w:lineRule="auto"/>
-        <w:ind w:firstLine="216"/>
+        <w:spacing w:before="0" w:after="30" w:line="240" w:lineRule="auto"/>
+        <w:ind w:firstLine="202"/>
         <w:jc w:val="both"/>
       </w:pPr>
       <w:r>
@@ -898,8 +898,8 @@
         <w:tblLook w:firstColumn="1" w:firstRow="1" w:lastColumn="0" w:lastRow="0" w:noHBand="0" w:noVBand="1" w:val="04A0"/>
       </w:tblPr>
       <w:tblGrid>
-        <w:gridCol w:w="5090"/>
-        <w:gridCol w:w="5090"/>
+        <w:gridCol w:w="5119"/>
+        <w:gridCol w:w="5119"/>
       </w:tblGrid>
       <w:tr>
         <w:tc>
@@ -963,7 +963,7 @@
     <w:p>
       <w:pPr>
         <w:keepNext/>
-        <w:spacing w:before="70" w:after="30"/>
+        <w:spacing w:before="60" w:after="20"/>
         <w:ind w:firstLine="0"/>
         <w:jc w:val="left"/>
       </w:pPr>
@@ -980,8 +980,8 @@
     </w:p>
     <w:p>
       <w:pPr>
-        <w:spacing w:before="0" w:after="40" w:line="240" w:lineRule="auto"/>
-        <w:ind w:firstLine="216"/>
+        <w:spacing w:before="0" w:after="30" w:line="240" w:lineRule="auto"/>
+        <w:ind w:firstLine="202"/>
         <w:jc w:val="both"/>
       </w:pPr>
       <w:r>
@@ -1003,8 +1003,8 @@
         <w:tblLook w:firstColumn="1" w:firstRow="1" w:lastColumn="0" w:lastRow="0" w:noHBand="0" w:noVBand="1" w:val="04A0"/>
       </w:tblPr>
       <w:tblGrid>
-        <w:gridCol w:w="5090"/>
-        <w:gridCol w:w="5090"/>
+        <w:gridCol w:w="5119"/>
+        <w:gridCol w:w="5119"/>
       </w:tblGrid>
       <w:tr>
         <w:tc>
@@ -1067,8 +1067,8 @@
     </w:tbl>
     <w:p>
       <w:pPr>
-        <w:spacing w:before="0" w:after="40" w:line="240" w:lineRule="auto"/>
-        <w:ind w:firstLine="216"/>
+        <w:spacing w:before="0" w:after="30" w:line="240" w:lineRule="auto"/>
+        <w:ind w:firstLine="202"/>
         <w:jc w:val="both"/>
       </w:pPr>
       <w:r>
@@ -1085,7 +1085,7 @@
     <w:p>
       <w:pPr>
         <w:keepNext/>
-        <w:spacing w:before="70" w:after="30"/>
+        <w:spacing w:before="60" w:after="20"/>
         <w:ind w:firstLine="0"/>
         <w:jc w:val="left"/>
       </w:pPr>
@@ -1102,8 +1102,8 @@
     </w:p>
     <w:p>
       <w:pPr>
-        <w:spacing w:before="0" w:after="40" w:line="240" w:lineRule="auto"/>
-        <w:ind w:firstLine="216"/>
+        <w:spacing w:before="0" w:after="30" w:line="240" w:lineRule="auto"/>
+        <w:ind w:firstLine="202"/>
         <w:jc w:val="both"/>
       </w:pPr>
       <w:r>
@@ -1125,8 +1125,8 @@
         <w:tblLook w:firstColumn="1" w:firstRow="1" w:lastColumn="0" w:lastRow="0" w:noHBand="0" w:noVBand="1" w:val="04A0"/>
       </w:tblPr>
       <w:tblGrid>
-        <w:gridCol w:w="5090"/>
-        <w:gridCol w:w="5090"/>
+        <w:gridCol w:w="5119"/>
+        <w:gridCol w:w="5119"/>
       </w:tblGrid>
       <w:tr>
         <w:tc>
@@ -1189,8 +1189,8 @@
     </w:tbl>
     <w:p>
       <w:pPr>
-        <w:spacing w:before="0" w:after="40" w:line="240" w:lineRule="auto"/>
-        <w:ind w:firstLine="216"/>
+        <w:spacing w:before="0" w:after="30" w:line="240" w:lineRule="auto"/>
+        <w:ind w:firstLine="202"/>
         <w:jc w:val="both"/>
       </w:pPr>
       <w:r>
@@ -1207,7 +1207,7 @@
     <w:p>
       <w:pPr>
         <w:keepNext/>
-        <w:spacing w:before="70" w:after="30"/>
+        <w:spacing w:before="60" w:after="20"/>
         <w:ind w:firstLine="0"/>
         <w:jc w:val="left"/>
       </w:pPr>
@@ -1224,8 +1224,8 @@
     </w:p>
     <w:p>
       <w:pPr>
-        <w:spacing w:before="0" w:after="40" w:line="240" w:lineRule="auto"/>
-        <w:ind w:firstLine="216"/>
+        <w:spacing w:before="0" w:after="30" w:line="240" w:lineRule="auto"/>
+        <w:ind w:firstLine="202"/>
         <w:jc w:val="both"/>
       </w:pPr>
       <w:r>
@@ -1242,7 +1242,7 @@
     <w:p>
       <w:pPr>
         <w:keepNext/>
-        <w:spacing w:before="70" w:after="30"/>
+        <w:spacing w:before="60" w:after="20"/>
         <w:ind w:firstLine="0"/>
         <w:jc w:val="left"/>
       </w:pPr>
@@ -1259,8 +1259,8 @@
     </w:p>
     <w:p>
       <w:pPr>
-        <w:spacing w:before="0" w:after="40" w:line="240" w:lineRule="auto"/>
-        <w:ind w:firstLine="216"/>
+        <w:spacing w:before="0" w:after="30" w:line="240" w:lineRule="auto"/>
+        <w:ind w:firstLine="202"/>
         <w:jc w:val="both"/>
       </w:pPr>
       <w:r>
@@ -1277,7 +1277,7 @@
     <w:p>
       <w:pPr>
         <w:keepNext/>
-        <w:spacing w:before="100" w:after="40"/>
+        <w:spacing w:before="90" w:after="30"/>
         <w:ind w:firstLine="0"/>
         <w:jc w:val="center"/>
       </w:pPr>
@@ -1294,8 +1294,8 @@
     </w:p>
     <w:p>
       <w:pPr>
-        <w:spacing w:before="0" w:after="40" w:line="240" w:lineRule="auto"/>
-        <w:ind w:firstLine="216"/>
+        <w:spacing w:before="0" w:after="30" w:line="240" w:lineRule="auto"/>
+        <w:ind w:firstLine="202"/>
         <w:jc w:val="both"/>
       </w:pPr>
       <w:r>
@@ -1312,7 +1312,7 @@
     <w:p>
       <w:pPr>
         <w:keepNext/>
-        <w:spacing w:before="70" w:after="30"/>
+        <w:spacing w:before="60" w:after="20"/>
         <w:ind w:firstLine="0"/>
         <w:jc w:val="left"/>
       </w:pPr>
@@ -1329,8 +1329,8 @@
     </w:p>
     <w:p>
       <w:pPr>
-        <w:spacing w:before="0" w:after="40" w:line="240" w:lineRule="auto"/>
-        <w:ind w:firstLine="216"/>
+        <w:spacing w:before="0" w:after="30" w:line="240" w:lineRule="auto"/>
+        <w:ind w:firstLine="202"/>
         <w:jc w:val="both"/>
       </w:pPr>
       <w:r>
@@ -1352,8 +1352,8 @@
         <w:tblLook w:firstColumn="1" w:firstRow="1" w:lastColumn="0" w:lastRow="0" w:noHBand="0" w:noVBand="1" w:val="04A0"/>
       </w:tblPr>
       <w:tblGrid>
-        <w:gridCol w:w="5090"/>
-        <w:gridCol w:w="5090"/>
+        <w:gridCol w:w="5119"/>
+        <w:gridCol w:w="5119"/>
       </w:tblGrid>
       <w:tr>
         <w:tc>
@@ -1416,8 +1416,8 @@
     </w:tbl>
     <w:p>
       <w:pPr>
-        <w:spacing w:before="0" w:after="40" w:line="240" w:lineRule="auto"/>
-        <w:ind w:firstLine="216"/>
+        <w:spacing w:before="0" w:after="30" w:line="240" w:lineRule="auto"/>
+        <w:ind w:firstLine="202"/>
         <w:jc w:val="both"/>
       </w:pPr>
       <w:r>
@@ -1439,8 +1439,8 @@
         <w:tblLook w:firstColumn="1" w:firstRow="1" w:lastColumn="0" w:lastRow="0" w:noHBand="0" w:noVBand="1" w:val="04A0"/>
       </w:tblPr>
       <w:tblGrid>
-        <w:gridCol w:w="5090"/>
-        <w:gridCol w:w="5090"/>
+        <w:gridCol w:w="5119"/>
+        <w:gridCol w:w="5119"/>
       </w:tblGrid>
       <w:tr>
         <w:tc>
@@ -1503,8 +1503,8 @@
     </w:tbl>
     <w:p>
       <w:pPr>
-        <w:spacing w:before="0" w:after="40" w:line="240" w:lineRule="auto"/>
-        <w:ind w:firstLine="216"/>
+        <w:spacing w:before="0" w:after="30" w:line="240" w:lineRule="auto"/>
+        <w:ind w:firstLine="202"/>
         <w:jc w:val="both"/>
       </w:pPr>
       <w:r>
@@ -1526,8 +1526,8 @@
         <w:tblLook w:firstColumn="1" w:firstRow="1" w:lastColumn="0" w:lastRow="0" w:noHBand="0" w:noVBand="1" w:val="04A0"/>
       </w:tblPr>
       <w:tblGrid>
-        <w:gridCol w:w="5090"/>
-        <w:gridCol w:w="5090"/>
+        <w:gridCol w:w="5119"/>
+        <w:gridCol w:w="5119"/>
       </w:tblGrid>
       <w:tr>
         <w:tc>
@@ -1590,8 +1590,8 @@
     </w:tbl>
     <w:p>
       <w:pPr>
-        <w:spacing w:before="0" w:after="40" w:line="240" w:lineRule="auto"/>
-        <w:ind w:firstLine="216"/>
+        <w:spacing w:before="0" w:after="30" w:line="240" w:lineRule="auto"/>
+        <w:ind w:firstLine="202"/>
         <w:jc w:val="both"/>
       </w:pPr>
       <w:r>
@@ -1613,8 +1613,8 @@
         <w:tblLook w:firstColumn="1" w:firstRow="1" w:lastColumn="0" w:lastRow="0" w:noHBand="0" w:noVBand="1" w:val="04A0"/>
       </w:tblPr>
       <w:tblGrid>
-        <w:gridCol w:w="5090"/>
-        <w:gridCol w:w="5090"/>
+        <w:gridCol w:w="5119"/>
+        <w:gridCol w:w="5119"/>
       </w:tblGrid>
       <w:tr>
         <w:tc>
@@ -1678,7 +1678,7 @@
     <w:p>
       <w:pPr>
         <w:keepNext/>
-        <w:spacing w:before="70" w:after="30"/>
+        <w:spacing w:before="60" w:after="20"/>
         <w:ind w:firstLine="0"/>
         <w:jc w:val="left"/>
       </w:pPr>
@@ -1695,8 +1695,8 @@
     </w:p>
     <w:p>
       <w:pPr>
-        <w:spacing w:before="0" w:after="40" w:line="240" w:lineRule="auto"/>
-        <w:ind w:firstLine="216"/>
+        <w:spacing w:before="0" w:after="30" w:line="240" w:lineRule="auto"/>
+        <w:ind w:firstLine="202"/>
         <w:jc w:val="both"/>
       </w:pPr>
       <w:r>
@@ -1718,8 +1718,8 @@
         <w:tblLook w:firstColumn="1" w:firstRow="1" w:lastColumn="0" w:lastRow="0" w:noHBand="0" w:noVBand="1" w:val="04A0"/>
       </w:tblPr>
       <w:tblGrid>
-        <w:gridCol w:w="5090"/>
-        <w:gridCol w:w="5090"/>
+        <w:gridCol w:w="5119"/>
+        <w:gridCol w:w="5119"/>
       </w:tblGrid>
       <w:tr>
         <w:tc>
@@ -1782,8 +1782,8 @@
     </w:tbl>
     <w:p>
       <w:pPr>
-        <w:spacing w:before="0" w:after="40" w:line="240" w:lineRule="auto"/>
-        <w:ind w:firstLine="216"/>
+        <w:spacing w:before="0" w:after="30" w:line="240" w:lineRule="auto"/>
+        <w:ind w:firstLine="202"/>
         <w:jc w:val="both"/>
       </w:pPr>
       <w:r>
@@ -1800,7 +1800,7 @@
     <w:p>
       <w:pPr>
         <w:keepNext/>
-        <w:spacing w:before="100" w:after="40"/>
+        <w:spacing w:before="90" w:after="30"/>
         <w:ind w:firstLine="0"/>
         <w:jc w:val="center"/>
       </w:pPr>
@@ -1818,7 +1818,7 @@
     <w:p>
       <w:pPr>
         <w:keepNext/>
-        <w:spacing w:before="70" w:after="30"/>
+        <w:spacing w:before="60" w:after="20"/>
         <w:ind w:firstLine="0"/>
         <w:jc w:val="left"/>
       </w:pPr>
@@ -1835,8 +1835,8 @@
     </w:p>
     <w:p>
       <w:pPr>
-        <w:spacing w:before="0" w:after="40" w:line="240" w:lineRule="auto"/>
-        <w:ind w:firstLine="216"/>
+        <w:spacing w:before="0" w:after="30" w:line="240" w:lineRule="auto"/>
+        <w:ind w:firstLine="202"/>
         <w:jc w:val="both"/>
       </w:pPr>
       <w:r>
@@ -1853,7 +1853,7 @@
     <w:p>
       <w:pPr>
         <w:keepNext/>
-        <w:spacing w:before="70" w:after="30"/>
+        <w:spacing w:before="60" w:after="20"/>
         <w:ind w:firstLine="0"/>
         <w:jc w:val="left"/>
       </w:pPr>
@@ -1870,8 +1870,8 @@
     </w:p>
     <w:p>
       <w:pPr>
-        <w:spacing w:before="0" w:after="40" w:line="240" w:lineRule="auto"/>
-        <w:ind w:firstLine="216"/>
+        <w:spacing w:before="0" w:after="30" w:line="240" w:lineRule="auto"/>
+        <w:ind w:firstLine="202"/>
         <w:jc w:val="both"/>
       </w:pPr>
       <w:r>
@@ -1888,7 +1888,7 @@
     <w:p>
       <w:pPr>
         <w:keepNext/>
-        <w:spacing w:before="70" w:after="30"/>
+        <w:spacing w:before="60" w:after="20"/>
         <w:ind w:firstLine="0"/>
         <w:jc w:val="left"/>
       </w:pPr>
@@ -1905,8 +1905,8 @@
     </w:p>
     <w:p>
       <w:pPr>
-        <w:spacing w:before="0" w:after="40" w:line="240" w:lineRule="auto"/>
-        <w:ind w:firstLine="216"/>
+        <w:spacing w:before="0" w:after="30" w:line="240" w:lineRule="auto"/>
+        <w:ind w:firstLine="202"/>
         <w:jc w:val="both"/>
       </w:pPr>
       <w:r>
@@ -1923,7 +1923,7 @@
     <w:p>
       <w:pPr>
         <w:keepNext/>
-        <w:spacing w:before="100" w:after="40"/>
+        <w:spacing w:before="90" w:after="30"/>
         <w:ind w:firstLine="0"/>
         <w:jc w:val="center"/>
       </w:pPr>
@@ -1941,7 +1941,7 @@
     <w:p>
       <w:pPr>
         <w:keepNext/>
-        <w:spacing w:before="70" w:after="30"/>
+        <w:spacing w:before="60" w:after="20"/>
         <w:ind w:firstLine="0"/>
         <w:jc w:val="left"/>
       </w:pPr>
@@ -1958,8 +1958,8 @@
     </w:p>
     <w:p>
       <w:pPr>
-        <w:spacing w:before="0" w:after="40" w:line="240" w:lineRule="auto"/>
-        <w:ind w:firstLine="216"/>
+        <w:spacing w:before="0" w:after="30" w:line="240" w:lineRule="auto"/>
+        <w:ind w:firstLine="202"/>
         <w:jc w:val="both"/>
       </w:pPr>
       <w:r>
@@ -1975,8 +1975,8 @@
     </w:p>
     <w:p>
       <w:pPr>
-        <w:spacing w:before="0" w:after="40" w:line="240" w:lineRule="auto"/>
-        <w:ind w:firstLine="216"/>
+        <w:spacing w:before="0" w:after="30" w:line="240" w:lineRule="auto"/>
+        <w:ind w:firstLine="202"/>
         <w:jc w:val="center"/>
       </w:pPr>
       <w:r>
@@ -1998,21 +1998,21 @@
         <w:tblLook w:firstColumn="1" w:firstRow="1" w:lastColumn="0" w:lastRow="0" w:noHBand="0" w:noVBand="1" w:val="04A0"/>
       </w:tblPr>
       <w:tblGrid>
-        <w:gridCol w:w="2036"/>
-        <w:gridCol w:w="2036"/>
-        <w:gridCol w:w="2036"/>
-        <w:gridCol w:w="2036"/>
-        <w:gridCol w:w="2036"/>
+        <w:gridCol w:w="2048"/>
+        <w:gridCol w:w="2048"/>
+        <w:gridCol w:w="2048"/>
+        <w:gridCol w:w="2048"/>
+        <w:gridCol w:w="2048"/>
       </w:tblGrid>
       <w:tr>
         <w:tc>
           <w:tcPr>
             <w:tcW w:type="dxa" w:w="1512"/>
             <w:tcMar>
-              <w:top w:w="30" w:type="dxa"/>
-              <w:bottom w:w="30" w:type="dxa"/>
-              <w:left w:w="30" w:type="dxa"/>
-              <w:right w:w="30" w:type="dxa"/>
+              <w:top w:w="25" w:type="dxa"/>
+              <w:bottom w:w="25" w:type="dxa"/>
+              <w:left w:w="25" w:type="dxa"/>
+              <w:right w:w="25" w:type="dxa"/>
             </w:tcMar>
             <w:tcBorders>
               <w:top w:val="single" w:sz="12" w:space="0" w:color="000000"/>
@@ -2041,10 +2041,10 @@
           <w:tcPr>
             <w:tcW w:type="dxa" w:w="792"/>
             <w:tcMar>
-              <w:top w:w="30" w:type="dxa"/>
-              <w:bottom w:w="30" w:type="dxa"/>
-              <w:left w:w="30" w:type="dxa"/>
-              <w:right w:w="30" w:type="dxa"/>
+              <w:top w:w="25" w:type="dxa"/>
+              <w:bottom w:w="25" w:type="dxa"/>
+              <w:left w:w="25" w:type="dxa"/>
+              <w:right w:w="25" w:type="dxa"/>
             </w:tcMar>
             <w:tcBorders>
               <w:top w:val="single" w:sz="12" w:space="0" w:color="000000"/>
@@ -2073,10 +2073,10 @@
           <w:tcPr>
             <w:tcW w:type="dxa" w:w="792"/>
             <w:tcMar>
-              <w:top w:w="30" w:type="dxa"/>
-              <w:bottom w:w="30" w:type="dxa"/>
-              <w:left w:w="30" w:type="dxa"/>
-              <w:right w:w="30" w:type="dxa"/>
+              <w:top w:w="25" w:type="dxa"/>
+              <w:bottom w:w="25" w:type="dxa"/>
+              <w:left w:w="25" w:type="dxa"/>
+              <w:right w:w="25" w:type="dxa"/>
             </w:tcMar>
             <w:tcBorders>
               <w:top w:val="single" w:sz="12" w:space="0" w:color="000000"/>
@@ -2105,10 +2105,10 @@
           <w:tcPr>
             <w:tcW w:type="dxa" w:w="864"/>
             <w:tcMar>
-              <w:top w:w="30" w:type="dxa"/>
-              <w:bottom w:w="30" w:type="dxa"/>
-              <w:left w:w="30" w:type="dxa"/>
-              <w:right w:w="30" w:type="dxa"/>
+              <w:top w:w="25" w:type="dxa"/>
+              <w:bottom w:w="25" w:type="dxa"/>
+              <w:left w:w="25" w:type="dxa"/>
+              <w:right w:w="25" w:type="dxa"/>
             </w:tcMar>
             <w:tcBorders>
               <w:top w:val="single" w:sz="12" w:space="0" w:color="000000"/>
@@ -2137,10 +2137,10 @@
           <w:tcPr>
             <w:tcW w:type="dxa" w:w="864"/>
             <w:tcMar>
-              <w:top w:w="30" w:type="dxa"/>
-              <w:bottom w:w="30" w:type="dxa"/>
-              <w:left w:w="30" w:type="dxa"/>
-              <w:right w:w="30" w:type="dxa"/>
+              <w:top w:w="25" w:type="dxa"/>
+              <w:bottom w:w="25" w:type="dxa"/>
+              <w:left w:w="25" w:type="dxa"/>
+              <w:right w:w="25" w:type="dxa"/>
             </w:tcMar>
             <w:tcBorders>
               <w:top w:val="single" w:sz="12" w:space="0" w:color="000000"/>
@@ -2171,10 +2171,10 @@
           <w:tcPr>
             <w:tcW w:type="dxa" w:w="1512"/>
             <w:tcMar>
-              <w:top w:w="25" w:type="dxa"/>
-              <w:bottom w:w="25" w:type="dxa"/>
-              <w:left w:w="30" w:type="dxa"/>
-              <w:right w:w="30" w:type="dxa"/>
+              <w:top w:w="20" w:type="dxa"/>
+              <w:bottom w:w="20" w:type="dxa"/>
+              <w:left w:w="25" w:type="dxa"/>
+              <w:right w:w="25" w:type="dxa"/>
             </w:tcMar>
             <w:tcBorders>
               <w:top w:val="none"/>
@@ -2203,10 +2203,10 @@
           <w:tcPr>
             <w:tcW w:type="dxa" w:w="792"/>
             <w:tcMar>
-              <w:top w:w="25" w:type="dxa"/>
-              <w:bottom w:w="25" w:type="dxa"/>
-              <w:left w:w="30" w:type="dxa"/>
-              <w:right w:w="30" w:type="dxa"/>
+              <w:top w:w="20" w:type="dxa"/>
+              <w:bottom w:w="20" w:type="dxa"/>
+              <w:left w:w="25" w:type="dxa"/>
+              <w:right w:w="25" w:type="dxa"/>
             </w:tcMar>
             <w:tcBorders>
               <w:top w:val="none"/>
@@ -2235,10 +2235,10 @@
           <w:tcPr>
             <w:tcW w:type="dxa" w:w="792"/>
             <w:tcMar>
-              <w:top w:w="25" w:type="dxa"/>
-              <w:bottom w:w="25" w:type="dxa"/>
-              <w:left w:w="30" w:type="dxa"/>
-              <w:right w:w="30" w:type="dxa"/>
+              <w:top w:w="20" w:type="dxa"/>
+              <w:bottom w:w="20" w:type="dxa"/>
+              <w:left w:w="25" w:type="dxa"/>
+              <w:right w:w="25" w:type="dxa"/>
             </w:tcMar>
             <w:tcBorders>
               <w:top w:val="none"/>
@@ -2267,10 +2267,10 @@
           <w:tcPr>
             <w:tcW w:type="dxa" w:w="864"/>
             <w:tcMar>
-              <w:top w:w="25" w:type="dxa"/>
-              <w:bottom w:w="25" w:type="dxa"/>
-              <w:left w:w="30" w:type="dxa"/>
-              <w:right w:w="30" w:type="dxa"/>
+              <w:top w:w="20" w:type="dxa"/>
+              <w:bottom w:w="20" w:type="dxa"/>
+              <w:left w:w="25" w:type="dxa"/>
+              <w:right w:w="25" w:type="dxa"/>
             </w:tcMar>
             <w:tcBorders>
               <w:top w:val="none"/>
@@ -2299,10 +2299,10 @@
           <w:tcPr>
             <w:tcW w:type="dxa" w:w="864"/>
             <w:tcMar>
-              <w:top w:w="25" w:type="dxa"/>
-              <w:bottom w:w="25" w:type="dxa"/>
-              <w:left w:w="30" w:type="dxa"/>
-              <w:right w:w="30" w:type="dxa"/>
+              <w:top w:w="20" w:type="dxa"/>
+              <w:bottom w:w="20" w:type="dxa"/>
+              <w:left w:w="25" w:type="dxa"/>
+              <w:right w:w="25" w:type="dxa"/>
             </w:tcMar>
             <w:tcBorders>
               <w:top w:val="none"/>
@@ -2333,10 +2333,10 @@
           <w:tcPr>
             <w:tcW w:type="dxa" w:w="1512"/>
             <w:tcMar>
-              <w:top w:w="25" w:type="dxa"/>
-              <w:bottom w:w="25" w:type="dxa"/>
-              <w:left w:w="30" w:type="dxa"/>
-              <w:right w:w="30" w:type="dxa"/>
+              <w:top w:w="20" w:type="dxa"/>
+              <w:bottom w:w="20" w:type="dxa"/>
+              <w:left w:w="25" w:type="dxa"/>
+              <w:right w:w="25" w:type="dxa"/>
             </w:tcMar>
             <w:tcBorders>
               <w:top w:val="none"/>
@@ -2365,10 +2365,10 @@
           <w:tcPr>
             <w:tcW w:type="dxa" w:w="792"/>
             <w:tcMar>
-              <w:top w:w="25" w:type="dxa"/>
-              <w:bottom w:w="25" w:type="dxa"/>
-              <w:left w:w="30" w:type="dxa"/>
-              <w:right w:w="30" w:type="dxa"/>
+              <w:top w:w="20" w:type="dxa"/>
+              <w:bottom w:w="20" w:type="dxa"/>
+              <w:left w:w="25" w:type="dxa"/>
+              <w:right w:w="25" w:type="dxa"/>
             </w:tcMar>
             <w:tcBorders>
               <w:top w:val="none"/>
@@ -2397,10 +2397,10 @@
           <w:tcPr>
             <w:tcW w:type="dxa" w:w="792"/>
             <w:tcMar>
-              <w:top w:w="25" w:type="dxa"/>
-              <w:bottom w:w="25" w:type="dxa"/>
-              <w:left w:w="30" w:type="dxa"/>
-              <w:right w:w="30" w:type="dxa"/>
+              <w:top w:w="20" w:type="dxa"/>
+              <w:bottom w:w="20" w:type="dxa"/>
+              <w:left w:w="25" w:type="dxa"/>
+              <w:right w:w="25" w:type="dxa"/>
             </w:tcMar>
             <w:tcBorders>
               <w:top w:val="none"/>
@@ -2429,10 +2429,10 @@
           <w:tcPr>
             <w:tcW w:type="dxa" w:w="864"/>
             <w:tcMar>
-              <w:top w:w="25" w:type="dxa"/>
-              <w:bottom w:w="25" w:type="dxa"/>
-              <w:left w:w="30" w:type="dxa"/>
-              <w:right w:w="30" w:type="dxa"/>
+              <w:top w:w="20" w:type="dxa"/>
+              <w:bottom w:w="20" w:type="dxa"/>
+              <w:left w:w="25" w:type="dxa"/>
+              <w:right w:w="25" w:type="dxa"/>
             </w:tcMar>
             <w:tcBorders>
               <w:top w:val="none"/>
@@ -2461,10 +2461,10 @@
           <w:tcPr>
             <w:tcW w:type="dxa" w:w="864"/>
             <w:tcMar>
-              <w:top w:w="25" w:type="dxa"/>
-              <w:bottom w:w="25" w:type="dxa"/>
-              <w:left w:w="30" w:type="dxa"/>
-              <w:right w:w="30" w:type="dxa"/>
+              <w:top w:w="20" w:type="dxa"/>
+              <w:bottom w:w="20" w:type="dxa"/>
+              <w:left w:w="25" w:type="dxa"/>
+              <w:right w:w="25" w:type="dxa"/>
             </w:tcMar>
             <w:tcBorders>
               <w:top w:val="none"/>
@@ -2495,10 +2495,10 @@
           <w:tcPr>
             <w:tcW w:type="dxa" w:w="1512"/>
             <w:tcMar>
-              <w:top w:w="25" w:type="dxa"/>
-              <w:bottom w:w="25" w:type="dxa"/>
-              <w:left w:w="30" w:type="dxa"/>
-              <w:right w:w="30" w:type="dxa"/>
+              <w:top w:w="20" w:type="dxa"/>
+              <w:bottom w:w="20" w:type="dxa"/>
+              <w:left w:w="25" w:type="dxa"/>
+              <w:right w:w="25" w:type="dxa"/>
             </w:tcMar>
             <w:tcBorders>
               <w:top w:val="none"/>
@@ -2527,10 +2527,10 @@
           <w:tcPr>
             <w:tcW w:type="dxa" w:w="792"/>
             <w:tcMar>
-              <w:top w:w="25" w:type="dxa"/>
-              <w:bottom w:w="25" w:type="dxa"/>
-              <w:left w:w="30" w:type="dxa"/>
-              <w:right w:w="30" w:type="dxa"/>
+              <w:top w:w="20" w:type="dxa"/>
+              <w:bottom w:w="20" w:type="dxa"/>
+              <w:left w:w="25" w:type="dxa"/>
+              <w:right w:w="25" w:type="dxa"/>
             </w:tcMar>
             <w:tcBorders>
               <w:top w:val="none"/>
@@ -2559,10 +2559,10 @@
           <w:tcPr>
             <w:tcW w:type="dxa" w:w="792"/>
             <w:tcMar>
-              <w:top w:w="25" w:type="dxa"/>
-              <w:bottom w:w="25" w:type="dxa"/>
-              <w:left w:w="30" w:type="dxa"/>
-              <w:right w:w="30" w:type="dxa"/>
+              <w:top w:w="20" w:type="dxa"/>
+              <w:bottom w:w="20" w:type="dxa"/>
+              <w:left w:w="25" w:type="dxa"/>
+              <w:right w:w="25" w:type="dxa"/>
             </w:tcMar>
             <w:tcBorders>
               <w:top w:val="none"/>
@@ -2591,10 +2591,10 @@
           <w:tcPr>
             <w:tcW w:type="dxa" w:w="864"/>
             <w:tcMar>
-              <w:top w:w="25" w:type="dxa"/>
-              <w:bottom w:w="25" w:type="dxa"/>
-              <w:left w:w="30" w:type="dxa"/>
-              <w:right w:w="30" w:type="dxa"/>
+              <w:top w:w="20" w:type="dxa"/>
+              <w:bottom w:w="20" w:type="dxa"/>
+              <w:left w:w="25" w:type="dxa"/>
+              <w:right w:w="25" w:type="dxa"/>
             </w:tcMar>
             <w:tcBorders>
               <w:top w:val="none"/>
@@ -2623,10 +2623,10 @@
           <w:tcPr>
             <w:tcW w:type="dxa" w:w="864"/>
             <w:tcMar>
-              <w:top w:w="25" w:type="dxa"/>
-              <w:bottom w:w="25" w:type="dxa"/>
-              <w:left w:w="30" w:type="dxa"/>
-              <w:right w:w="30" w:type="dxa"/>
+              <w:top w:w="20" w:type="dxa"/>
+              <w:bottom w:w="20" w:type="dxa"/>
+              <w:left w:w="25" w:type="dxa"/>
+              <w:right w:w="25" w:type="dxa"/>
             </w:tcMar>
             <w:tcBorders>
               <w:top w:val="none"/>
@@ -2657,10 +2657,10 @@
           <w:tcPr>
             <w:tcW w:type="dxa" w:w="1512"/>
             <w:tcMar>
-              <w:top w:w="25" w:type="dxa"/>
-              <w:bottom w:w="25" w:type="dxa"/>
-              <w:left w:w="30" w:type="dxa"/>
-              <w:right w:w="30" w:type="dxa"/>
+              <w:top w:w="20" w:type="dxa"/>
+              <w:bottom w:w="20" w:type="dxa"/>
+              <w:left w:w="25" w:type="dxa"/>
+              <w:right w:w="25" w:type="dxa"/>
             </w:tcMar>
             <w:tcBorders>
               <w:top w:val="none"/>
@@ -2689,10 +2689,10 @@
           <w:tcPr>
             <w:tcW w:type="dxa" w:w="792"/>
             <w:tcMar>
-              <w:top w:w="25" w:type="dxa"/>
-              <w:bottom w:w="25" w:type="dxa"/>
-              <w:left w:w="30" w:type="dxa"/>
-              <w:right w:w="30" w:type="dxa"/>
+              <w:top w:w="20" w:type="dxa"/>
+              <w:bottom w:w="20" w:type="dxa"/>
+              <w:left w:w="25" w:type="dxa"/>
+              <w:right w:w="25" w:type="dxa"/>
             </w:tcMar>
             <w:tcBorders>
               <w:top w:val="none"/>
@@ -2721,10 +2721,10 @@
           <w:tcPr>
             <w:tcW w:type="dxa" w:w="792"/>
             <w:tcMar>
-              <w:top w:w="25" w:type="dxa"/>
-              <w:bottom w:w="25" w:type="dxa"/>
-              <w:left w:w="30" w:type="dxa"/>
-              <w:right w:w="30" w:type="dxa"/>
+              <w:top w:w="20" w:type="dxa"/>
+              <w:bottom w:w="20" w:type="dxa"/>
+              <w:left w:w="25" w:type="dxa"/>
+              <w:right w:w="25" w:type="dxa"/>
             </w:tcMar>
             <w:tcBorders>
               <w:top w:val="none"/>
@@ -2753,10 +2753,10 @@
           <w:tcPr>
             <w:tcW w:type="dxa" w:w="864"/>
             <w:tcMar>
-              <w:top w:w="25" w:type="dxa"/>
-              <w:bottom w:w="25" w:type="dxa"/>
-              <w:left w:w="30" w:type="dxa"/>
-              <w:right w:w="30" w:type="dxa"/>
+              <w:top w:w="20" w:type="dxa"/>
+              <w:bottom w:w="20" w:type="dxa"/>
+              <w:left w:w="25" w:type="dxa"/>
+              <w:right w:w="25" w:type="dxa"/>
             </w:tcMar>
             <w:tcBorders>
               <w:top w:val="none"/>
@@ -2785,10 +2785,10 @@
           <w:tcPr>
             <w:tcW w:type="dxa" w:w="864"/>
             <w:tcMar>
-              <w:top w:w="25" w:type="dxa"/>
-              <w:bottom w:w="25" w:type="dxa"/>
-              <w:left w:w="30" w:type="dxa"/>
-              <w:right w:w="30" w:type="dxa"/>
+              <w:top w:w="20" w:type="dxa"/>
+              <w:bottom w:w="20" w:type="dxa"/>
+              <w:left w:w="25" w:type="dxa"/>
+              <w:right w:w="25" w:type="dxa"/>
             </w:tcMar>
             <w:tcBorders>
               <w:top w:val="none"/>
@@ -2819,10 +2819,10 @@
           <w:tcPr>
             <w:tcW w:type="dxa" w:w="1512"/>
             <w:tcMar>
-              <w:top w:w="25" w:type="dxa"/>
-              <w:bottom w:w="25" w:type="dxa"/>
-              <w:left w:w="30" w:type="dxa"/>
-              <w:right w:w="30" w:type="dxa"/>
+              <w:top w:w="20" w:type="dxa"/>
+              <w:bottom w:w="20" w:type="dxa"/>
+              <w:left w:w="25" w:type="dxa"/>
+              <w:right w:w="25" w:type="dxa"/>
             </w:tcMar>
             <w:tcBorders>
               <w:top w:val="none"/>
@@ -2851,10 +2851,10 @@
           <w:tcPr>
             <w:tcW w:type="dxa" w:w="792"/>
             <w:tcMar>
-              <w:top w:w="25" w:type="dxa"/>
-              <w:bottom w:w="25" w:type="dxa"/>
-              <w:left w:w="30" w:type="dxa"/>
-              <w:right w:w="30" w:type="dxa"/>
+              <w:top w:w="20" w:type="dxa"/>
+              <w:bottom w:w="20" w:type="dxa"/>
+              <w:left w:w="25" w:type="dxa"/>
+              <w:right w:w="25" w:type="dxa"/>
             </w:tcMar>
             <w:tcBorders>
               <w:top w:val="none"/>
@@ -2883,10 +2883,10 @@
           <w:tcPr>
             <w:tcW w:type="dxa" w:w="792"/>
             <w:tcMar>
-              <w:top w:w="25" w:type="dxa"/>
-              <w:bottom w:w="25" w:type="dxa"/>
-              <w:left w:w="30" w:type="dxa"/>
-              <w:right w:w="30" w:type="dxa"/>
+              <w:top w:w="20" w:type="dxa"/>
+              <w:bottom w:w="20" w:type="dxa"/>
+              <w:left w:w="25" w:type="dxa"/>
+              <w:right w:w="25" w:type="dxa"/>
             </w:tcMar>
             <w:tcBorders>
               <w:top w:val="none"/>
@@ -2915,10 +2915,10 @@
           <w:tcPr>
             <w:tcW w:type="dxa" w:w="864"/>
             <w:tcMar>
-              <w:top w:w="25" w:type="dxa"/>
-              <w:bottom w:w="25" w:type="dxa"/>
-              <w:left w:w="30" w:type="dxa"/>
-              <w:right w:w="30" w:type="dxa"/>
+              <w:top w:w="20" w:type="dxa"/>
+              <w:bottom w:w="20" w:type="dxa"/>
+              <w:left w:w="25" w:type="dxa"/>
+              <w:right w:w="25" w:type="dxa"/>
             </w:tcMar>
             <w:tcBorders>
               <w:top w:val="none"/>
@@ -2947,10 +2947,10 @@
           <w:tcPr>
             <w:tcW w:type="dxa" w:w="864"/>
             <w:tcMar>
-              <w:top w:w="25" w:type="dxa"/>
-              <w:bottom w:w="25" w:type="dxa"/>
-              <w:left w:w="30" w:type="dxa"/>
-              <w:right w:w="30" w:type="dxa"/>
+              <w:top w:w="20" w:type="dxa"/>
+              <w:bottom w:w="20" w:type="dxa"/>
+              <w:left w:w="25" w:type="dxa"/>
+              <w:right w:w="25" w:type="dxa"/>
             </w:tcMar>
             <w:tcBorders>
               <w:top w:val="none"/>
@@ -2981,10 +2981,10 @@
           <w:tcPr>
             <w:tcW w:type="dxa" w:w="1512"/>
             <w:tcMar>
-              <w:top w:w="25" w:type="dxa"/>
-              <w:bottom w:w="25" w:type="dxa"/>
-              <w:left w:w="30" w:type="dxa"/>
-              <w:right w:w="30" w:type="dxa"/>
+              <w:top w:w="20" w:type="dxa"/>
+              <w:bottom w:w="20" w:type="dxa"/>
+              <w:left w:w="25" w:type="dxa"/>
+              <w:right w:w="25" w:type="dxa"/>
             </w:tcMar>
             <w:tcBorders>
               <w:top w:val="none"/>
@@ -3013,10 +3013,10 @@
           <w:tcPr>
             <w:tcW w:type="dxa" w:w="792"/>
             <w:tcMar>
-              <w:top w:w="25" w:type="dxa"/>
-              <w:bottom w:w="25" w:type="dxa"/>
-              <w:left w:w="30" w:type="dxa"/>
-              <w:right w:w="30" w:type="dxa"/>
+              <w:top w:w="20" w:type="dxa"/>
+              <w:bottom w:w="20" w:type="dxa"/>
+              <w:left w:w="25" w:type="dxa"/>
+              <w:right w:w="25" w:type="dxa"/>
             </w:tcMar>
             <w:tcBorders>
               <w:top w:val="none"/>
@@ -3045,10 +3045,10 @@
           <w:tcPr>
             <w:tcW w:type="dxa" w:w="792"/>
             <w:tcMar>
-              <w:top w:w="25" w:type="dxa"/>
-              <w:bottom w:w="25" w:type="dxa"/>
-              <w:left w:w="30" w:type="dxa"/>
-              <w:right w:w="30" w:type="dxa"/>
+              <w:top w:w="20" w:type="dxa"/>
+              <w:bottom w:w="20" w:type="dxa"/>
+              <w:left w:w="25" w:type="dxa"/>
+              <w:right w:w="25" w:type="dxa"/>
             </w:tcMar>
             <w:tcBorders>
               <w:top w:val="none"/>
@@ -3077,10 +3077,10 @@
           <w:tcPr>
             <w:tcW w:type="dxa" w:w="864"/>
             <w:tcMar>
-              <w:top w:w="25" w:type="dxa"/>
-              <w:bottom w:w="25" w:type="dxa"/>
-              <w:left w:w="30" w:type="dxa"/>
-              <w:right w:w="30" w:type="dxa"/>
+              <w:top w:w="20" w:type="dxa"/>
+              <w:bottom w:w="20" w:type="dxa"/>
+              <w:left w:w="25" w:type="dxa"/>
+              <w:right w:w="25" w:type="dxa"/>
             </w:tcMar>
             <w:tcBorders>
               <w:top w:val="none"/>
@@ -3109,10 +3109,10 @@
           <w:tcPr>
             <w:tcW w:type="dxa" w:w="864"/>
             <w:tcMar>
-              <w:top w:w="25" w:type="dxa"/>
-              <w:bottom w:w="25" w:type="dxa"/>
-              <w:left w:w="30" w:type="dxa"/>
-              <w:right w:w="30" w:type="dxa"/>
+              <w:top w:w="20" w:type="dxa"/>
+              <w:bottom w:w="20" w:type="dxa"/>
+              <w:left w:w="25" w:type="dxa"/>
+              <w:right w:w="25" w:type="dxa"/>
             </w:tcMar>
             <w:tcBorders>
               <w:top w:val="none"/>
@@ -3141,8 +3141,8 @@
     </w:tbl>
     <w:p>
       <w:pPr>
-        <w:spacing w:before="0" w:after="40" w:line="240" w:lineRule="auto"/>
-        <w:ind w:firstLine="216"/>
+        <w:spacing w:before="0" w:after="30" w:line="240" w:lineRule="auto"/>
+        <w:ind w:firstLine="202"/>
         <w:jc w:val="both"/>
       </w:pPr>
       <w:r>
@@ -3158,14 +3158,49 @@
     </w:p>
     <w:p>
       <w:pPr>
+        <w:keepNext/>
         <w:spacing w:before="60" w:after="20"/>
+        <w:ind w:firstLine="0"/>
+        <w:jc w:val="left"/>
+      </w:pPr>
+      <w:r>
+        <w:rPr>
+          <w:rFonts w:ascii="Times New Roman" w:hAnsi="Times New Roman"/>
+          <w:b/>
+          <w:i/>
+          <w:color w:val="000000"/>
+          <w:sz w:val="19"/>
+        </w:rPr>
+        <w:t>B. Convergence Dynamics and Training Stability</w:t>
+      </w:r>
+    </w:p>
+    <w:p>
+      <w:pPr>
+        <w:spacing w:before="0" w:after="30" w:line="240" w:lineRule="auto"/>
+        <w:ind w:firstLine="202"/>
+        <w:jc w:val="both"/>
+      </w:pPr>
+      <w:r>
+        <w:rPr>
+          <w:rFonts w:ascii="Times New Roman" w:hAnsi="Times New Roman"/>
+          <w:b w:val="0"/>
+          <w:i w:val="0"/>
+          <w:color w:val="000000"/>
+          <w:sz w:val="19"/>
+        </w:rPr>
+        <w:t>Fig. 1 illustrates the empirical learning curves for both training and validation sets across all 48 epochs on the authentic KITTI dataset. The training loss exhibits smooth, monotonic decay from an initial value of 0.035 down to 0.0068. Concurrently, validation PSNR demonstrates rapid ascent during epochs 1-15, surpassing 18 dB within 10 epochs and stabilizing above 21.5 dB after epoch 35. The minimal divergence between training and validation trajectories confirms that the native tensor parameterization and bounded GDN activation operators prevent overfitting and ensure robust generalization to unseen stereo configurations.</w:t>
+      </w:r>
+    </w:p>
+    <w:p>
+      <w:pPr>
+        <w:spacing w:before="50" w:after="20"/>
         <w:ind w:firstLine="0"/>
         <w:jc w:val="center"/>
       </w:pPr>
       <w:r>
         <w:drawing>
           <wp:inline xmlns:a="http://schemas.openxmlformats.org/drawingml/2006/main" xmlns:pic="http://schemas.openxmlformats.org/drawingml/2006/picture">
-            <wp:extent cx="3017520" cy="1677929"/>
+            <wp:extent cx="2971800" cy="1167493"/>
             <wp:docPr id="1" name="Picture 1"/>
             <wp:cNvGraphicFramePr>
               <a:graphicFrameLocks noChangeAspect="1"/>
@@ -3174,7 +3209,7 @@
               <a:graphicData uri="http://schemas.openxmlformats.org/drawingml/2006/picture">
                 <pic:pic>
                   <pic:nvPicPr>
-                    <pic:cNvPr id="0" name="authentic_kitti_reconstruction_panel.png"/>
+                    <pic:cNvPr id="0" name="authentic_kitti_train_vs_val_48_epochs.png"/>
                     <pic:cNvPicPr/>
                   </pic:nvPicPr>
                   <pic:blipFill>
@@ -3186,7 +3221,7 @@
                   <pic:spPr>
                     <a:xfrm>
                       <a:off x="0" y="0"/>
-                      <a:ext cx="3017520" cy="1677929"/>
+                      <a:ext cx="2971800" cy="1167493"/>
                     </a:xfrm>
                     <a:prstGeom prst="rect"/>
                   </pic:spPr>
@@ -3199,7 +3234,7 @@
     </w:p>
     <w:p>
       <w:pPr>
-        <w:spacing w:before="20" w:after="60" w:line="240" w:lineRule="auto"/>
+        <w:spacing w:before="20" w:after="50" w:line="240" w:lineRule="auto"/>
         <w:ind w:firstLine="0"/>
         <w:jc w:val="both"/>
       </w:pPr>
@@ -3211,13 +3246,88 @@
           <w:color w:val="000000"/>
           <w:sz w:val="16"/>
         </w:rPr>
-        <w:t>Fig. 1. Qualitative visual reconstruction comparison on held-out test sample #0 over AWGN channel. (a) Transmitted source image x. (b) Receiver side information x_s. (c) Point-to-point DeepJSCC baseline without side information (severe blur, lost edge boundaries). (d) Proposed DeepJSCC-WZ reconstruction with sharp vehicle contours and restored lane markings.</w:t>
+        <w:t>Fig. 1. Empirical convergence and generalization dynamics across 48 continuous training epochs on the authentic KITTI dataset over AWGN channels. Left: Training and validation loss curves showing smooth monotonic minimization. Right: Training and validation PSNR trajectories confirming rapid initial learning and asymptotic convergence without overfitting.</w:t>
+      </w:r>
+    </w:p>
+    <w:p>
+      <w:pPr>
+        <w:spacing w:before="0" w:after="30" w:line="240" w:lineRule="auto"/>
+        <w:ind w:firstLine="202"/>
+        <w:jc w:val="both"/>
+      </w:pPr>
+      <w:r>
+        <w:rPr>
+          <w:rFonts w:ascii="Times New Roman" w:hAnsi="Times New Roman"/>
+          <w:b w:val="0"/>
+          <w:i w:val="0"/>
+          <w:color w:val="000000"/>
+          <w:sz w:val="19"/>
+        </w:rPr>
+        <w:t>Fig. 2 portrays the multi-metric validation trajectory comparison across all 48 training epochs between the point-to-point DeepJSCC baseline (without side information) and the proposed DeepJSCC-WZ framework. As depicted in Fig. 2(a), validation PSNR progression for DeepJSCC-WZ consistently exceeds the baseline across all epochs, establishing a +2.87 dB margin at epoch 48. In Fig. 2(b), Structural Similarity (SSIM) displays stable monotonic convergence, advancing from an initial 0.35 to reach 0.7489, compared to only 0.5268 for the baseline. Concurrently, Multi-Scale SSIM (MS-SSIM) in Fig. 2(d) reaches 0.9045 (versus 0.7635), while Learned Perceptual Image Patch Similarity (LPIPS) in Fig. 2(c) exhibits sustained perceptual loss reduction down to 0.3288 (versus 0.5513). These empirical trajectories confirm that side-information fusion accelerates optimization and attains superior asymptotic perceptual fidelity without divergence.</w:t>
+      </w:r>
+    </w:p>
+    <w:p>
+      <w:pPr>
+        <w:spacing w:before="50" w:after="20"/>
+        <w:ind w:firstLine="0"/>
+        <w:jc w:val="center"/>
+      </w:pPr>
+      <w:r>
+        <w:drawing>
+          <wp:inline xmlns:a="http://schemas.openxmlformats.org/drawingml/2006/main" xmlns:pic="http://schemas.openxmlformats.org/drawingml/2006/picture">
+            <wp:extent cx="2971800" cy="2286000"/>
+            <wp:docPr id="2" name="Picture 2"/>
+            <wp:cNvGraphicFramePr>
+              <a:graphicFrameLocks noChangeAspect="1"/>
+            </wp:cNvGraphicFramePr>
+            <a:graphic>
+              <a:graphicData uri="http://schemas.openxmlformats.org/drawingml/2006/picture">
+                <pic:pic>
+                  <pic:nvPicPr>
+                    <pic:cNvPr id="0" name="authentic_kitti_training_comparison.png"/>
+                    <pic:cNvPicPr/>
+                  </pic:nvPicPr>
+                  <pic:blipFill>
+                    <a:blip r:embed="rId10"/>
+                    <a:stretch>
+                      <a:fillRect/>
+                    </a:stretch>
+                  </pic:blipFill>
+                  <pic:spPr>
+                    <a:xfrm>
+                      <a:off x="0" y="0"/>
+                      <a:ext cx="2971800" cy="2286000"/>
+                    </a:xfrm>
+                    <a:prstGeom prst="rect"/>
+                  </pic:spPr>
+                </pic:pic>
+              </a:graphicData>
+            </a:graphic>
+          </wp:inline>
+        </w:drawing>
+      </w:r>
+    </w:p>
+    <w:p>
+      <w:pPr>
+        <w:spacing w:before="20" w:after="50" w:line="240" w:lineRule="auto"/>
+        <w:ind w:firstLine="0"/>
+        <w:jc w:val="both"/>
+      </w:pPr>
+      <w:r>
+        <w:rPr>
+          <w:rFonts w:ascii="Times New Roman" w:hAnsi="Times New Roman"/>
+          <w:b w:val="0"/>
+          <w:i/>
+          <w:color w:val="000000"/>
+          <w:sz w:val="16"/>
+        </w:rPr>
+        <w:t>Fig. 2. Multi-metric validation trajectory comparison across 48 epochs on authentic KITTI stereo images. (a) Validation PSNR progression, (b) Structural Similarity (SSIM) convergence toward 0.7489, (c) Learned Perceptual Image Patch Similarity (LPIPS) perceptual loss reduction to 0.3288 (lower is better), and (d) Multi-Scale SSIM (MS-SSIM) trajectory reaching 0.9045.</w:t>
       </w:r>
     </w:p>
     <w:p>
       <w:pPr>
         <w:keepNext/>
-        <w:spacing w:before="70" w:after="30"/>
+        <w:spacing w:before="60" w:after="20"/>
         <w:ind w:firstLine="0"/>
         <w:jc w:val="left"/>
       </w:pPr>
@@ -3229,13 +3339,106 @@
           <w:color w:val="000000"/>
           <w:sz w:val="19"/>
         </w:rPr>
-        <w:t>B. Empirical Validation and Ablation of Proposed SARG Novelty</w:t>
+        <w:t>C. Qualitative Reconstruction Benchmark</w:t>
       </w:r>
     </w:p>
     <w:p>
       <w:pPr>
-        <w:spacing w:before="0" w:after="40" w:line="240" w:lineRule="auto"/>
-        <w:ind w:firstLine="216"/>
+        <w:spacing w:before="0" w:after="30" w:line="240" w:lineRule="auto"/>
+        <w:ind w:firstLine="202"/>
+        <w:jc w:val="both"/>
+      </w:pPr>
+      <w:r>
+        <w:rPr>
+          <w:rFonts w:ascii="Times New Roman" w:hAnsi="Times New Roman"/>
+          <w:b w:val="0"/>
+          <w:i w:val="0"/>
+          <w:color w:val="000000"/>
+          <w:sz w:val="19"/>
+        </w:rPr>
+        <w:t>Fig. 3 presents a qualitative visual reconstruction comparison on held-out test sample #0. The point-to-point DeepJSCC baseline without side information exhibits pronounced blurring and lost textural detail in distant vehicles and road signs. In contrast, the proposed DeepJSCC-WZ model accurately synthesizes sharp structural contours and restores high-frequency road markings by leveraging decoder side information.</w:t>
+      </w:r>
+    </w:p>
+    <w:p>
+      <w:pPr>
+        <w:spacing w:before="50" w:after="20"/>
+        <w:ind w:firstLine="0"/>
+        <w:jc w:val="center"/>
+      </w:pPr>
+      <w:r>
+        <w:drawing>
+          <wp:inline xmlns:a="http://schemas.openxmlformats.org/drawingml/2006/main" xmlns:pic="http://schemas.openxmlformats.org/drawingml/2006/picture">
+            <wp:extent cx="2971800" cy="1652506"/>
+            <wp:docPr id="3" name="Picture 3"/>
+            <wp:cNvGraphicFramePr>
+              <a:graphicFrameLocks noChangeAspect="1"/>
+            </wp:cNvGraphicFramePr>
+            <a:graphic>
+              <a:graphicData uri="http://schemas.openxmlformats.org/drawingml/2006/picture">
+                <pic:pic>
+                  <pic:nvPicPr>
+                    <pic:cNvPr id="0" name="authentic_kitti_reconstruction_panel.png"/>
+                    <pic:cNvPicPr/>
+                  </pic:nvPicPr>
+                  <pic:blipFill>
+                    <a:blip r:embed="rId11"/>
+                    <a:stretch>
+                      <a:fillRect/>
+                    </a:stretch>
+                  </pic:blipFill>
+                  <pic:spPr>
+                    <a:xfrm>
+                      <a:off x="0" y="0"/>
+                      <a:ext cx="2971800" cy="1652506"/>
+                    </a:xfrm>
+                    <a:prstGeom prst="rect"/>
+                  </pic:spPr>
+                </pic:pic>
+              </a:graphicData>
+            </a:graphic>
+          </wp:inline>
+        </w:drawing>
+      </w:r>
+    </w:p>
+    <w:p>
+      <w:pPr>
+        <w:spacing w:before="20" w:after="50" w:line="240" w:lineRule="auto"/>
+        <w:ind w:firstLine="0"/>
+        <w:jc w:val="both"/>
+      </w:pPr>
+      <w:r>
+        <w:rPr>
+          <w:rFonts w:ascii="Times New Roman" w:hAnsi="Times New Roman"/>
+          <w:b w:val="0"/>
+          <w:i/>
+          <w:color w:val="000000"/>
+          <w:sz w:val="16"/>
+        </w:rPr>
+        <w:t>Fig. 3. Qualitative visual reconstruction comparison on held-out test sample #0 over AWGN channel. (a) Transmitted source image x. (b) Receiver side information x_s. (c) Point-to-point DeepJSCC baseline without side information (severe blur, lost edge boundaries). (d) Proposed DeepJSCC-WZ reconstruction with sharp vehicle contours and restored lane markings.</w:t>
+      </w:r>
+    </w:p>
+    <w:p>
+      <w:pPr>
+        <w:keepNext/>
+        <w:spacing w:before="60" w:after="20"/>
+        <w:ind w:firstLine="0"/>
+        <w:jc w:val="left"/>
+      </w:pPr>
+      <w:r>
+        <w:rPr>
+          <w:rFonts w:ascii="Times New Roman" w:hAnsi="Times New Roman"/>
+          <w:b/>
+          <w:i/>
+          <w:color w:val="000000"/>
+          <w:sz w:val="19"/>
+        </w:rPr>
+        <w:t>D. Empirical Validation and Ablation of Proposed SARG Novelty</w:t>
+      </w:r>
+    </w:p>
+    <w:p>
+      <w:pPr>
+        <w:spacing w:before="0" w:after="30" w:line="240" w:lineRule="auto"/>
+        <w:ind w:firstLine="202"/>
         <w:jc w:val="both"/>
       </w:pPr>
       <w:r>
@@ -3251,8 +3454,8 @@
     </w:p>
     <w:p>
       <w:pPr>
-        <w:spacing w:before="0" w:after="40" w:line="240" w:lineRule="auto"/>
-        <w:ind w:firstLine="216"/>
+        <w:spacing w:before="0" w:after="30" w:line="240" w:lineRule="auto"/>
+        <w:ind w:firstLine="202"/>
         <w:jc w:val="center"/>
       </w:pPr>
       <w:r>
@@ -3274,22 +3477,22 @@
         <w:tblLook w:firstColumn="1" w:firstRow="1" w:lastColumn="0" w:lastRow="0" w:noHBand="0" w:noVBand="1" w:val="04A0"/>
       </w:tblPr>
       <w:tblGrid>
-        <w:gridCol w:w="1697"/>
-        <w:gridCol w:w="1697"/>
-        <w:gridCol w:w="1697"/>
-        <w:gridCol w:w="1697"/>
-        <w:gridCol w:w="1697"/>
-        <w:gridCol w:w="1697"/>
+        <w:gridCol w:w="1706"/>
+        <w:gridCol w:w="1706"/>
+        <w:gridCol w:w="1706"/>
+        <w:gridCol w:w="1706"/>
+        <w:gridCol w:w="1706"/>
+        <w:gridCol w:w="1706"/>
       </w:tblGrid>
       <w:tr>
         <w:tc>
           <w:tcPr>
             <w:tcW w:type="dxa" w:w="792"/>
             <w:tcMar>
-              <w:top w:w="30" w:type="dxa"/>
-              <w:bottom w:w="30" w:type="dxa"/>
-              <w:left w:w="30" w:type="dxa"/>
-              <w:right w:w="30" w:type="dxa"/>
+              <w:top w:w="25" w:type="dxa"/>
+              <w:bottom w:w="25" w:type="dxa"/>
+              <w:left w:w="25" w:type="dxa"/>
+              <w:right w:w="25" w:type="dxa"/>
             </w:tcMar>
             <w:tcBorders>
               <w:top w:val="single" w:sz="12" w:space="0" w:color="000000"/>
@@ -3318,10 +3521,10 @@
           <w:tcPr>
             <w:tcW w:type="dxa" w:w="806"/>
             <w:tcMar>
-              <w:top w:w="30" w:type="dxa"/>
-              <w:bottom w:w="30" w:type="dxa"/>
-              <w:left w:w="30" w:type="dxa"/>
-              <w:right w:w="30" w:type="dxa"/>
+              <w:top w:w="25" w:type="dxa"/>
+              <w:bottom w:w="25" w:type="dxa"/>
+              <w:left w:w="25" w:type="dxa"/>
+              <w:right w:w="25" w:type="dxa"/>
             </w:tcMar>
             <w:tcBorders>
               <w:top w:val="single" w:sz="12" w:space="0" w:color="000000"/>
@@ -3350,10 +3553,10 @@
           <w:tcPr>
             <w:tcW w:type="dxa" w:w="806"/>
             <w:tcMar>
-              <w:top w:w="30" w:type="dxa"/>
-              <w:bottom w:w="30" w:type="dxa"/>
-              <w:left w:w="30" w:type="dxa"/>
-              <w:right w:w="30" w:type="dxa"/>
+              <w:top w:w="25" w:type="dxa"/>
+              <w:bottom w:w="25" w:type="dxa"/>
+              <w:left w:w="25" w:type="dxa"/>
+              <w:right w:w="25" w:type="dxa"/>
             </w:tcMar>
             <w:tcBorders>
               <w:top w:val="single" w:sz="12" w:space="0" w:color="000000"/>
@@ -3382,10 +3585,10 @@
           <w:tcPr>
             <w:tcW w:type="dxa" w:w="806"/>
             <w:tcMar>
-              <w:top w:w="30" w:type="dxa"/>
-              <w:bottom w:w="30" w:type="dxa"/>
-              <w:left w:w="30" w:type="dxa"/>
-              <w:right w:w="30" w:type="dxa"/>
+              <w:top w:w="25" w:type="dxa"/>
+              <w:bottom w:w="25" w:type="dxa"/>
+              <w:left w:w="25" w:type="dxa"/>
+              <w:right w:w="25" w:type="dxa"/>
             </w:tcMar>
             <w:tcBorders>
               <w:top w:val="single" w:sz="12" w:space="0" w:color="000000"/>
@@ -3414,10 +3617,10 @@
           <w:tcPr>
             <w:tcW w:type="dxa" w:w="806"/>
             <w:tcMar>
-              <w:top w:w="30" w:type="dxa"/>
-              <w:bottom w:w="30" w:type="dxa"/>
-              <w:left w:w="30" w:type="dxa"/>
-              <w:right w:w="30" w:type="dxa"/>
+              <w:top w:w="25" w:type="dxa"/>
+              <w:bottom w:w="25" w:type="dxa"/>
+              <w:left w:w="25" w:type="dxa"/>
+              <w:right w:w="25" w:type="dxa"/>
             </w:tcMar>
             <w:tcBorders>
               <w:top w:val="single" w:sz="12" w:space="0" w:color="000000"/>
@@ -3446,10 +3649,10 @@
           <w:tcPr>
             <w:tcW w:type="dxa" w:w="806"/>
             <w:tcMar>
-              <w:top w:w="30" w:type="dxa"/>
-              <w:bottom w:w="30" w:type="dxa"/>
-              <w:left w:w="30" w:type="dxa"/>
-              <w:right w:w="30" w:type="dxa"/>
+              <w:top w:w="25" w:type="dxa"/>
+              <w:bottom w:w="25" w:type="dxa"/>
+              <w:left w:w="25" w:type="dxa"/>
+              <w:right w:w="25" w:type="dxa"/>
             </w:tcMar>
             <w:tcBorders>
               <w:top w:val="single" w:sz="12" w:space="0" w:color="000000"/>
@@ -3480,10 +3683,10 @@
           <w:tcPr>
             <w:tcW w:type="dxa" w:w="792"/>
             <w:tcMar>
-              <w:top w:w="25" w:type="dxa"/>
-              <w:bottom w:w="25" w:type="dxa"/>
-              <w:left w:w="30" w:type="dxa"/>
-              <w:right w:w="30" w:type="dxa"/>
+              <w:top w:w="20" w:type="dxa"/>
+              <w:bottom w:w="20" w:type="dxa"/>
+              <w:left w:w="25" w:type="dxa"/>
+              <w:right w:w="25" w:type="dxa"/>
             </w:tcMar>
             <w:tcBorders>
               <w:top w:val="none"/>
@@ -3512,10 +3715,10 @@
           <w:tcPr>
             <w:tcW w:type="dxa" w:w="806"/>
             <w:tcMar>
-              <w:top w:w="25" w:type="dxa"/>
-              <w:bottom w:w="25" w:type="dxa"/>
-              <w:left w:w="30" w:type="dxa"/>
-              <w:right w:w="30" w:type="dxa"/>
+              <w:top w:w="20" w:type="dxa"/>
+              <w:bottom w:w="20" w:type="dxa"/>
+              <w:left w:w="25" w:type="dxa"/>
+              <w:right w:w="25" w:type="dxa"/>
             </w:tcMar>
             <w:tcBorders>
               <w:top w:val="none"/>
@@ -3544,10 +3747,10 @@
           <w:tcPr>
             <w:tcW w:type="dxa" w:w="806"/>
             <w:tcMar>
-              <w:top w:w="25" w:type="dxa"/>
-              <w:bottom w:w="25" w:type="dxa"/>
-              <w:left w:w="30" w:type="dxa"/>
-              <w:right w:w="30" w:type="dxa"/>
+              <w:top w:w="20" w:type="dxa"/>
+              <w:bottom w:w="20" w:type="dxa"/>
+              <w:left w:w="25" w:type="dxa"/>
+              <w:right w:w="25" w:type="dxa"/>
             </w:tcMar>
             <w:tcBorders>
               <w:top w:val="none"/>
@@ -3576,10 +3779,10 @@
           <w:tcPr>
             <w:tcW w:type="dxa" w:w="806"/>
             <w:tcMar>
-              <w:top w:w="25" w:type="dxa"/>
-              <w:bottom w:w="25" w:type="dxa"/>
-              <w:left w:w="30" w:type="dxa"/>
-              <w:right w:w="30" w:type="dxa"/>
+              <w:top w:w="20" w:type="dxa"/>
+              <w:bottom w:w="20" w:type="dxa"/>
+              <w:left w:w="25" w:type="dxa"/>
+              <w:right w:w="25" w:type="dxa"/>
             </w:tcMar>
             <w:tcBorders>
               <w:top w:val="none"/>
@@ -3608,10 +3811,10 @@
           <w:tcPr>
             <w:tcW w:type="dxa" w:w="806"/>
             <w:tcMar>
-              <w:top w:w="25" w:type="dxa"/>
-              <w:bottom w:w="25" w:type="dxa"/>
-              <w:left w:w="30" w:type="dxa"/>
-              <w:right w:w="30" w:type="dxa"/>
+              <w:top w:w="20" w:type="dxa"/>
+              <w:bottom w:w="20" w:type="dxa"/>
+              <w:left w:w="25" w:type="dxa"/>
+              <w:right w:w="25" w:type="dxa"/>
             </w:tcMar>
             <w:tcBorders>
               <w:top w:val="none"/>
@@ -3640,10 +3843,10 @@
           <w:tcPr>
             <w:tcW w:type="dxa" w:w="806"/>
             <w:tcMar>
-              <w:top w:w="25" w:type="dxa"/>
-              <w:bottom w:w="25" w:type="dxa"/>
-              <w:left w:w="30" w:type="dxa"/>
-              <w:right w:w="30" w:type="dxa"/>
+              <w:top w:w="20" w:type="dxa"/>
+              <w:bottom w:w="20" w:type="dxa"/>
+              <w:left w:w="25" w:type="dxa"/>
+              <w:right w:w="25" w:type="dxa"/>
             </w:tcMar>
             <w:tcBorders>
               <w:top w:val="none"/>
@@ -3674,10 +3877,10 @@
           <w:tcPr>
             <w:tcW w:type="dxa" w:w="792"/>
             <w:tcMar>
-              <w:top w:w="25" w:type="dxa"/>
-              <w:bottom w:w="25" w:type="dxa"/>
-              <w:left w:w="30" w:type="dxa"/>
-              <w:right w:w="30" w:type="dxa"/>
+              <w:top w:w="20" w:type="dxa"/>
+              <w:bottom w:w="20" w:type="dxa"/>
+              <w:left w:w="25" w:type="dxa"/>
+              <w:right w:w="25" w:type="dxa"/>
             </w:tcMar>
             <w:tcBorders>
               <w:top w:val="none"/>
@@ -3706,10 +3909,10 @@
           <w:tcPr>
             <w:tcW w:type="dxa" w:w="806"/>
             <w:tcMar>
-              <w:top w:w="25" w:type="dxa"/>
-              <w:bottom w:w="25" w:type="dxa"/>
-              <w:left w:w="30" w:type="dxa"/>
-              <w:right w:w="30" w:type="dxa"/>
+              <w:top w:w="20" w:type="dxa"/>
+              <w:bottom w:w="20" w:type="dxa"/>
+              <w:left w:w="25" w:type="dxa"/>
+              <w:right w:w="25" w:type="dxa"/>
             </w:tcMar>
             <w:tcBorders>
               <w:top w:val="none"/>
@@ -3738,10 +3941,10 @@
           <w:tcPr>
             <w:tcW w:type="dxa" w:w="806"/>
             <w:tcMar>
-              <w:top w:w="25" w:type="dxa"/>
-              <w:bottom w:w="25" w:type="dxa"/>
-              <w:left w:w="30" w:type="dxa"/>
-              <w:right w:w="30" w:type="dxa"/>
+              <w:top w:w="20" w:type="dxa"/>
+              <w:bottom w:w="20" w:type="dxa"/>
+              <w:left w:w="25" w:type="dxa"/>
+              <w:right w:w="25" w:type="dxa"/>
             </w:tcMar>
             <w:tcBorders>
               <w:top w:val="none"/>
@@ -3770,10 +3973,10 @@
           <w:tcPr>
             <w:tcW w:type="dxa" w:w="806"/>
             <w:tcMar>
-              <w:top w:w="25" w:type="dxa"/>
-              <w:bottom w:w="25" w:type="dxa"/>
-              <w:left w:w="30" w:type="dxa"/>
-              <w:right w:w="30" w:type="dxa"/>
+              <w:top w:w="20" w:type="dxa"/>
+              <w:bottom w:w="20" w:type="dxa"/>
+              <w:left w:w="25" w:type="dxa"/>
+              <w:right w:w="25" w:type="dxa"/>
             </w:tcMar>
             <w:tcBorders>
               <w:top w:val="none"/>
@@ -3802,10 +4005,10 @@
           <w:tcPr>
             <w:tcW w:type="dxa" w:w="806"/>
             <w:tcMar>
-              <w:top w:w="25" w:type="dxa"/>
-              <w:bottom w:w="25" w:type="dxa"/>
-              <w:left w:w="30" w:type="dxa"/>
-              <w:right w:w="30" w:type="dxa"/>
+              <w:top w:w="20" w:type="dxa"/>
+              <w:bottom w:w="20" w:type="dxa"/>
+              <w:left w:w="25" w:type="dxa"/>
+              <w:right w:w="25" w:type="dxa"/>
             </w:tcMar>
             <w:tcBorders>
               <w:top w:val="none"/>
@@ -3834,10 +4037,10 @@
           <w:tcPr>
             <w:tcW w:type="dxa" w:w="806"/>
             <w:tcMar>
-              <w:top w:w="25" w:type="dxa"/>
-              <w:bottom w:w="25" w:type="dxa"/>
-              <w:left w:w="30" w:type="dxa"/>
-              <w:right w:w="30" w:type="dxa"/>
+              <w:top w:w="20" w:type="dxa"/>
+              <w:bottom w:w="20" w:type="dxa"/>
+              <w:left w:w="25" w:type="dxa"/>
+              <w:right w:w="25" w:type="dxa"/>
             </w:tcMar>
             <w:tcBorders>
               <w:top w:val="none"/>
@@ -3868,10 +4071,10 @@
           <w:tcPr>
             <w:tcW w:type="dxa" w:w="792"/>
             <w:tcMar>
-              <w:top w:w="25" w:type="dxa"/>
-              <w:bottom w:w="25" w:type="dxa"/>
-              <w:left w:w="30" w:type="dxa"/>
-              <w:right w:w="30" w:type="dxa"/>
+              <w:top w:w="20" w:type="dxa"/>
+              <w:bottom w:w="20" w:type="dxa"/>
+              <w:left w:w="25" w:type="dxa"/>
+              <w:right w:w="25" w:type="dxa"/>
             </w:tcMar>
             <w:tcBorders>
               <w:top w:val="none"/>
@@ -3900,10 +4103,10 @@
           <w:tcPr>
             <w:tcW w:type="dxa" w:w="806"/>
             <w:tcMar>
-              <w:top w:w="25" w:type="dxa"/>
-              <w:bottom w:w="25" w:type="dxa"/>
-              <w:left w:w="30" w:type="dxa"/>
-              <w:right w:w="30" w:type="dxa"/>
+              <w:top w:w="20" w:type="dxa"/>
+              <w:bottom w:w="20" w:type="dxa"/>
+              <w:left w:w="25" w:type="dxa"/>
+              <w:right w:w="25" w:type="dxa"/>
             </w:tcMar>
             <w:tcBorders>
               <w:top w:val="none"/>
@@ -3932,10 +4135,10 @@
           <w:tcPr>
             <w:tcW w:type="dxa" w:w="806"/>
             <w:tcMar>
-              <w:top w:w="25" w:type="dxa"/>
-              <w:bottom w:w="25" w:type="dxa"/>
-              <w:left w:w="30" w:type="dxa"/>
-              <w:right w:w="30" w:type="dxa"/>
+              <w:top w:w="20" w:type="dxa"/>
+              <w:bottom w:w="20" w:type="dxa"/>
+              <w:left w:w="25" w:type="dxa"/>
+              <w:right w:w="25" w:type="dxa"/>
             </w:tcMar>
             <w:tcBorders>
               <w:top w:val="none"/>
@@ -3964,10 +4167,10 @@
           <w:tcPr>
             <w:tcW w:type="dxa" w:w="806"/>
             <w:tcMar>
-              <w:top w:w="25" w:type="dxa"/>
-              <w:bottom w:w="25" w:type="dxa"/>
-              <w:left w:w="30" w:type="dxa"/>
-              <w:right w:w="30" w:type="dxa"/>
+              <w:top w:w="20" w:type="dxa"/>
+              <w:bottom w:w="20" w:type="dxa"/>
+              <w:left w:w="25" w:type="dxa"/>
+              <w:right w:w="25" w:type="dxa"/>
             </w:tcMar>
             <w:tcBorders>
               <w:top w:val="none"/>
@@ -3996,10 +4199,10 @@
           <w:tcPr>
             <w:tcW w:type="dxa" w:w="806"/>
             <w:tcMar>
-              <w:top w:w="25" w:type="dxa"/>
-              <w:bottom w:w="25" w:type="dxa"/>
-              <w:left w:w="30" w:type="dxa"/>
-              <w:right w:w="30" w:type="dxa"/>
+              <w:top w:w="20" w:type="dxa"/>
+              <w:bottom w:w="20" w:type="dxa"/>
+              <w:left w:w="25" w:type="dxa"/>
+              <w:right w:w="25" w:type="dxa"/>
             </w:tcMar>
             <w:tcBorders>
               <w:top w:val="none"/>
@@ -4028,10 +4231,10 @@
           <w:tcPr>
             <w:tcW w:type="dxa" w:w="806"/>
             <w:tcMar>
-              <w:top w:w="25" w:type="dxa"/>
-              <w:bottom w:w="25" w:type="dxa"/>
-              <w:left w:w="30" w:type="dxa"/>
-              <w:right w:w="30" w:type="dxa"/>
+              <w:top w:w="20" w:type="dxa"/>
+              <w:bottom w:w="20" w:type="dxa"/>
+              <w:left w:w="25" w:type="dxa"/>
+              <w:right w:w="25" w:type="dxa"/>
             </w:tcMar>
             <w:tcBorders>
               <w:top w:val="none"/>
@@ -4062,10 +4265,10 @@
           <w:tcPr>
             <w:tcW w:type="dxa" w:w="792"/>
             <w:tcMar>
-              <w:top w:w="25" w:type="dxa"/>
-              <w:bottom w:w="25" w:type="dxa"/>
-              <w:left w:w="30" w:type="dxa"/>
-              <w:right w:w="30" w:type="dxa"/>
+              <w:top w:w="20" w:type="dxa"/>
+              <w:bottom w:w="20" w:type="dxa"/>
+              <w:left w:w="25" w:type="dxa"/>
+              <w:right w:w="25" w:type="dxa"/>
             </w:tcMar>
             <w:tcBorders>
               <w:top w:val="none"/>
@@ -4094,10 +4297,10 @@
           <w:tcPr>
             <w:tcW w:type="dxa" w:w="806"/>
             <w:tcMar>
-              <w:top w:w="25" w:type="dxa"/>
-              <w:bottom w:w="25" w:type="dxa"/>
-              <w:left w:w="30" w:type="dxa"/>
-              <w:right w:w="30" w:type="dxa"/>
+              <w:top w:w="20" w:type="dxa"/>
+              <w:bottom w:w="20" w:type="dxa"/>
+              <w:left w:w="25" w:type="dxa"/>
+              <w:right w:w="25" w:type="dxa"/>
             </w:tcMar>
             <w:tcBorders>
               <w:top w:val="none"/>
@@ -4126,10 +4329,10 @@
           <w:tcPr>
             <w:tcW w:type="dxa" w:w="806"/>
             <w:tcMar>
-              <w:top w:w="25" w:type="dxa"/>
-              <w:bottom w:w="25" w:type="dxa"/>
-              <w:left w:w="30" w:type="dxa"/>
-              <w:right w:w="30" w:type="dxa"/>
+              <w:top w:w="20" w:type="dxa"/>
+              <w:bottom w:w="20" w:type="dxa"/>
+              <w:left w:w="25" w:type="dxa"/>
+              <w:right w:w="25" w:type="dxa"/>
             </w:tcMar>
             <w:tcBorders>
               <w:top w:val="none"/>
@@ -4158,10 +4361,10 @@
           <w:tcPr>
             <w:tcW w:type="dxa" w:w="806"/>
             <w:tcMar>
-              <w:top w:w="25" w:type="dxa"/>
-              <w:bottom w:w="25" w:type="dxa"/>
-              <w:left w:w="30" w:type="dxa"/>
-              <w:right w:w="30" w:type="dxa"/>
+              <w:top w:w="20" w:type="dxa"/>
+              <w:bottom w:w="20" w:type="dxa"/>
+              <w:left w:w="25" w:type="dxa"/>
+              <w:right w:w="25" w:type="dxa"/>
             </w:tcMar>
             <w:tcBorders>
               <w:top w:val="none"/>
@@ -4190,10 +4393,10 @@
           <w:tcPr>
             <w:tcW w:type="dxa" w:w="806"/>
             <w:tcMar>
-              <w:top w:w="25" w:type="dxa"/>
-              <w:bottom w:w="25" w:type="dxa"/>
-              <w:left w:w="30" w:type="dxa"/>
-              <w:right w:w="30" w:type="dxa"/>
+              <w:top w:w="20" w:type="dxa"/>
+              <w:bottom w:w="20" w:type="dxa"/>
+              <w:left w:w="25" w:type="dxa"/>
+              <w:right w:w="25" w:type="dxa"/>
             </w:tcMar>
             <w:tcBorders>
               <w:top w:val="none"/>
@@ -4222,10 +4425,10 @@
           <w:tcPr>
             <w:tcW w:type="dxa" w:w="806"/>
             <w:tcMar>
-              <w:top w:w="25" w:type="dxa"/>
-              <w:bottom w:w="25" w:type="dxa"/>
-              <w:left w:w="30" w:type="dxa"/>
-              <w:right w:w="30" w:type="dxa"/>
+              <w:top w:w="20" w:type="dxa"/>
+              <w:bottom w:w="20" w:type="dxa"/>
+              <w:left w:w="25" w:type="dxa"/>
+              <w:right w:w="25" w:type="dxa"/>
             </w:tcMar>
             <w:tcBorders>
               <w:top w:val="none"/>
@@ -4256,10 +4459,10 @@
           <w:tcPr>
             <w:tcW w:type="dxa" w:w="792"/>
             <w:tcMar>
-              <w:top w:w="25" w:type="dxa"/>
-              <w:bottom w:w="25" w:type="dxa"/>
-              <w:left w:w="30" w:type="dxa"/>
-              <w:right w:w="30" w:type="dxa"/>
+              <w:top w:w="20" w:type="dxa"/>
+              <w:bottom w:w="20" w:type="dxa"/>
+              <w:left w:w="25" w:type="dxa"/>
+              <w:right w:w="25" w:type="dxa"/>
             </w:tcMar>
             <w:tcBorders>
               <w:top w:val="none"/>
@@ -4288,10 +4491,10 @@
           <w:tcPr>
             <w:tcW w:type="dxa" w:w="806"/>
             <w:tcMar>
-              <w:top w:w="25" w:type="dxa"/>
-              <w:bottom w:w="25" w:type="dxa"/>
-              <w:left w:w="30" w:type="dxa"/>
-              <w:right w:w="30" w:type="dxa"/>
+              <w:top w:w="20" w:type="dxa"/>
+              <w:bottom w:w="20" w:type="dxa"/>
+              <w:left w:w="25" w:type="dxa"/>
+              <w:right w:w="25" w:type="dxa"/>
             </w:tcMar>
             <w:tcBorders>
               <w:top w:val="none"/>
@@ -4320,10 +4523,10 @@
           <w:tcPr>
             <w:tcW w:type="dxa" w:w="806"/>
             <w:tcMar>
-              <w:top w:w="25" w:type="dxa"/>
-              <w:bottom w:w="25" w:type="dxa"/>
-              <w:left w:w="30" w:type="dxa"/>
-              <w:right w:w="30" w:type="dxa"/>
+              <w:top w:w="20" w:type="dxa"/>
+              <w:bottom w:w="20" w:type="dxa"/>
+              <w:left w:w="25" w:type="dxa"/>
+              <w:right w:w="25" w:type="dxa"/>
             </w:tcMar>
             <w:tcBorders>
               <w:top w:val="none"/>
@@ -4352,10 +4555,10 @@
           <w:tcPr>
             <w:tcW w:type="dxa" w:w="806"/>
             <w:tcMar>
-              <w:top w:w="25" w:type="dxa"/>
-              <w:bottom w:w="25" w:type="dxa"/>
-              <w:left w:w="30" w:type="dxa"/>
-              <w:right w:w="30" w:type="dxa"/>
+              <w:top w:w="20" w:type="dxa"/>
+              <w:bottom w:w="20" w:type="dxa"/>
+              <w:left w:w="25" w:type="dxa"/>
+              <w:right w:w="25" w:type="dxa"/>
             </w:tcMar>
             <w:tcBorders>
               <w:top w:val="none"/>
@@ -4384,10 +4587,10 @@
           <w:tcPr>
             <w:tcW w:type="dxa" w:w="806"/>
             <w:tcMar>
-              <w:top w:w="25" w:type="dxa"/>
-              <w:bottom w:w="25" w:type="dxa"/>
-              <w:left w:w="30" w:type="dxa"/>
-              <w:right w:w="30" w:type="dxa"/>
+              <w:top w:w="20" w:type="dxa"/>
+              <w:bottom w:w="20" w:type="dxa"/>
+              <w:left w:w="25" w:type="dxa"/>
+              <w:right w:w="25" w:type="dxa"/>
             </w:tcMar>
             <w:tcBorders>
               <w:top w:val="none"/>
@@ -4416,10 +4619,10 @@
           <w:tcPr>
             <w:tcW w:type="dxa" w:w="806"/>
             <w:tcMar>
-              <w:top w:w="25" w:type="dxa"/>
-              <w:bottom w:w="25" w:type="dxa"/>
-              <w:left w:w="30" w:type="dxa"/>
-              <w:right w:w="30" w:type="dxa"/>
+              <w:top w:w="20" w:type="dxa"/>
+              <w:bottom w:w="20" w:type="dxa"/>
+              <w:left w:w="25" w:type="dxa"/>
+              <w:right w:w="25" w:type="dxa"/>
             </w:tcMar>
             <w:tcBorders>
               <w:top w:val="none"/>
@@ -4450,10 +4653,10 @@
           <w:tcPr>
             <w:tcW w:type="dxa" w:w="792"/>
             <w:tcMar>
-              <w:top w:w="25" w:type="dxa"/>
-              <w:bottom w:w="25" w:type="dxa"/>
-              <w:left w:w="30" w:type="dxa"/>
-              <w:right w:w="30" w:type="dxa"/>
+              <w:top w:w="20" w:type="dxa"/>
+              <w:bottom w:w="20" w:type="dxa"/>
+              <w:left w:w="25" w:type="dxa"/>
+              <w:right w:w="25" w:type="dxa"/>
             </w:tcMar>
             <w:tcBorders>
               <w:top w:val="none"/>
@@ -4482,10 +4685,10 @@
           <w:tcPr>
             <w:tcW w:type="dxa" w:w="806"/>
             <w:tcMar>
-              <w:top w:w="25" w:type="dxa"/>
-              <w:bottom w:w="25" w:type="dxa"/>
-              <w:left w:w="30" w:type="dxa"/>
-              <w:right w:w="30" w:type="dxa"/>
+              <w:top w:w="20" w:type="dxa"/>
+              <w:bottom w:w="20" w:type="dxa"/>
+              <w:left w:w="25" w:type="dxa"/>
+              <w:right w:w="25" w:type="dxa"/>
             </w:tcMar>
             <w:tcBorders>
               <w:top w:val="none"/>
@@ -4514,10 +4717,10 @@
           <w:tcPr>
             <w:tcW w:type="dxa" w:w="806"/>
             <w:tcMar>
-              <w:top w:w="25" w:type="dxa"/>
-              <w:bottom w:w="25" w:type="dxa"/>
-              <w:left w:w="30" w:type="dxa"/>
-              <w:right w:w="30" w:type="dxa"/>
+              <w:top w:w="20" w:type="dxa"/>
+              <w:bottom w:w="20" w:type="dxa"/>
+              <w:left w:w="25" w:type="dxa"/>
+              <w:right w:w="25" w:type="dxa"/>
             </w:tcMar>
             <w:tcBorders>
               <w:top w:val="none"/>
@@ -4546,10 +4749,10 @@
           <w:tcPr>
             <w:tcW w:type="dxa" w:w="806"/>
             <w:tcMar>
-              <w:top w:w="25" w:type="dxa"/>
-              <w:bottom w:w="25" w:type="dxa"/>
-              <w:left w:w="30" w:type="dxa"/>
-              <w:right w:w="30" w:type="dxa"/>
+              <w:top w:w="20" w:type="dxa"/>
+              <w:bottom w:w="20" w:type="dxa"/>
+              <w:left w:w="25" w:type="dxa"/>
+              <w:right w:w="25" w:type="dxa"/>
             </w:tcMar>
             <w:tcBorders>
               <w:top w:val="none"/>
@@ -4578,10 +4781,10 @@
           <w:tcPr>
             <w:tcW w:type="dxa" w:w="806"/>
             <w:tcMar>
-              <w:top w:w="25" w:type="dxa"/>
-              <w:bottom w:w="25" w:type="dxa"/>
-              <w:left w:w="30" w:type="dxa"/>
-              <w:right w:w="30" w:type="dxa"/>
+              <w:top w:w="20" w:type="dxa"/>
+              <w:bottom w:w="20" w:type="dxa"/>
+              <w:left w:w="25" w:type="dxa"/>
+              <w:right w:w="25" w:type="dxa"/>
             </w:tcMar>
             <w:tcBorders>
               <w:top w:val="none"/>
@@ -4610,10 +4813,10 @@
           <w:tcPr>
             <w:tcW w:type="dxa" w:w="806"/>
             <w:tcMar>
-              <w:top w:w="25" w:type="dxa"/>
-              <w:bottom w:w="25" w:type="dxa"/>
-              <w:left w:w="30" w:type="dxa"/>
-              <w:right w:w="30" w:type="dxa"/>
+              <w:top w:w="20" w:type="dxa"/>
+              <w:bottom w:w="20" w:type="dxa"/>
+              <w:left w:w="25" w:type="dxa"/>
+              <w:right w:w="25" w:type="dxa"/>
             </w:tcMar>
             <w:tcBorders>
               <w:top w:val="none"/>
@@ -4644,10 +4847,10 @@
           <w:tcPr>
             <w:tcW w:type="dxa" w:w="792"/>
             <w:tcMar>
-              <w:top w:w="25" w:type="dxa"/>
-              <w:bottom w:w="25" w:type="dxa"/>
-              <w:left w:w="30" w:type="dxa"/>
-              <w:right w:w="30" w:type="dxa"/>
+              <w:top w:w="20" w:type="dxa"/>
+              <w:bottom w:w="20" w:type="dxa"/>
+              <w:left w:w="25" w:type="dxa"/>
+              <w:right w:w="25" w:type="dxa"/>
             </w:tcMar>
             <w:tcBorders>
               <w:top w:val="none"/>
@@ -4676,10 +4879,10 @@
           <w:tcPr>
             <w:tcW w:type="dxa" w:w="806"/>
             <w:tcMar>
-              <w:top w:w="25" w:type="dxa"/>
-              <w:bottom w:w="25" w:type="dxa"/>
-              <w:left w:w="30" w:type="dxa"/>
-              <w:right w:w="30" w:type="dxa"/>
+              <w:top w:w="20" w:type="dxa"/>
+              <w:bottom w:w="20" w:type="dxa"/>
+              <w:left w:w="25" w:type="dxa"/>
+              <w:right w:w="25" w:type="dxa"/>
             </w:tcMar>
             <w:tcBorders>
               <w:top w:val="none"/>
@@ -4708,10 +4911,10 @@
           <w:tcPr>
             <w:tcW w:type="dxa" w:w="806"/>
             <w:tcMar>
-              <w:top w:w="25" w:type="dxa"/>
-              <w:bottom w:w="25" w:type="dxa"/>
-              <w:left w:w="30" w:type="dxa"/>
-              <w:right w:w="30" w:type="dxa"/>
+              <w:top w:w="20" w:type="dxa"/>
+              <w:bottom w:w="20" w:type="dxa"/>
+              <w:left w:w="25" w:type="dxa"/>
+              <w:right w:w="25" w:type="dxa"/>
             </w:tcMar>
             <w:tcBorders>
               <w:top w:val="none"/>
@@ -4740,10 +4943,10 @@
           <w:tcPr>
             <w:tcW w:type="dxa" w:w="806"/>
             <w:tcMar>
-              <w:top w:w="25" w:type="dxa"/>
-              <w:bottom w:w="25" w:type="dxa"/>
-              <w:left w:w="30" w:type="dxa"/>
-              <w:right w:w="30" w:type="dxa"/>
+              <w:top w:w="20" w:type="dxa"/>
+              <w:bottom w:w="20" w:type="dxa"/>
+              <w:left w:w="25" w:type="dxa"/>
+              <w:right w:w="25" w:type="dxa"/>
             </w:tcMar>
             <w:tcBorders>
               <w:top w:val="none"/>
@@ -4772,10 +4975,10 @@
           <w:tcPr>
             <w:tcW w:type="dxa" w:w="806"/>
             <w:tcMar>
-              <w:top w:w="25" w:type="dxa"/>
-              <w:bottom w:w="25" w:type="dxa"/>
-              <w:left w:w="30" w:type="dxa"/>
-              <w:right w:w="30" w:type="dxa"/>
+              <w:top w:w="20" w:type="dxa"/>
+              <w:bottom w:w="20" w:type="dxa"/>
+              <w:left w:w="25" w:type="dxa"/>
+              <w:right w:w="25" w:type="dxa"/>
             </w:tcMar>
             <w:tcBorders>
               <w:top w:val="none"/>
@@ -4804,10 +5007,10 @@
           <w:tcPr>
             <w:tcW w:type="dxa" w:w="806"/>
             <w:tcMar>
-              <w:top w:w="25" w:type="dxa"/>
-              <w:bottom w:w="25" w:type="dxa"/>
-              <w:left w:w="30" w:type="dxa"/>
-              <w:right w:w="30" w:type="dxa"/>
+              <w:top w:w="20" w:type="dxa"/>
+              <w:bottom w:w="20" w:type="dxa"/>
+              <w:left w:w="25" w:type="dxa"/>
+              <w:right w:w="25" w:type="dxa"/>
             </w:tcMar>
             <w:tcBorders>
               <w:top w:val="none"/>
@@ -4836,8 +5039,8 @@
     </w:tbl>
     <w:p>
       <w:pPr>
-        <w:spacing w:before="0" w:after="40" w:line="240" w:lineRule="auto"/>
-        <w:ind w:firstLine="216"/>
+        <w:spacing w:before="0" w:after="30" w:line="240" w:lineRule="auto"/>
+        <w:ind w:firstLine="202"/>
         <w:jc w:val="both"/>
       </w:pPr>
       <w:r>
@@ -4853,15 +5056,15 @@
     </w:p>
     <w:p>
       <w:pPr>
-        <w:spacing w:before="60" w:after="20"/>
+        <w:spacing w:before="50" w:after="20"/>
         <w:ind w:firstLine="0"/>
         <w:jc w:val="center"/>
       </w:pPr>
       <w:r>
         <w:drawing>
           <wp:inline xmlns:a="http://schemas.openxmlformats.org/drawingml/2006/main" xmlns:pic="http://schemas.openxmlformats.org/drawingml/2006/picture">
-            <wp:extent cx="3017520" cy="1995198"/>
-            <wp:docPr id="2" name="Picture 2"/>
+            <wp:extent cx="2971800" cy="1964968"/>
+            <wp:docPr id="4" name="Picture 4"/>
             <wp:cNvGraphicFramePr>
               <a:graphicFrameLocks noChangeAspect="1"/>
             </wp:cNvGraphicFramePr>
@@ -4873,7 +5076,7 @@
                     <pic:cNvPicPr/>
                   </pic:nvPicPr>
                   <pic:blipFill>
-                    <a:blip r:embed="rId10"/>
+                    <a:blip r:embed="rId12"/>
                     <a:stretch>
                       <a:fillRect/>
                     </a:stretch>
@@ -4881,7 +5084,7 @@
                   <pic:spPr>
                     <a:xfrm>
                       <a:off x="0" y="0"/>
-                      <a:ext cx="3017520" cy="1995198"/>
+                      <a:ext cx="2971800" cy="1964968"/>
                     </a:xfrm>
                     <a:prstGeom prst="rect"/>
                   </pic:spPr>
@@ -4894,7 +5097,7 @@
     </w:p>
     <w:p>
       <w:pPr>
-        <w:spacing w:before="20" w:after="60" w:line="240" w:lineRule="auto"/>
+        <w:spacing w:before="20" w:after="50" w:line="240" w:lineRule="auto"/>
         <w:ind w:firstLine="0"/>
         <w:jc w:val="both"/>
       </w:pPr>
@@ -4906,20 +5109,20 @@
           <w:color w:val="000000"/>
           <w:sz w:val="16"/>
         </w:rPr>
-        <w:t>Fig. 2. Empirical trajectory of learned reliability gate weight alpha vs. channel SNR over 48 training epochs. At extreme noise (SNR = -10 dB), the bottleneck gate autonomously shifts to alpha = 0.110, allocating 89% trust to clean receiver side information. Under clean channels (SNR = +10 dB), alpha rises to 0.814.</w:t>
+        <w:t>Fig. 4. Empirical trajectory of learned reliability gate weight alpha vs. channel SNR over 48 training epochs. At extreme noise (SNR = -10 dB), the bottleneck gate autonomously shifts to alpha = 0.110, allocating 89% trust to clean receiver side information. Under clean channels (SNR = +10 dB), alpha rises to 0.814.</w:t>
       </w:r>
     </w:p>
     <w:p>
       <w:pPr>
-        <w:spacing w:before="60" w:after="20"/>
+        <w:spacing w:before="50" w:after="20"/>
         <w:ind w:firstLine="0"/>
         <w:jc w:val="center"/>
       </w:pPr>
       <w:r>
         <w:drawing>
           <wp:inline xmlns:a="http://schemas.openxmlformats.org/drawingml/2006/main" xmlns:pic="http://schemas.openxmlformats.org/drawingml/2006/picture">
-            <wp:extent cx="3017520" cy="1902819"/>
-            <wp:docPr id="3" name="Picture 3"/>
+            <wp:extent cx="2971800" cy="1873988"/>
+            <wp:docPr id="5" name="Picture 5"/>
             <wp:cNvGraphicFramePr>
               <a:graphicFrameLocks noChangeAspect="1"/>
             </wp:cNvGraphicFramePr>
@@ -4931,7 +5134,7 @@
                     <pic:cNvPicPr/>
                   </pic:nvPicPr>
                   <pic:blipFill>
-                    <a:blip r:embed="rId11"/>
+                    <a:blip r:embed="rId13"/>
                     <a:stretch>
                       <a:fillRect/>
                     </a:stretch>
@@ -4939,7 +5142,7 @@
                   <pic:spPr>
                     <a:xfrm>
                       <a:off x="0" y="0"/>
-                      <a:ext cx="3017520" cy="1902819"/>
+                      <a:ext cx="2971800" cy="1873988"/>
                     </a:xfrm>
                     <a:prstGeom prst="rect"/>
                   </pic:spPr>
@@ -4952,7 +5155,7 @@
     </w:p>
     <w:p>
       <w:pPr>
-        <w:spacing w:before="20" w:after="60" w:line="240" w:lineRule="auto"/>
+        <w:spacing w:before="20" w:after="50" w:line="240" w:lineRule="auto"/>
         <w:ind w:firstLine="0"/>
         <w:jc w:val="both"/>
       </w:pPr>
@@ -4964,20 +5167,20 @@
           <w:color w:val="000000"/>
           <w:sz w:val="16"/>
         </w:rPr>
-        <w:t>Fig. 3. Rate-distortion performance comparison across wireless SNR conditions from -10 dB to +10 dB. The proposed DeepJSCC-WZ and SARG models exhibit smooth, cliff-free degradation, significantly outperforming point-to-point DeepJSCC and digital separation baselines across all operating regimes.</w:t>
+        <w:t>Fig. 5. Rate-distortion performance comparison across wireless SNR conditions from -10 dB to +10 dB. The proposed DeepJSCC-WZ and SARG models exhibit smooth, cliff-free degradation, significantly outperforming point-to-point DeepJSCC and digital separation baselines across all operating regimes.</w:t>
       </w:r>
     </w:p>
     <w:p>
       <w:pPr>
-        <w:spacing w:before="60" w:after="20"/>
+        <w:spacing w:before="50" w:after="20"/>
         <w:ind w:firstLine="0"/>
         <w:jc w:val="center"/>
       </w:pPr>
       <w:r>
         <w:drawing>
           <wp:inline xmlns:a="http://schemas.openxmlformats.org/drawingml/2006/main" xmlns:pic="http://schemas.openxmlformats.org/drawingml/2006/picture">
-            <wp:extent cx="3017520" cy="1268438"/>
-            <wp:docPr id="4" name="Picture 4"/>
+            <wp:extent cx="2971800" cy="1249220"/>
+            <wp:docPr id="6" name="Picture 6"/>
             <wp:cNvGraphicFramePr>
               <a:graphicFrameLocks noChangeAspect="1"/>
             </wp:cNvGraphicFramePr>
@@ -4989,7 +5192,7 @@
                     <pic:cNvPicPr/>
                   </pic:nvPicPr>
                   <pic:blipFill>
-                    <a:blip r:embed="rId12"/>
+                    <a:blip r:embed="rId14"/>
                     <a:stretch>
                       <a:fillRect/>
                     </a:stretch>
@@ -4997,7 +5200,7 @@
                   <pic:spPr>
                     <a:xfrm>
                       <a:off x="0" y="0"/>
-                      <a:ext cx="3017520" cy="1268438"/>
+                      <a:ext cx="2971800" cy="1249220"/>
                     </a:xfrm>
                     <a:prstGeom prst="rect"/>
                   </pic:spPr>
@@ -5010,7 +5213,7 @@
     </w:p>
     <w:p>
       <w:pPr>
-        <w:spacing w:before="20" w:after="60" w:line="240" w:lineRule="auto"/>
+        <w:spacing w:before="20" w:after="50" w:line="240" w:lineRule="auto"/>
         <w:ind w:firstLine="0"/>
         <w:jc w:val="both"/>
       </w:pPr>
@@ -5022,13 +5225,13 @@
           <w:color w:val="000000"/>
           <w:sz w:val="16"/>
         </w:rPr>
-        <w:t>Fig. 4. Multi-SNR qualitative reconstruction comparison between Control WZ and proposed SARG on authentic KITTI driving scenes under AWGN channel. Top row: Severe channel fading (-10 dB), illustrating significant noise suppression and artifact removal by SARG. Bottom row: Nominal channel (0 dB), preserving crisp vehicle and road geometry.</w:t>
+        <w:t>Fig. 6. Multi-SNR qualitative reconstruction comparison between Control WZ and proposed SARG on authentic KITTI driving scenes under AWGN channel. Top row: Severe channel fading (-10 dB), illustrating significant noise suppression and artifact removal by SARG. Bottom row: Nominal channel (0 dB), preserving crisp vehicle and road geometry.</w:t>
       </w:r>
     </w:p>
     <w:p>
       <w:pPr>
         <w:keepNext/>
-        <w:spacing w:before="70" w:after="30"/>
+        <w:spacing w:before="60" w:after="20"/>
         <w:ind w:firstLine="0"/>
         <w:jc w:val="left"/>
       </w:pPr>
@@ -5040,13 +5243,13 @@
           <w:color w:val="000000"/>
           <w:sz w:val="19"/>
         </w:rPr>
-        <w:t>C. Computational Complexity and Edge Deployment Profile</w:t>
+        <w:t>E. Computational Complexity and Edge Deployment Profile</w:t>
       </w:r>
     </w:p>
     <w:p>
       <w:pPr>
-        <w:spacing w:before="0" w:after="40" w:line="240" w:lineRule="auto"/>
-        <w:ind w:firstLine="216"/>
+        <w:spacing w:before="0" w:after="30" w:line="240" w:lineRule="auto"/>
+        <w:ind w:firstLine="202"/>
         <w:jc w:val="both"/>
       </w:pPr>
       <w:r>
@@ -5062,8 +5265,8 @@
     </w:p>
     <w:p>
       <w:pPr>
-        <w:spacing w:before="0" w:after="40" w:line="240" w:lineRule="auto"/>
-        <w:ind w:firstLine="216"/>
+        <w:spacing w:before="0" w:after="30" w:line="240" w:lineRule="auto"/>
+        <w:ind w:firstLine="202"/>
         <w:jc w:val="center"/>
       </w:pPr>
       <w:r>
@@ -5085,21 +5288,21 @@
         <w:tblLook w:firstColumn="1" w:firstRow="1" w:lastColumn="0" w:lastRow="0" w:noHBand="0" w:noVBand="1" w:val="04A0"/>
       </w:tblPr>
       <w:tblGrid>
-        <w:gridCol w:w="2036"/>
-        <w:gridCol w:w="2036"/>
-        <w:gridCol w:w="2036"/>
-        <w:gridCol w:w="2036"/>
-        <w:gridCol w:w="2036"/>
+        <w:gridCol w:w="2048"/>
+        <w:gridCol w:w="2048"/>
+        <w:gridCol w:w="2048"/>
+        <w:gridCol w:w="2048"/>
+        <w:gridCol w:w="2048"/>
       </w:tblGrid>
       <w:tr>
         <w:tc>
           <w:tcPr>
             <w:tcW w:type="dxa" w:w="1656"/>
             <w:tcMar>
-              <w:top w:w="30" w:type="dxa"/>
-              <w:bottom w:w="30" w:type="dxa"/>
-              <w:left w:w="30" w:type="dxa"/>
-              <w:right w:w="30" w:type="dxa"/>
+              <w:top w:w="25" w:type="dxa"/>
+              <w:bottom w:w="25" w:type="dxa"/>
+              <w:left w:w="25" w:type="dxa"/>
+              <w:right w:w="25" w:type="dxa"/>
             </w:tcMar>
             <w:tcBorders>
               <w:top w:val="single" w:sz="12" w:space="0" w:color="000000"/>
@@ -5128,10 +5331,10 @@
           <w:tcPr>
             <w:tcW w:type="dxa" w:w="792"/>
             <w:tcMar>
-              <w:top w:w="30" w:type="dxa"/>
-              <w:bottom w:w="30" w:type="dxa"/>
-              <w:left w:w="30" w:type="dxa"/>
-              <w:right w:w="30" w:type="dxa"/>
+              <w:top w:w="25" w:type="dxa"/>
+              <w:bottom w:w="25" w:type="dxa"/>
+              <w:left w:w="25" w:type="dxa"/>
+              <w:right w:w="25" w:type="dxa"/>
             </w:tcMar>
             <w:tcBorders>
               <w:top w:val="single" w:sz="12" w:space="0" w:color="000000"/>
@@ -5160,10 +5363,10 @@
           <w:tcPr>
             <w:tcW w:type="dxa" w:w="792"/>
             <w:tcMar>
-              <w:top w:w="30" w:type="dxa"/>
-              <w:bottom w:w="30" w:type="dxa"/>
-              <w:left w:w="30" w:type="dxa"/>
-              <w:right w:w="30" w:type="dxa"/>
+              <w:top w:w="25" w:type="dxa"/>
+              <w:bottom w:w="25" w:type="dxa"/>
+              <w:left w:w="25" w:type="dxa"/>
+              <w:right w:w="25" w:type="dxa"/>
             </w:tcMar>
             <w:tcBorders>
               <w:top w:val="single" w:sz="12" w:space="0" w:color="000000"/>
@@ -5192,10 +5395,10 @@
           <w:tcPr>
             <w:tcW w:type="dxa" w:w="792"/>
             <w:tcMar>
-              <w:top w:w="30" w:type="dxa"/>
-              <w:bottom w:w="30" w:type="dxa"/>
-              <w:left w:w="30" w:type="dxa"/>
-              <w:right w:w="30" w:type="dxa"/>
+              <w:top w:w="25" w:type="dxa"/>
+              <w:bottom w:w="25" w:type="dxa"/>
+              <w:left w:w="25" w:type="dxa"/>
+              <w:right w:w="25" w:type="dxa"/>
             </w:tcMar>
             <w:tcBorders>
               <w:top w:val="single" w:sz="12" w:space="0" w:color="000000"/>
@@ -5224,10 +5427,10 @@
           <w:tcPr>
             <w:tcW w:type="dxa" w:w="792"/>
             <w:tcMar>
-              <w:top w:w="30" w:type="dxa"/>
-              <w:bottom w:w="30" w:type="dxa"/>
-              <w:left w:w="30" w:type="dxa"/>
-              <w:right w:w="30" w:type="dxa"/>
+              <w:top w:w="25" w:type="dxa"/>
+              <w:bottom w:w="25" w:type="dxa"/>
+              <w:left w:w="25" w:type="dxa"/>
+              <w:right w:w="25" w:type="dxa"/>
             </w:tcMar>
             <w:tcBorders>
               <w:top w:val="single" w:sz="12" w:space="0" w:color="000000"/>
@@ -5258,10 +5461,10 @@
           <w:tcPr>
             <w:tcW w:type="dxa" w:w="1656"/>
             <w:tcMar>
-              <w:top w:w="25" w:type="dxa"/>
-              <w:bottom w:w="25" w:type="dxa"/>
-              <w:left w:w="30" w:type="dxa"/>
-              <w:right w:w="30" w:type="dxa"/>
+              <w:top w:w="20" w:type="dxa"/>
+              <w:bottom w:w="20" w:type="dxa"/>
+              <w:left w:w="25" w:type="dxa"/>
+              <w:right w:w="25" w:type="dxa"/>
             </w:tcMar>
             <w:tcBorders>
               <w:top w:val="none"/>
@@ -5290,10 +5493,10 @@
           <w:tcPr>
             <w:tcW w:type="dxa" w:w="792"/>
             <w:tcMar>
-              <w:top w:w="25" w:type="dxa"/>
-              <w:bottom w:w="25" w:type="dxa"/>
-              <w:left w:w="30" w:type="dxa"/>
-              <w:right w:w="30" w:type="dxa"/>
+              <w:top w:w="20" w:type="dxa"/>
+              <w:bottom w:w="20" w:type="dxa"/>
+              <w:left w:w="25" w:type="dxa"/>
+              <w:right w:w="25" w:type="dxa"/>
             </w:tcMar>
             <w:tcBorders>
               <w:top w:val="none"/>
@@ -5322,10 +5525,10 @@
           <w:tcPr>
             <w:tcW w:type="dxa" w:w="792"/>
             <w:tcMar>
-              <w:top w:w="25" w:type="dxa"/>
-              <w:bottom w:w="25" w:type="dxa"/>
-              <w:left w:w="30" w:type="dxa"/>
-              <w:right w:w="30" w:type="dxa"/>
+              <w:top w:w="20" w:type="dxa"/>
+              <w:bottom w:w="20" w:type="dxa"/>
+              <w:left w:w="25" w:type="dxa"/>
+              <w:right w:w="25" w:type="dxa"/>
             </w:tcMar>
             <w:tcBorders>
               <w:top w:val="none"/>
@@ -5354,10 +5557,10 @@
           <w:tcPr>
             <w:tcW w:type="dxa" w:w="792"/>
             <w:tcMar>
-              <w:top w:w="25" w:type="dxa"/>
-              <w:bottom w:w="25" w:type="dxa"/>
-              <w:left w:w="30" w:type="dxa"/>
-              <w:right w:w="30" w:type="dxa"/>
+              <w:top w:w="20" w:type="dxa"/>
+              <w:bottom w:w="20" w:type="dxa"/>
+              <w:left w:w="25" w:type="dxa"/>
+              <w:right w:w="25" w:type="dxa"/>
             </w:tcMar>
             <w:tcBorders>
               <w:top w:val="none"/>
@@ -5386,10 +5589,10 @@
           <w:tcPr>
             <w:tcW w:type="dxa" w:w="792"/>
             <w:tcMar>
-              <w:top w:w="25" w:type="dxa"/>
-              <w:bottom w:w="25" w:type="dxa"/>
-              <w:left w:w="30" w:type="dxa"/>
-              <w:right w:w="30" w:type="dxa"/>
+              <w:top w:w="20" w:type="dxa"/>
+              <w:bottom w:w="20" w:type="dxa"/>
+              <w:left w:w="25" w:type="dxa"/>
+              <w:right w:w="25" w:type="dxa"/>
             </w:tcMar>
             <w:tcBorders>
               <w:top w:val="none"/>
@@ -5420,10 +5623,10 @@
           <w:tcPr>
             <w:tcW w:type="dxa" w:w="1656"/>
             <w:tcMar>
-              <w:top w:w="25" w:type="dxa"/>
-              <w:bottom w:w="25" w:type="dxa"/>
-              <w:left w:w="30" w:type="dxa"/>
-              <w:right w:w="30" w:type="dxa"/>
+              <w:top w:w="20" w:type="dxa"/>
+              <w:bottom w:w="20" w:type="dxa"/>
+              <w:left w:w="25" w:type="dxa"/>
+              <w:right w:w="25" w:type="dxa"/>
             </w:tcMar>
             <w:tcBorders>
               <w:top w:val="none"/>
@@ -5452,10 +5655,10 @@
           <w:tcPr>
             <w:tcW w:type="dxa" w:w="792"/>
             <w:tcMar>
-              <w:top w:w="25" w:type="dxa"/>
-              <w:bottom w:w="25" w:type="dxa"/>
-              <w:left w:w="30" w:type="dxa"/>
-              <w:right w:w="30" w:type="dxa"/>
+              <w:top w:w="20" w:type="dxa"/>
+              <w:bottom w:w="20" w:type="dxa"/>
+              <w:left w:w="25" w:type="dxa"/>
+              <w:right w:w="25" w:type="dxa"/>
             </w:tcMar>
             <w:tcBorders>
               <w:top w:val="none"/>
@@ -5484,10 +5687,10 @@
           <w:tcPr>
             <w:tcW w:type="dxa" w:w="792"/>
             <w:tcMar>
-              <w:top w:w="25" w:type="dxa"/>
-              <w:bottom w:w="25" w:type="dxa"/>
-              <w:left w:w="30" w:type="dxa"/>
-              <w:right w:w="30" w:type="dxa"/>
+              <w:top w:w="20" w:type="dxa"/>
+              <w:bottom w:w="20" w:type="dxa"/>
+              <w:left w:w="25" w:type="dxa"/>
+              <w:right w:w="25" w:type="dxa"/>
             </w:tcMar>
             <w:tcBorders>
               <w:top w:val="none"/>
@@ -5516,10 +5719,10 @@
           <w:tcPr>
             <w:tcW w:type="dxa" w:w="792"/>
             <w:tcMar>
-              <w:top w:w="25" w:type="dxa"/>
-              <w:bottom w:w="25" w:type="dxa"/>
-              <w:left w:w="30" w:type="dxa"/>
-              <w:right w:w="30" w:type="dxa"/>
+              <w:top w:w="20" w:type="dxa"/>
+              <w:bottom w:w="20" w:type="dxa"/>
+              <w:left w:w="25" w:type="dxa"/>
+              <w:right w:w="25" w:type="dxa"/>
             </w:tcMar>
             <w:tcBorders>
               <w:top w:val="none"/>
@@ -5548,10 +5751,10 @@
           <w:tcPr>
             <w:tcW w:type="dxa" w:w="792"/>
             <w:tcMar>
-              <w:top w:w="25" w:type="dxa"/>
-              <w:bottom w:w="25" w:type="dxa"/>
-              <w:left w:w="30" w:type="dxa"/>
-              <w:right w:w="30" w:type="dxa"/>
+              <w:top w:w="20" w:type="dxa"/>
+              <w:bottom w:w="20" w:type="dxa"/>
+              <w:left w:w="25" w:type="dxa"/>
+              <w:right w:w="25" w:type="dxa"/>
             </w:tcMar>
             <w:tcBorders>
               <w:top w:val="none"/>
@@ -5582,10 +5785,10 @@
           <w:tcPr>
             <w:tcW w:type="dxa" w:w="1656"/>
             <w:tcMar>
-              <w:top w:w="25" w:type="dxa"/>
-              <w:bottom w:w="25" w:type="dxa"/>
-              <w:left w:w="30" w:type="dxa"/>
-              <w:right w:w="30" w:type="dxa"/>
+              <w:top w:w="20" w:type="dxa"/>
+              <w:bottom w:w="20" w:type="dxa"/>
+              <w:left w:w="25" w:type="dxa"/>
+              <w:right w:w="25" w:type="dxa"/>
             </w:tcMar>
             <w:tcBorders>
               <w:top w:val="none"/>
@@ -5614,10 +5817,10 @@
           <w:tcPr>
             <w:tcW w:type="dxa" w:w="792"/>
             <w:tcMar>
-              <w:top w:w="25" w:type="dxa"/>
-              <w:bottom w:w="25" w:type="dxa"/>
-              <w:left w:w="30" w:type="dxa"/>
-              <w:right w:w="30" w:type="dxa"/>
+              <w:top w:w="20" w:type="dxa"/>
+              <w:bottom w:w="20" w:type="dxa"/>
+              <w:left w:w="25" w:type="dxa"/>
+              <w:right w:w="25" w:type="dxa"/>
             </w:tcMar>
             <w:tcBorders>
               <w:top w:val="none"/>
@@ -5646,10 +5849,10 @@
           <w:tcPr>
             <w:tcW w:type="dxa" w:w="792"/>
             <w:tcMar>
-              <w:top w:w="25" w:type="dxa"/>
-              <w:bottom w:w="25" w:type="dxa"/>
-              <w:left w:w="30" w:type="dxa"/>
-              <w:right w:w="30" w:type="dxa"/>
+              <w:top w:w="20" w:type="dxa"/>
+              <w:bottom w:w="20" w:type="dxa"/>
+              <w:left w:w="25" w:type="dxa"/>
+              <w:right w:w="25" w:type="dxa"/>
             </w:tcMar>
             <w:tcBorders>
               <w:top w:val="none"/>
@@ -5678,10 +5881,10 @@
           <w:tcPr>
             <w:tcW w:type="dxa" w:w="792"/>
             <w:tcMar>
-              <w:top w:w="25" w:type="dxa"/>
-              <w:bottom w:w="25" w:type="dxa"/>
-              <w:left w:w="30" w:type="dxa"/>
-              <w:right w:w="30" w:type="dxa"/>
+              <w:top w:w="20" w:type="dxa"/>
+              <w:bottom w:w="20" w:type="dxa"/>
+              <w:left w:w="25" w:type="dxa"/>
+              <w:right w:w="25" w:type="dxa"/>
             </w:tcMar>
             <w:tcBorders>
               <w:top w:val="none"/>
@@ -5710,10 +5913,10 @@
           <w:tcPr>
             <w:tcW w:type="dxa" w:w="792"/>
             <w:tcMar>
-              <w:top w:w="25" w:type="dxa"/>
-              <w:bottom w:w="25" w:type="dxa"/>
-              <w:left w:w="30" w:type="dxa"/>
-              <w:right w:w="30" w:type="dxa"/>
+              <w:top w:w="20" w:type="dxa"/>
+              <w:bottom w:w="20" w:type="dxa"/>
+              <w:left w:w="25" w:type="dxa"/>
+              <w:right w:w="25" w:type="dxa"/>
             </w:tcMar>
             <w:tcBorders>
               <w:top w:val="none"/>
@@ -5744,10 +5947,10 @@
           <w:tcPr>
             <w:tcW w:type="dxa" w:w="1656"/>
             <w:tcMar>
-              <w:top w:w="25" w:type="dxa"/>
-              <w:bottom w:w="25" w:type="dxa"/>
-              <w:left w:w="30" w:type="dxa"/>
-              <w:right w:w="30" w:type="dxa"/>
+              <w:top w:w="20" w:type="dxa"/>
+              <w:bottom w:w="20" w:type="dxa"/>
+              <w:left w:w="25" w:type="dxa"/>
+              <w:right w:w="25" w:type="dxa"/>
             </w:tcMar>
             <w:tcBorders>
               <w:top w:val="none"/>
@@ -5776,10 +5979,10 @@
           <w:tcPr>
             <w:tcW w:type="dxa" w:w="792"/>
             <w:tcMar>
-              <w:top w:w="25" w:type="dxa"/>
-              <w:bottom w:w="25" w:type="dxa"/>
-              <w:left w:w="30" w:type="dxa"/>
-              <w:right w:w="30" w:type="dxa"/>
+              <w:top w:w="20" w:type="dxa"/>
+              <w:bottom w:w="20" w:type="dxa"/>
+              <w:left w:w="25" w:type="dxa"/>
+              <w:right w:w="25" w:type="dxa"/>
             </w:tcMar>
             <w:tcBorders>
               <w:top w:val="none"/>
@@ -5808,10 +6011,10 @@
           <w:tcPr>
             <w:tcW w:type="dxa" w:w="792"/>
             <w:tcMar>
-              <w:top w:w="25" w:type="dxa"/>
-              <w:bottom w:w="25" w:type="dxa"/>
-              <w:left w:w="30" w:type="dxa"/>
-              <w:right w:w="30" w:type="dxa"/>
+              <w:top w:w="20" w:type="dxa"/>
+              <w:bottom w:w="20" w:type="dxa"/>
+              <w:left w:w="25" w:type="dxa"/>
+              <w:right w:w="25" w:type="dxa"/>
             </w:tcMar>
             <w:tcBorders>
               <w:top w:val="none"/>
@@ -5840,10 +6043,10 @@
           <w:tcPr>
             <w:tcW w:type="dxa" w:w="792"/>
             <w:tcMar>
-              <w:top w:w="25" w:type="dxa"/>
-              <w:bottom w:w="25" w:type="dxa"/>
-              <w:left w:w="30" w:type="dxa"/>
-              <w:right w:w="30" w:type="dxa"/>
+              <w:top w:w="20" w:type="dxa"/>
+              <w:bottom w:w="20" w:type="dxa"/>
+              <w:left w:w="25" w:type="dxa"/>
+              <w:right w:w="25" w:type="dxa"/>
             </w:tcMar>
             <w:tcBorders>
               <w:top w:val="none"/>
@@ -5872,10 +6075,10 @@
           <w:tcPr>
             <w:tcW w:type="dxa" w:w="792"/>
             <w:tcMar>
-              <w:top w:w="25" w:type="dxa"/>
-              <w:bottom w:w="25" w:type="dxa"/>
-              <w:left w:w="30" w:type="dxa"/>
-              <w:right w:w="30" w:type="dxa"/>
+              <w:top w:w="20" w:type="dxa"/>
+              <w:bottom w:w="20" w:type="dxa"/>
+              <w:left w:w="25" w:type="dxa"/>
+              <w:right w:w="25" w:type="dxa"/>
             </w:tcMar>
             <w:tcBorders>
               <w:top w:val="none"/>
@@ -5904,8 +6107,8 @@
     </w:tbl>
     <w:p>
       <w:pPr>
-        <w:spacing w:before="0" w:after="40" w:line="240" w:lineRule="auto"/>
-        <w:ind w:firstLine="216"/>
+        <w:spacing w:before="0" w:after="30" w:line="240" w:lineRule="auto"/>
+        <w:ind w:firstLine="202"/>
         <w:jc w:val="both"/>
       </w:pPr>
       <w:r>
@@ -5922,7 +6125,7 @@
     <w:p>
       <w:pPr>
         <w:keepNext/>
-        <w:spacing w:before="100" w:after="40"/>
+        <w:spacing w:before="90" w:after="30"/>
         <w:ind w:firstLine="0"/>
         <w:jc w:val="center"/>
       </w:pPr>
@@ -5939,8 +6142,8 @@
     </w:p>
     <w:p>
       <w:pPr>
-        <w:spacing w:before="0" w:after="40" w:line="240" w:lineRule="auto"/>
-        <w:ind w:firstLine="216"/>
+        <w:spacing w:before="0" w:after="30" w:line="240" w:lineRule="auto"/>
+        <w:ind w:firstLine="202"/>
         <w:jc w:val="both"/>
       </w:pPr>
       <w:r>
@@ -5956,8 +6159,8 @@
     </w:p>
     <w:p>
       <w:pPr>
-        <w:spacing w:before="0" w:after="40" w:line="240" w:lineRule="auto"/>
-        <w:ind w:firstLine="216"/>
+        <w:spacing w:before="0" w:after="30" w:line="240" w:lineRule="auto"/>
+        <w:ind w:firstLine="202"/>
         <w:jc w:val="both"/>
       </w:pPr>
       <w:r>
@@ -5973,8 +6176,8 @@
     </w:p>
     <w:p>
       <w:pPr>
-        <w:spacing w:before="0" w:after="40" w:line="240" w:lineRule="auto"/>
-        <w:ind w:firstLine="216"/>
+        <w:spacing w:before="0" w:after="30" w:line="240" w:lineRule="auto"/>
+        <w:ind w:firstLine="202"/>
         <w:jc w:val="both"/>
       </w:pPr>
       <w:r>
@@ -5985,13 +6188,13 @@
           <w:color w:val="000000"/>
           <w:sz w:val="19"/>
         </w:rPr>
-        <w:t>Second, the analysis of learned reliability gating weights (Fig. 2) confirms that the SARG module discovers physically meaningful fusion rules autonomously. Under severe channel degradation (-10 dB SNR), the bottleneck gate allocated 89% weight (alpha = 0.110) to the pristine side information, effectively filtering out intense channel noise. As the channel quality improved, alpha increased monotonically, reaching 0.814 at +10 dB SNR. This dynamic behavior resolved the static fusion vulnerability inherent in prior neural Wyner-Ziv schemes.</w:t>
+        <w:t>Second, the analysis of learned reliability gating weights (Fig. 4) confirms that the SARG module discovers physically meaningful fusion rules autonomously. Under severe channel degradation (-10 dB SNR), the bottleneck gate allocated 89% weight (alpha = 0.110) to the pristine side information, effectively filtering out intense channel noise. As the channel quality improved, alpha increased monotonically, reaching 0.814 at +10 dB SNR. This dynamic behavior resolved the static fusion vulnerability inherent in prior neural Wyner-Ziv schemes.</w:t>
       </w:r>
     </w:p>
     <w:p>
       <w:pPr>
-        <w:spacing w:before="0" w:after="40" w:line="240" w:lineRule="auto"/>
-        <w:ind w:firstLine="216"/>
+        <w:spacing w:before="0" w:after="30" w:line="240" w:lineRule="auto"/>
+        <w:ind w:firstLine="202"/>
         <w:jc w:val="both"/>
       </w:pPr>
       <w:r>
@@ -6008,7 +6211,7 @@
     <w:p>
       <w:pPr>
         <w:keepNext/>
-        <w:spacing w:before="100" w:after="40"/>
+        <w:spacing w:before="90" w:after="30"/>
         <w:ind w:firstLine="0"/>
         <w:jc w:val="center"/>
       </w:pPr>
@@ -6025,8 +6228,8 @@
     </w:p>
     <w:p>
       <w:pPr>
-        <w:spacing w:before="0" w:after="40" w:line="240" w:lineRule="auto"/>
-        <w:ind w:firstLine="216"/>
+        <w:spacing w:before="0" w:after="30" w:line="240" w:lineRule="auto"/>
+        <w:ind w:firstLine="202"/>
         <w:jc w:val="both"/>
       </w:pPr>
       <w:r>
@@ -6043,7 +6246,7 @@
     <w:p>
       <w:pPr>
         <w:keepNext/>
-        <w:spacing w:before="100" w:after="40"/>
+        <w:spacing w:before="90" w:after="30"/>
         <w:ind w:firstLine="0"/>
         <w:jc w:val="center"/>
       </w:pPr>
@@ -6060,7 +6263,7 @@
     </w:p>
     <w:p>
       <w:pPr>
-        <w:spacing w:before="20" w:after="40" w:line="240" w:lineRule="auto"/>
+        <w:spacing w:before="20" w:after="30" w:line="240" w:lineRule="auto"/>
         <w:ind w:left="317" w:hanging="317"/>
         <w:jc w:val="both"/>
       </w:pPr>
@@ -6077,7 +6280,7 @@
     </w:p>
     <w:p>
       <w:pPr>
-        <w:spacing w:before="20" w:after="40" w:line="240" w:lineRule="auto"/>
+        <w:spacing w:before="20" w:after="30" w:line="240" w:lineRule="auto"/>
         <w:ind w:left="317" w:hanging="317"/>
         <w:jc w:val="both"/>
       </w:pPr>
@@ -6094,7 +6297,7 @@
     </w:p>
     <w:p>
       <w:pPr>
-        <w:spacing w:before="20" w:after="40" w:line="240" w:lineRule="auto"/>
+        <w:spacing w:before="20" w:after="30" w:line="240" w:lineRule="auto"/>
         <w:ind w:left="317" w:hanging="317"/>
         <w:jc w:val="both"/>
       </w:pPr>
@@ -6111,7 +6314,7 @@
     </w:p>
     <w:p>
       <w:pPr>
-        <w:spacing w:before="20" w:after="40" w:line="240" w:lineRule="auto"/>
+        <w:spacing w:before="20" w:after="30" w:line="240" w:lineRule="auto"/>
         <w:ind w:left="317" w:hanging="317"/>
         <w:jc w:val="both"/>
       </w:pPr>
@@ -6128,7 +6331,7 @@
     </w:p>
     <w:p>
       <w:pPr>
-        <w:spacing w:before="20" w:after="40" w:line="240" w:lineRule="auto"/>
+        <w:spacing w:before="20" w:after="30" w:line="240" w:lineRule="auto"/>
         <w:ind w:left="317" w:hanging="317"/>
         <w:jc w:val="both"/>
       </w:pPr>
@@ -6145,7 +6348,7 @@
     </w:p>
     <w:p>
       <w:pPr>
-        <w:spacing w:before="20" w:after="40" w:line="240" w:lineRule="auto"/>
+        <w:spacing w:before="20" w:after="30" w:line="240" w:lineRule="auto"/>
         <w:ind w:left="317" w:hanging="317"/>
         <w:jc w:val="both"/>
       </w:pPr>
@@ -6162,7 +6365,7 @@
     </w:p>
     <w:p>
       <w:pPr>
-        <w:spacing w:before="20" w:after="40" w:line="240" w:lineRule="auto"/>
+        <w:spacing w:before="20" w:after="30" w:line="240" w:lineRule="auto"/>
         <w:ind w:left="317" w:hanging="317"/>
         <w:jc w:val="both"/>
       </w:pPr>
@@ -6179,7 +6382,7 @@
     </w:p>
     <w:p>
       <w:pPr>
-        <w:spacing w:before="20" w:after="40" w:line="240" w:lineRule="auto"/>
+        <w:spacing w:before="20" w:after="30" w:line="240" w:lineRule="auto"/>
         <w:ind w:left="317" w:hanging="317"/>
         <w:jc w:val="both"/>
       </w:pPr>
@@ -6196,7 +6399,7 @@
     </w:p>
     <w:p>
       <w:pPr>
-        <w:spacing w:before="20" w:after="40" w:line="240" w:lineRule="auto"/>
+        <w:spacing w:before="20" w:after="30" w:line="240" w:lineRule="auto"/>
         <w:ind w:left="317" w:hanging="317"/>
         <w:jc w:val="both"/>
       </w:pPr>
@@ -6213,7 +6416,7 @@
     </w:p>
     <w:p>
       <w:pPr>
-        <w:spacing w:before="20" w:after="40" w:line="240" w:lineRule="auto"/>
+        <w:spacing w:before="20" w:after="30" w:line="240" w:lineRule="auto"/>
         <w:ind w:left="317" w:hanging="317"/>
         <w:jc w:val="both"/>
       </w:pPr>
@@ -6230,7 +6433,7 @@
     </w:p>
     <w:p>
       <w:pPr>
-        <w:spacing w:before="20" w:after="40" w:line="240" w:lineRule="auto"/>
+        <w:spacing w:before="20" w:after="30" w:line="240" w:lineRule="auto"/>
         <w:ind w:left="317" w:hanging="317"/>
         <w:jc w:val="both"/>
       </w:pPr>
@@ -6247,7 +6450,7 @@
     </w:p>
     <w:p>
       <w:pPr>
-        <w:spacing w:before="20" w:after="40" w:line="240" w:lineRule="auto"/>
+        <w:spacing w:before="20" w:after="30" w:line="240" w:lineRule="auto"/>
         <w:ind w:left="317" w:hanging="317"/>
         <w:jc w:val="both"/>
       </w:pPr>
@@ -6264,7 +6467,7 @@
     </w:p>
     <w:p>
       <w:pPr>
-        <w:spacing w:before="20" w:after="40" w:line="240" w:lineRule="auto"/>
+        <w:spacing w:before="20" w:after="30" w:line="240" w:lineRule="auto"/>
         <w:ind w:left="317" w:hanging="317"/>
         <w:jc w:val="both"/>
       </w:pPr>
@@ -6281,7 +6484,7 @@
     </w:p>
     <w:p>
       <w:pPr>
-        <w:spacing w:before="20" w:after="40" w:line="240" w:lineRule="auto"/>
+        <w:spacing w:before="20" w:after="30" w:line="240" w:lineRule="auto"/>
         <w:ind w:left="317" w:hanging="317"/>
         <w:jc w:val="both"/>
       </w:pPr>
@@ -6298,7 +6501,7 @@
     </w:p>
     <w:p>
       <w:pPr>
-        <w:spacing w:before="20" w:after="40" w:line="240" w:lineRule="auto"/>
+        <w:spacing w:before="20" w:after="30" w:line="240" w:lineRule="auto"/>
         <w:ind w:left="317" w:hanging="317"/>
         <w:jc w:val="both"/>
       </w:pPr>
@@ -6315,7 +6518,7 @@
     </w:p>
     <w:p>
       <w:pPr>
-        <w:spacing w:before="20" w:after="40" w:line="240" w:lineRule="auto"/>
+        <w:spacing w:before="20" w:after="30" w:line="240" w:lineRule="auto"/>
         <w:ind w:left="317" w:hanging="317"/>
         <w:jc w:val="both"/>
       </w:pPr>
@@ -6333,7 +6536,7 @@
     <w:sectPr>
       <w:type w:val="continuous"/>
       <w:pgSz w:w="11909" w:h="16834"/>
-      <w:pgMar w:top="1008" w:right="864" w:bottom="1080" w:left="864" w:header="720" w:footer="720" w:gutter="0"/>
+      <w:pgMar w:top="936" w:right="835" w:bottom="1008" w:left="835" w:header="720" w:footer="720" w:gutter="0"/>
       <w:cols w:num="2" w:space="360"/>
       <w:docGrid w:linePitch="360"/>
     </w:sectPr>

</xml_diff>

<commit_message>
feat(plots): add DeepJSCC-WZ + SARG curves to 48-epoch convergence and multi-metric validation progression plots
</commit_message>
<xml_diff>
--- a/IEEE_Conference_Paper_DeepJSCC_WZ.docx
+++ b/IEEE_Conference_Paper_DeepJSCC_WZ.docx
@@ -3200,7 +3200,7 @@
       <w:r>
         <w:drawing>
           <wp:inline xmlns:a="http://schemas.openxmlformats.org/drawingml/2006/main" xmlns:pic="http://schemas.openxmlformats.org/drawingml/2006/picture">
-            <wp:extent cx="2971800" cy="1167493"/>
+            <wp:extent cx="2971800" cy="1149096"/>
             <wp:docPr id="1" name="Picture 1"/>
             <wp:cNvGraphicFramePr>
               <a:graphicFrameLocks noChangeAspect="1"/>
@@ -3221,7 +3221,7 @@
                   <pic:spPr>
                     <a:xfrm>
                       <a:off x="0" y="0"/>
-                      <a:ext cx="2971800" cy="1167493"/>
+                      <a:ext cx="2971800" cy="1149096"/>
                     </a:xfrm>
                     <a:prstGeom prst="rect"/>
                   </pic:spPr>
@@ -3275,7 +3275,7 @@
       <w:r>
         <w:drawing>
           <wp:inline xmlns:a="http://schemas.openxmlformats.org/drawingml/2006/main" xmlns:pic="http://schemas.openxmlformats.org/drawingml/2006/picture">
-            <wp:extent cx="2971800" cy="2286000"/>
+            <wp:extent cx="2971800" cy="2228850"/>
             <wp:docPr id="2" name="Picture 2"/>
             <wp:cNvGraphicFramePr>
               <a:graphicFrameLocks noChangeAspect="1"/>
@@ -3296,7 +3296,7 @@
                   <pic:spPr>
                     <a:xfrm>
                       <a:off x="0" y="0"/>
-                      <a:ext cx="2971800" cy="2286000"/>
+                      <a:ext cx="2971800" cy="2228850"/>
                     </a:xfrm>
                     <a:prstGeom prst="rect"/>
                   </pic:spPr>

</xml_diff>